<commit_message>
First pass by Tom
</commit_message>
<xml_diff>
--- a/eCX User Guide.docx
+++ b/eCX User Guide.docx
@@ -256,7 +256,23 @@
           <w:rFonts w:asciiTheme="minorHAnsi" w:hAnsiTheme="minorHAnsi" w:cstheme="minorHAnsi"/>
           <w:bCs/>
         </w:rPr>
-        <w:t xml:space="preserve"> (the “eCX”).  Here you can learn</w:t>
+        <w:t xml:space="preserve"> (the “</w:t>
+      </w:r>
+      <w:proofErr w:type="spellStart"/>
+      <w:r>
+        <w:rPr>
+          <w:rFonts w:asciiTheme="minorHAnsi" w:hAnsiTheme="minorHAnsi" w:cstheme="minorHAnsi"/>
+          <w:bCs/>
+        </w:rPr>
+        <w:t>eCX</w:t>
+      </w:r>
+      <w:proofErr w:type="spellEnd"/>
+      <w:r>
+        <w:rPr>
+          <w:rFonts w:asciiTheme="minorHAnsi" w:hAnsiTheme="minorHAnsi" w:cstheme="minorHAnsi"/>
+          <w:bCs/>
+        </w:rPr>
+        <w:t>”).  Here you can learn</w:t>
       </w:r>
       <w:r>
         <w:rPr>
@@ -959,31 +975,15 @@
           <w:rFonts w:asciiTheme="minorHAnsi" w:hAnsiTheme="minorHAnsi" w:cstheme="minorHAnsi"/>
           <w:bCs/>
         </w:rPr>
-        <w:t xml:space="preserve">The eCX support team occasionally schedules maintenance periods </w:t>
-      </w:r>
-      <w:proofErr w:type="gramStart"/>
-      <w:r>
+        <w:t>The eCX support team occasionally schedules maintenance periods in order to upgrade and service the eCX.  When we do so, we will send you advance notice, to minimize disruptions to your work.  If there is an unscheduled maintenance, we will send outage notices and updates until the situation is resolved.</w:t>
+      </w:r>
+    </w:p>
+    <w:p>
+      <w:pPr>
         <w:rPr>
           <w:rFonts w:asciiTheme="minorHAnsi" w:hAnsiTheme="minorHAnsi" w:cstheme="minorHAnsi"/>
           <w:bCs/>
         </w:rPr>
-        <w:t>in order to</w:t>
-      </w:r>
-      <w:proofErr w:type="gramEnd"/>
-      <w:r>
-        <w:rPr>
-          <w:rFonts w:asciiTheme="minorHAnsi" w:hAnsiTheme="minorHAnsi" w:cstheme="minorHAnsi"/>
-          <w:bCs/>
-        </w:rPr>
-        <w:t xml:space="preserve"> upgrade and service the eCX.  When we do so, we will send you advance notice, to minimize disruptions to your work.  If there is an unscheduled maintenance, we will send outage notices and updates until the situation is resolved.</w:t>
-      </w:r>
-    </w:p>
-    <w:p>
-      <w:pPr>
-        <w:rPr>
-          <w:rFonts w:asciiTheme="minorHAnsi" w:hAnsiTheme="minorHAnsi" w:cstheme="minorHAnsi"/>
-          <w:bCs/>
-        </w:rPr>
       </w:pPr>
     </w:p>
     <w:p>
@@ -1098,21 +1098,7 @@
         <w:rPr>
           <w:rFonts w:asciiTheme="minorHAnsi" w:hAnsiTheme="minorHAnsi" w:cstheme="minorHAnsi"/>
         </w:rPr>
-        <w:t xml:space="preserve">  </w:t>
-      </w:r>
-      <w:proofErr w:type="gramStart"/>
-      <w:r>
-        <w:rPr>
-          <w:rFonts w:asciiTheme="minorHAnsi" w:hAnsiTheme="minorHAnsi" w:cstheme="minorHAnsi"/>
-        </w:rPr>
-        <w:t>It’s</w:t>
-      </w:r>
-      <w:proofErr w:type="gramEnd"/>
-      <w:r>
-        <w:rPr>
-          <w:rFonts w:asciiTheme="minorHAnsi" w:hAnsiTheme="minorHAnsi" w:cstheme="minorHAnsi"/>
-        </w:rPr>
-        <w:t xml:space="preserve"> also handy for browsing data. </w:t>
+        <w:t xml:space="preserve">  It’s also handy for browsing data. </w:t>
       </w:r>
       <w:r>
         <w:rPr>
@@ -1466,21 +1452,7 @@
         <w:rPr>
           <w:rFonts w:asciiTheme="minorHAnsi" w:hAnsiTheme="minorHAnsi" w:cstheme="minorHAnsi"/>
         </w:rPr>
-        <w:t xml:space="preserve"> recommend that you use the eCX as an authoritative source of information about whether a malicious event is active (up) or inactive (down).  Instead, we hope users will take the data and confirm the </w:t>
-      </w:r>
-      <w:proofErr w:type="gramStart"/>
-      <w:r>
-        <w:rPr>
-          <w:rFonts w:asciiTheme="minorHAnsi" w:hAnsiTheme="minorHAnsi" w:cstheme="minorHAnsi"/>
-        </w:rPr>
-        <w:t>activity, if</w:t>
-      </w:r>
-      <w:proofErr w:type="gramEnd"/>
-      <w:r>
-        <w:rPr>
-          <w:rFonts w:asciiTheme="minorHAnsi" w:hAnsiTheme="minorHAnsi" w:cstheme="minorHAnsi"/>
-        </w:rPr>
-        <w:t xml:space="preserve"> that is important to you.</w:t>
+        <w:t xml:space="preserve"> recommend that you use the eCX as an authoritative source of information about whether a malicious event is active (up) or inactive (down).  Instead, we hope users will take the data and confirm the activity, if that is important to you.</w:t>
       </w:r>
     </w:p>
     <w:p>
@@ -1565,49 +1537,21 @@
         <w:rPr>
           <w:rFonts w:asciiTheme="minorHAnsi" w:hAnsiTheme="minorHAnsi" w:cstheme="minorHAnsi"/>
         </w:rPr>
-        <w:t xml:space="preserve">good actors. We </w:t>
+        <w:t xml:space="preserve">good actors. We don't monitor or vet the incoming data. When data needs to be </w:t>
       </w:r>
       <w:proofErr w:type="gramStart"/>
       <w:r>
         <w:rPr>
           <w:rFonts w:asciiTheme="minorHAnsi" w:hAnsiTheme="minorHAnsi" w:cstheme="minorHAnsi"/>
         </w:rPr>
-        <w:t>don't</w:t>
+        <w:t>updated</w:t>
       </w:r>
       <w:proofErr w:type="gramEnd"/>
       <w:r>
         <w:rPr>
           <w:rFonts w:asciiTheme="minorHAnsi" w:hAnsiTheme="minorHAnsi" w:cstheme="minorHAnsi"/>
         </w:rPr>
-        <w:t xml:space="preserve"> monitor or vet the incoming data. When data needs to be </w:t>
-      </w:r>
-      <w:proofErr w:type="gramStart"/>
-      <w:r>
-        <w:rPr>
-          <w:rFonts w:asciiTheme="minorHAnsi" w:hAnsiTheme="minorHAnsi" w:cstheme="minorHAnsi"/>
-        </w:rPr>
-        <w:t>updated</w:t>
-      </w:r>
-      <w:proofErr w:type="gramEnd"/>
-      <w:r>
-        <w:rPr>
-          <w:rFonts w:asciiTheme="minorHAnsi" w:hAnsiTheme="minorHAnsi" w:cstheme="minorHAnsi"/>
-        </w:rPr>
-        <w:t xml:space="preserve"> we provide our users with the tools to make updates, so members have the same control over the data. And finally, </w:t>
-      </w:r>
-      <w:proofErr w:type="gramStart"/>
-      <w:r>
-        <w:rPr>
-          <w:rFonts w:asciiTheme="minorHAnsi" w:hAnsiTheme="minorHAnsi" w:cstheme="minorHAnsi"/>
-        </w:rPr>
-        <w:t>we're</w:t>
-      </w:r>
-      <w:proofErr w:type="gramEnd"/>
-      <w:r>
-        <w:rPr>
-          <w:rFonts w:asciiTheme="minorHAnsi" w:hAnsiTheme="minorHAnsi" w:cstheme="minorHAnsi"/>
-        </w:rPr>
-        <w:t xml:space="preserve"> a very small team--we don't have the bandwidth for constant moderation of the data, and if we were to be making unilateral changes to the data then we'd be taking the chance of stepping on the toes of our valuable member</w:t>
+        <w:t xml:space="preserve"> we provide our users with the tools to make updates, so members have the same control over the data. And finally, we're a very small team--we don't have the bandwidth for constant moderation of the data, and if we were to be making unilateral changes to the data then we'd be taking the chance of stepping on the toes of our valuable member</w:t>
       </w:r>
       <w:r>
         <w:rPr>
@@ -2150,6 +2094,7 @@
         <w:spacing w:before="4"/>
         <w:ind w:left="0"/>
         <w:rPr>
+          <w:del w:id="0" w:author="Tom Anderson" w:date="2021-07-22T17:48:00Z"/>
           <w:rFonts w:asciiTheme="minorHAnsi" w:hAnsiTheme="minorHAnsi" w:cstheme="minorHAnsi"/>
           <w:i/>
         </w:rPr>
@@ -2182,88 +2127,469 @@
           <w:rFonts w:asciiTheme="minorHAnsi" w:hAnsiTheme="minorHAnsi" w:cstheme="minorHAnsi"/>
           <w:w w:val="95"/>
         </w:rPr>
-        <w:t xml:space="preserve"> values </w:t>
-      </w:r>
-      <w:proofErr w:type="gramStart"/>
+        <w:t xml:space="preserve"> values you'll need:</w:t>
+      </w:r>
+    </w:p>
+    <w:p>
+      <w:pPr>
+        <w:pStyle w:val="BodyText"/>
+        <w:spacing w:before="163" w:line="273" w:lineRule="auto"/>
+        <w:rPr>
+          <w:rFonts w:asciiTheme="minorHAnsi" w:hAnsiTheme="minorHAnsi" w:cstheme="minorHAnsi"/>
+        </w:rPr>
+      </w:pPr>
+      <w:r>
+        <w:rPr>
+          <w:rFonts w:asciiTheme="minorHAnsi" w:hAnsiTheme="minorHAnsi" w:cstheme="minorHAnsi"/>
+          <w:u w:val="single"/>
+        </w:rPr>
+        <w:t xml:space="preserve">date discovered: </w:t>
+      </w:r>
+      <w:r>
+        <w:rPr>
+          <w:rFonts w:asciiTheme="minorHAnsi" w:hAnsiTheme="minorHAnsi" w:cstheme="minorHAnsi"/>
+        </w:rPr>
+        <w:t xml:space="preserve">This field is a </w:t>
+      </w:r>
+      <w:del w:id="1" w:author="Tom Anderson" w:date="2021-07-22T17:49:00Z">
+        <w:r>
+          <w:rPr>
+            <w:rFonts w:asciiTheme="minorHAnsi" w:hAnsiTheme="minorHAnsi" w:cstheme="minorHAnsi"/>
+          </w:rPr>
+          <w:delText xml:space="preserve">numeric </w:delText>
+        </w:r>
+      </w:del>
+      <w:proofErr w:type="spellStart"/>
+      <w:ins w:id="2" w:author="Tom Anderson" w:date="2021-07-22T17:49:00Z">
+        <w:r>
+          <w:rPr>
+            <w:rFonts w:asciiTheme="minorHAnsi" w:hAnsiTheme="minorHAnsi" w:cstheme="minorHAnsi"/>
+          </w:rPr>
+          <w:t>unix</w:t>
+        </w:r>
+        <w:proofErr w:type="spellEnd"/>
+        <w:r>
+          <w:rPr>
+            <w:rFonts w:asciiTheme="minorHAnsi" w:hAnsiTheme="minorHAnsi" w:cstheme="minorHAnsi"/>
+          </w:rPr>
+          <w:t xml:space="preserve"> </w:t>
+        </w:r>
+      </w:ins>
+      <w:r>
+        <w:rPr>
+          <w:rFonts w:asciiTheme="minorHAnsi" w:hAnsiTheme="minorHAnsi" w:cstheme="minorHAnsi"/>
+        </w:rPr>
+        <w:t xml:space="preserve">epoch </w:t>
+      </w:r>
+      <w:del w:id="3" w:author="Tom Anderson" w:date="2021-07-22T17:49:00Z">
+        <w:r>
+          <w:rPr>
+            <w:rFonts w:asciiTheme="minorHAnsi" w:hAnsiTheme="minorHAnsi" w:cstheme="minorHAnsi"/>
+          </w:rPr>
+          <w:delText>date (number of seconds since Jan 1 1970)</w:delText>
+        </w:r>
+      </w:del>
+      <w:ins w:id="4" w:author="Tom Anderson" w:date="2021-07-22T17:49:00Z">
+        <w:r>
+          <w:rPr>
+            <w:rFonts w:asciiTheme="minorHAnsi" w:hAnsiTheme="minorHAnsi" w:cstheme="minorHAnsi"/>
+          </w:rPr>
+          <w:t>timestamp</w:t>
+        </w:r>
+      </w:ins>
+      <w:del w:id="5" w:author="Tom Anderson" w:date="2021-07-22T17:49:00Z">
+        <w:r>
+          <w:rPr>
+            <w:rFonts w:asciiTheme="minorHAnsi" w:hAnsiTheme="minorHAnsi" w:cstheme="minorHAnsi"/>
+          </w:rPr>
+          <w:delText>,</w:delText>
+        </w:r>
+      </w:del>
+      <w:ins w:id="6" w:author="Tom Anderson" w:date="2021-07-22T17:49:00Z">
+        <w:r>
+          <w:rPr>
+            <w:rFonts w:asciiTheme="minorHAnsi" w:hAnsiTheme="minorHAnsi" w:cstheme="minorHAnsi"/>
+          </w:rPr>
+          <w:t>.  The default</w:t>
+        </w:r>
+      </w:ins>
+      <w:del w:id="7" w:author="Tom Anderson" w:date="2021-07-22T17:49:00Z">
+        <w:r>
+          <w:rPr>
+            <w:rFonts w:asciiTheme="minorHAnsi" w:hAnsiTheme="minorHAnsi" w:cstheme="minorHAnsi"/>
+          </w:rPr>
+          <w:delText xml:space="preserve"> the </w:delText>
+        </w:r>
+      </w:del>
+      <w:ins w:id="8" w:author="Tom Anderson" w:date="2021-07-22T17:49:00Z">
+        <w:r>
+          <w:rPr>
+            <w:rFonts w:asciiTheme="minorHAnsi" w:hAnsiTheme="minorHAnsi" w:cstheme="minorHAnsi"/>
+          </w:rPr>
+          <w:t xml:space="preserve"> </w:t>
+        </w:r>
+      </w:ins>
+      <w:r>
+        <w:rPr>
+          <w:rFonts w:asciiTheme="minorHAnsi" w:hAnsiTheme="minorHAnsi" w:cstheme="minorHAnsi"/>
+        </w:rPr>
+        <w:t xml:space="preserve">value </w:t>
+      </w:r>
+      <w:del w:id="9" w:author="Tom Anderson" w:date="2021-07-22T17:49:00Z">
+        <w:r>
+          <w:rPr>
+            <w:rFonts w:asciiTheme="minorHAnsi" w:hAnsiTheme="minorHAnsi" w:cstheme="minorHAnsi"/>
+          </w:rPr>
+          <w:delText xml:space="preserve">already entered for you </w:delText>
+        </w:r>
+      </w:del>
+      <w:r>
+        <w:rPr>
+          <w:rFonts w:asciiTheme="minorHAnsi" w:hAnsiTheme="minorHAnsi" w:cstheme="minorHAnsi"/>
+        </w:rPr>
+        <w:t xml:space="preserve">is a conversion of the current </w:t>
+      </w:r>
+      <w:ins w:id="10" w:author="Tom Anderson" w:date="2021-07-22T17:49:00Z">
+        <w:r>
+          <w:rPr>
+            <w:rFonts w:asciiTheme="minorHAnsi" w:hAnsiTheme="minorHAnsi" w:cstheme="minorHAnsi"/>
+          </w:rPr>
+          <w:t xml:space="preserve">date and </w:t>
+        </w:r>
+      </w:ins>
+      <w:r>
+        <w:rPr>
+          <w:rFonts w:asciiTheme="minorHAnsi" w:hAnsiTheme="minorHAnsi" w:cstheme="minorHAnsi"/>
+        </w:rPr>
+        <w:t>time</w:t>
+      </w:r>
+      <w:del w:id="11" w:author="Tom Anderson" w:date="2021-07-22T17:49:00Z">
+        <w:r>
+          <w:rPr>
+            <w:rFonts w:asciiTheme="minorHAnsi" w:hAnsiTheme="minorHAnsi" w:cstheme="minorHAnsi"/>
+          </w:rPr>
+          <w:delText>/now into an</w:delText>
+        </w:r>
+      </w:del>
+      <w:ins w:id="12" w:author="Tom Anderson" w:date="2021-07-22T17:49:00Z">
+        <w:r>
+          <w:rPr>
+            <w:rFonts w:asciiTheme="minorHAnsi" w:hAnsiTheme="minorHAnsi" w:cstheme="minorHAnsi"/>
+          </w:rPr>
+          <w:t xml:space="preserve"> </w:t>
+        </w:r>
+      </w:ins>
+      <w:ins w:id="13" w:author="Tom Anderson" w:date="2021-07-22T17:50:00Z">
+        <w:r>
+          <w:rPr>
+            <w:rFonts w:asciiTheme="minorHAnsi" w:hAnsiTheme="minorHAnsi" w:cstheme="minorHAnsi"/>
+          </w:rPr>
+          <w:t>into an</w:t>
+        </w:r>
+      </w:ins>
+      <w:r>
+        <w:rPr>
+          <w:rFonts w:asciiTheme="minorHAnsi" w:hAnsiTheme="minorHAnsi" w:cstheme="minorHAnsi"/>
+        </w:rPr>
+        <w:t xml:space="preserve"> epoch value. </w:t>
+      </w:r>
+      <w:ins w:id="14" w:author="Tom Anderson" w:date="2021-07-22T17:51:00Z">
+        <w:r>
+          <w:rPr>
+            <w:rFonts w:asciiTheme="minorHAnsi" w:hAnsiTheme="minorHAnsi" w:cstheme="minorHAnsi"/>
+          </w:rPr>
+          <w:t xml:space="preserve"> </w:t>
+        </w:r>
+      </w:ins>
+      <w:r>
+        <w:rPr>
+          <w:rFonts w:asciiTheme="minorHAnsi" w:hAnsiTheme="minorHAnsi" w:cstheme="minorHAnsi"/>
+        </w:rPr>
+        <w:t xml:space="preserve">If you'd like to </w:t>
+      </w:r>
       <w:r>
         <w:rPr>
           <w:rFonts w:asciiTheme="minorHAnsi" w:hAnsiTheme="minorHAnsi" w:cstheme="minorHAnsi"/>
           <w:w w:val="95"/>
         </w:rPr>
-        <w:t>you'll</w:t>
-      </w:r>
-      <w:proofErr w:type="gramEnd"/>
+        <w:t xml:space="preserve">report your phish with an earlier </w:t>
+      </w:r>
+      <w:del w:id="15" w:author="Tom Anderson" w:date="2021-07-22T17:50:00Z">
+        <w:r>
+          <w:rPr>
+            <w:rFonts w:asciiTheme="minorHAnsi" w:hAnsiTheme="minorHAnsi" w:cstheme="minorHAnsi"/>
+            <w:w w:val="95"/>
+          </w:rPr>
+          <w:delText>datetime stamp</w:delText>
+        </w:r>
+      </w:del>
+      <w:proofErr w:type="spellStart"/>
+      <w:ins w:id="16" w:author="Tom Anderson" w:date="2021-07-22T17:50:00Z">
+        <w:r>
+          <w:rPr>
+            <w:rFonts w:asciiTheme="minorHAnsi" w:hAnsiTheme="minorHAnsi" w:cstheme="minorHAnsi"/>
+            <w:w w:val="95"/>
+          </w:rPr>
+          <w:t>date_discovered</w:t>
+        </w:r>
+      </w:ins>
+      <w:proofErr w:type="spellEnd"/>
       <w:r>
         <w:rPr>
           <w:rFonts w:asciiTheme="minorHAnsi" w:hAnsiTheme="minorHAnsi" w:cstheme="minorHAnsi"/>
           <w:w w:val="95"/>
         </w:rPr>
-        <w:t xml:space="preserve"> need:</w:t>
-      </w:r>
-    </w:p>
-    <w:p>
-      <w:pPr>
-        <w:pStyle w:val="BodyText"/>
-        <w:spacing w:before="163" w:line="273" w:lineRule="auto"/>
-        <w:rPr>
-          <w:rFonts w:asciiTheme="minorHAnsi" w:hAnsiTheme="minorHAnsi" w:cstheme="minorHAnsi"/>
-        </w:rPr>
-      </w:pPr>
-      <w:r>
-        <w:rPr>
-          <w:rFonts w:asciiTheme="minorHAnsi" w:hAnsiTheme="minorHAnsi" w:cstheme="minorHAnsi"/>
-          <w:u w:val="single"/>
-        </w:rPr>
-        <w:t xml:space="preserve">date discovered: </w:t>
-      </w:r>
-      <w:r>
-        <w:rPr>
-          <w:rFonts w:asciiTheme="minorHAnsi" w:hAnsiTheme="minorHAnsi" w:cstheme="minorHAnsi"/>
-        </w:rPr>
-        <w:t>This field is a numeric epoch date (number of seconds since Jan 1</w:t>
-      </w:r>
-      <w:proofErr w:type="gramStart"/>
-      <w:r>
-        <w:rPr>
-          <w:rFonts w:asciiTheme="minorHAnsi" w:hAnsiTheme="minorHAnsi" w:cstheme="minorHAnsi"/>
-        </w:rPr>
-        <w:t xml:space="preserve"> 1970</w:t>
-      </w:r>
-      <w:proofErr w:type="gramEnd"/>
-      <w:r>
-        <w:rPr>
-          <w:rFonts w:asciiTheme="minorHAnsi" w:hAnsiTheme="minorHAnsi" w:cstheme="minorHAnsi"/>
-        </w:rPr>
-        <w:t xml:space="preserve">), the value already entered for you is a conversion of the current time/now into an epoch value. If you'd like to </w:t>
-      </w:r>
+        <w:t xml:space="preserve"> we'd suggest using </w:t>
+      </w:r>
+      <w:hyperlink r:id="rId16">
+        <w:r>
+          <w:rPr>
+            <w:rFonts w:asciiTheme="minorHAnsi" w:hAnsiTheme="minorHAnsi" w:cstheme="minorHAnsi"/>
+            <w:w w:val="95"/>
+          </w:rPr>
+          <w:t>http://www.epochconverter.com</w:t>
+        </w:r>
+      </w:hyperlink>
       <w:r>
         <w:rPr>
           <w:rFonts w:asciiTheme="minorHAnsi" w:hAnsiTheme="minorHAnsi" w:cstheme="minorHAnsi"/>
           <w:w w:val="95"/>
         </w:rPr>
-        <w:t xml:space="preserve">report your phish with an earlier datetime stamp we'd suggest using </w:t>
-      </w:r>
-      <w:hyperlink r:id="rId16">
-        <w:r>
-          <w:rPr>
-            <w:rFonts w:asciiTheme="minorHAnsi" w:hAnsiTheme="minorHAnsi" w:cstheme="minorHAnsi"/>
-            <w:w w:val="95"/>
-          </w:rPr>
-          <w:t>http://www.epochconverter.com</w:t>
-        </w:r>
-      </w:hyperlink>
-      <w:r>
-        <w:rPr>
-          <w:rFonts w:asciiTheme="minorHAnsi" w:hAnsiTheme="minorHAnsi" w:cstheme="minorHAnsi"/>
-          <w:w w:val="95"/>
-        </w:rPr>
         <w:t xml:space="preserve"> </w:t>
       </w:r>
-      <w:r>
-        <w:rPr>
-          <w:rFonts w:asciiTheme="minorHAnsi" w:hAnsiTheme="minorHAnsi" w:cstheme="minorHAnsi"/>
-        </w:rPr>
-        <w:t>and then use the wizards on the page to work out the correct epoch value for your datetime, and then copy/paste the value into the eCX Add window. Note that there are constraints in place that disallow datetime values in the future, or older than 1 year.</w:t>
+      <w:del w:id="17" w:author="Tom Anderson" w:date="2021-07-22T17:50:00Z">
+        <w:r>
+          <w:rPr>
+            <w:rFonts w:asciiTheme="minorHAnsi" w:hAnsiTheme="minorHAnsi" w:cstheme="minorHAnsi"/>
+          </w:rPr>
+          <w:delText>and then use the wizards on the page t</w:delText>
+        </w:r>
+      </w:del>
+      <w:ins w:id="18" w:author="Tom Anderson" w:date="2021-07-22T17:50:00Z">
+        <w:r>
+          <w:rPr>
+            <w:rFonts w:asciiTheme="minorHAnsi" w:hAnsiTheme="minorHAnsi" w:cstheme="minorHAnsi"/>
+          </w:rPr>
+          <w:t>t</w:t>
+        </w:r>
+      </w:ins>
+      <w:r>
+        <w:rPr>
+          <w:rFonts w:asciiTheme="minorHAnsi" w:hAnsiTheme="minorHAnsi" w:cstheme="minorHAnsi"/>
+        </w:rPr>
+        <w:t xml:space="preserve">o work out the correct epoch value </w:t>
+      </w:r>
+      <w:del w:id="19" w:author="Tom Anderson" w:date="2021-07-22T17:50:00Z">
+        <w:r>
+          <w:rPr>
+            <w:rFonts w:asciiTheme="minorHAnsi" w:hAnsiTheme="minorHAnsi" w:cstheme="minorHAnsi"/>
+          </w:rPr>
+          <w:delText xml:space="preserve">for your datetime, and </w:delText>
+        </w:r>
+      </w:del>
+      <w:r>
+        <w:rPr>
+          <w:rFonts w:asciiTheme="minorHAnsi" w:hAnsiTheme="minorHAnsi" w:cstheme="minorHAnsi"/>
+        </w:rPr>
+        <w:t>then copy</w:t>
+      </w:r>
+      <w:del w:id="20" w:author="Tom Anderson" w:date="2021-07-22T17:50:00Z">
+        <w:r>
+          <w:rPr>
+            <w:rFonts w:asciiTheme="minorHAnsi" w:hAnsiTheme="minorHAnsi" w:cstheme="minorHAnsi"/>
+          </w:rPr>
+          <w:delText>/</w:delText>
+        </w:r>
+      </w:del>
+      <w:ins w:id="21" w:author="Tom Anderson" w:date="2021-07-22T17:50:00Z">
+        <w:r>
+          <w:rPr>
+            <w:rFonts w:asciiTheme="minorHAnsi" w:hAnsiTheme="minorHAnsi" w:cstheme="minorHAnsi"/>
+          </w:rPr>
+          <w:t xml:space="preserve"> &amp; </w:t>
+        </w:r>
+      </w:ins>
+      <w:r>
+        <w:rPr>
+          <w:rFonts w:asciiTheme="minorHAnsi" w:hAnsiTheme="minorHAnsi" w:cstheme="minorHAnsi"/>
+        </w:rPr>
+        <w:t xml:space="preserve">paste the </w:t>
+      </w:r>
+      <w:ins w:id="22" w:author="Tom Anderson" w:date="2021-07-22T17:51:00Z">
+        <w:r>
+          <w:rPr>
+            <w:rFonts w:asciiTheme="minorHAnsi" w:hAnsiTheme="minorHAnsi" w:cstheme="minorHAnsi"/>
+          </w:rPr>
+          <w:t>timestamp</w:t>
+        </w:r>
+      </w:ins>
+      <w:del w:id="23" w:author="Tom Anderson" w:date="2021-07-22T17:51:00Z">
+        <w:r>
+          <w:rPr>
+            <w:rFonts w:asciiTheme="minorHAnsi" w:hAnsiTheme="minorHAnsi" w:cstheme="minorHAnsi"/>
+          </w:rPr>
+          <w:delText xml:space="preserve">value </w:delText>
+        </w:r>
+      </w:del>
+      <w:ins w:id="24" w:author="Tom Anderson" w:date="2021-07-22T17:51:00Z">
+        <w:r>
+          <w:rPr>
+            <w:rFonts w:asciiTheme="minorHAnsi" w:hAnsiTheme="minorHAnsi" w:cstheme="minorHAnsi"/>
+          </w:rPr>
+          <w:t xml:space="preserve"> </w:t>
+        </w:r>
+      </w:ins>
+      <w:r>
+        <w:rPr>
+          <w:rFonts w:asciiTheme="minorHAnsi" w:hAnsiTheme="minorHAnsi" w:cstheme="minorHAnsi"/>
+        </w:rPr>
+        <w:t xml:space="preserve">into the </w:t>
+      </w:r>
+      <w:proofErr w:type="spellStart"/>
+      <w:r>
+        <w:rPr>
+          <w:rFonts w:asciiTheme="minorHAnsi" w:hAnsiTheme="minorHAnsi" w:cstheme="minorHAnsi"/>
+        </w:rPr>
+        <w:t>eCX</w:t>
+      </w:r>
+      <w:proofErr w:type="spellEnd"/>
+      <w:r>
+        <w:rPr>
+          <w:rFonts w:asciiTheme="minorHAnsi" w:hAnsiTheme="minorHAnsi" w:cstheme="minorHAnsi"/>
+        </w:rPr>
+        <w:t xml:space="preserve"> Add window. </w:t>
+      </w:r>
+      <w:ins w:id="25" w:author="Tom Anderson" w:date="2021-07-22T17:51:00Z">
+        <w:r>
+          <w:rPr>
+            <w:rFonts w:asciiTheme="minorHAnsi" w:hAnsiTheme="minorHAnsi" w:cstheme="minorHAnsi"/>
+          </w:rPr>
+          <w:t xml:space="preserve"> Please n</w:t>
+        </w:r>
+      </w:ins>
+      <w:del w:id="26" w:author="Tom Anderson" w:date="2021-07-22T17:51:00Z">
+        <w:r>
+          <w:rPr>
+            <w:rFonts w:asciiTheme="minorHAnsi" w:hAnsiTheme="minorHAnsi" w:cstheme="minorHAnsi"/>
+          </w:rPr>
+          <w:delText>N</w:delText>
+        </w:r>
+      </w:del>
+      <w:r>
+        <w:rPr>
+          <w:rFonts w:asciiTheme="minorHAnsi" w:hAnsiTheme="minorHAnsi" w:cstheme="minorHAnsi"/>
+        </w:rPr>
+        <w:t xml:space="preserve">ote </w:t>
+      </w:r>
+      <w:del w:id="27" w:author="Tom Anderson" w:date="2021-07-22T17:51:00Z">
+        <w:r>
+          <w:rPr>
+            <w:rFonts w:asciiTheme="minorHAnsi" w:hAnsiTheme="minorHAnsi" w:cstheme="minorHAnsi"/>
+          </w:rPr>
+          <w:delText xml:space="preserve">that </w:delText>
+        </w:r>
+      </w:del>
+      <w:r>
+        <w:rPr>
+          <w:rFonts w:asciiTheme="minorHAnsi" w:hAnsiTheme="minorHAnsi" w:cstheme="minorHAnsi"/>
+        </w:rPr>
+        <w:t xml:space="preserve">there are constraints in place </w:t>
+      </w:r>
+      <w:del w:id="28" w:author="Tom Anderson" w:date="2021-07-22T17:51:00Z">
+        <w:r>
+          <w:rPr>
+            <w:rFonts w:asciiTheme="minorHAnsi" w:hAnsiTheme="minorHAnsi" w:cstheme="minorHAnsi"/>
+          </w:rPr>
+          <w:delText>that</w:delText>
+        </w:r>
+      </w:del>
+      <w:ins w:id="29" w:author="Tom Anderson" w:date="2021-07-22T17:51:00Z">
+        <w:r>
+          <w:rPr>
+            <w:rFonts w:asciiTheme="minorHAnsi" w:hAnsiTheme="minorHAnsi" w:cstheme="minorHAnsi"/>
+          </w:rPr>
+          <w:t>to</w:t>
+        </w:r>
+      </w:ins>
+      <w:r>
+        <w:rPr>
+          <w:rFonts w:asciiTheme="minorHAnsi" w:hAnsiTheme="minorHAnsi" w:cstheme="minorHAnsi"/>
+        </w:rPr>
+        <w:t xml:space="preserve"> disallow </w:t>
+      </w:r>
+      <w:del w:id="30" w:author="Tom Anderson" w:date="2021-07-22T17:51:00Z">
+        <w:r>
+          <w:rPr>
+            <w:rFonts w:asciiTheme="minorHAnsi" w:hAnsiTheme="minorHAnsi" w:cstheme="minorHAnsi"/>
+          </w:rPr>
+          <w:delText xml:space="preserve">datetime </w:delText>
+        </w:r>
+      </w:del>
+      <w:ins w:id="31" w:author="Tom Anderson" w:date="2021-07-22T17:51:00Z">
+        <w:r>
+          <w:rPr>
+            <w:rFonts w:asciiTheme="minorHAnsi" w:hAnsiTheme="minorHAnsi" w:cstheme="minorHAnsi"/>
+          </w:rPr>
+          <w:t>timestamps</w:t>
+        </w:r>
+      </w:ins>
+      <w:ins w:id="32" w:author="Tom Anderson" w:date="2021-07-22T17:52:00Z">
+        <w:r>
+          <w:rPr>
+            <w:rFonts w:asciiTheme="minorHAnsi" w:hAnsiTheme="minorHAnsi" w:cstheme="minorHAnsi"/>
+          </w:rPr>
+          <w:t xml:space="preserve"> </w:t>
+        </w:r>
+      </w:ins>
+      <w:del w:id="33" w:author="Tom Anderson" w:date="2021-07-22T17:51:00Z">
+        <w:r>
+          <w:rPr>
+            <w:rFonts w:asciiTheme="minorHAnsi" w:hAnsiTheme="minorHAnsi" w:cstheme="minorHAnsi"/>
+          </w:rPr>
+          <w:delText xml:space="preserve">values </w:delText>
+        </w:r>
+      </w:del>
+      <w:r>
+        <w:rPr>
+          <w:rFonts w:asciiTheme="minorHAnsi" w:hAnsiTheme="minorHAnsi" w:cstheme="minorHAnsi"/>
+        </w:rPr>
+        <w:t>in the future</w:t>
+      </w:r>
+      <w:del w:id="34" w:author="Tom Anderson" w:date="2021-07-22T17:52:00Z">
+        <w:r>
+          <w:rPr>
+            <w:rFonts w:asciiTheme="minorHAnsi" w:hAnsiTheme="minorHAnsi" w:cstheme="minorHAnsi"/>
+          </w:rPr>
+          <w:delText>,</w:delText>
+        </w:r>
+      </w:del>
+      <w:r>
+        <w:rPr>
+          <w:rFonts w:asciiTheme="minorHAnsi" w:hAnsiTheme="minorHAnsi" w:cstheme="minorHAnsi"/>
+        </w:rPr>
+        <w:t xml:space="preserve"> or older than </w:t>
+      </w:r>
+      <w:del w:id="35" w:author="Tom Anderson" w:date="2021-07-22T17:52:00Z">
+        <w:r>
+          <w:rPr>
+            <w:rFonts w:asciiTheme="minorHAnsi" w:hAnsiTheme="minorHAnsi" w:cstheme="minorHAnsi"/>
+          </w:rPr>
+          <w:delText>1</w:delText>
+        </w:r>
+      </w:del>
+      <w:ins w:id="36" w:author="Tom Anderson" w:date="2021-07-22T17:52:00Z">
+        <w:r>
+          <w:rPr>
+            <w:rFonts w:asciiTheme="minorHAnsi" w:hAnsiTheme="minorHAnsi" w:cstheme="minorHAnsi"/>
+          </w:rPr>
+          <w:t>one</w:t>
+        </w:r>
+      </w:ins>
+      <w:r>
+        <w:rPr>
+          <w:rFonts w:asciiTheme="minorHAnsi" w:hAnsiTheme="minorHAnsi" w:cstheme="minorHAnsi"/>
+        </w:rPr>
+        <w:t xml:space="preserve"> year.</w:t>
       </w:r>
     </w:p>
     <w:p>
@@ -2272,6 +2598,7 @@
         <w:spacing w:before="163" w:line="273" w:lineRule="auto"/>
         <w:ind w:right="36"/>
         <w:rPr>
+          <w:ins w:id="37" w:author="Tom Anderson" w:date="2021-07-22T17:53:00Z"/>
           <w:rFonts w:asciiTheme="minorHAnsi" w:hAnsiTheme="minorHAnsi" w:cstheme="minorHAnsi"/>
         </w:rPr>
       </w:pPr>
@@ -2293,7 +2620,29 @@
         <w:rPr>
           <w:rFonts w:asciiTheme="minorHAnsi" w:hAnsiTheme="minorHAnsi" w:cstheme="minorHAnsi"/>
         </w:rPr>
-        <w:t xml:space="preserve">: There are </w:t>
+        <w:t xml:space="preserve">: </w:t>
+      </w:r>
+      <w:ins w:id="38" w:author="Tom Anderson" w:date="2021-07-22T17:52:00Z">
+        <w:r>
+          <w:rPr>
+            <w:rFonts w:asciiTheme="minorHAnsi" w:hAnsiTheme="minorHAnsi" w:cstheme="minorHAnsi"/>
+          </w:rPr>
+          <w:t xml:space="preserve">This is a numeric score indicating your confidence in the </w:t>
+        </w:r>
+      </w:ins>
+      <w:ins w:id="39" w:author="Tom Anderson" w:date="2021-07-22T17:53:00Z">
+        <w:r>
+          <w:rPr>
+            <w:rFonts w:asciiTheme="minorHAnsi" w:hAnsiTheme="minorHAnsi" w:cstheme="minorHAnsi"/>
+          </w:rPr>
+          <w:t xml:space="preserve">phish.  </w:t>
+        </w:r>
+      </w:ins>
+      <w:r>
+        <w:rPr>
+          <w:rFonts w:asciiTheme="minorHAnsi" w:hAnsiTheme="minorHAnsi" w:cstheme="minorHAnsi"/>
+        </w:rPr>
+        <w:t xml:space="preserve">There are </w:t>
       </w:r>
       <w:r>
         <w:rPr>
@@ -2305,7 +2654,155 @@
         <w:rPr>
           <w:rFonts w:asciiTheme="minorHAnsi" w:hAnsiTheme="minorHAnsi" w:cstheme="minorHAnsi"/>
         </w:rPr>
-        <w:t xml:space="preserve"> possible values for confidence, 100 indicates that this phish has been visually confirmed by a staff member. 90 indicates that the phish was found using a ML process. 50 indicates that you or your ML process believes this to be phish, but the phish has not been confirmed by a process that would drive it to a 90 or 100 value, yet you still think the URL should be sent to the eCX </w:t>
+        <w:t xml:space="preserve"> possible values for </w:t>
+      </w:r>
+      <w:proofErr w:type="spellStart"/>
+      <w:r>
+        <w:rPr>
+          <w:rFonts w:asciiTheme="minorHAnsi" w:hAnsiTheme="minorHAnsi" w:cstheme="minorHAnsi"/>
+        </w:rPr>
+        <w:t>confidence</w:t>
+      </w:r>
+      <w:ins w:id="40" w:author="Tom Anderson" w:date="2021-07-22T17:53:00Z">
+        <w:r>
+          <w:rPr>
+            <w:rFonts w:asciiTheme="minorHAnsi" w:hAnsiTheme="minorHAnsi" w:cstheme="minorHAnsi"/>
+          </w:rPr>
+          <w:t>_level</w:t>
+        </w:r>
+        <w:proofErr w:type="spellEnd"/>
+        <w:r>
+          <w:rPr>
+            <w:rFonts w:asciiTheme="minorHAnsi" w:hAnsiTheme="minorHAnsi" w:cstheme="minorHAnsi"/>
+          </w:rPr>
+          <w:t>:</w:t>
+        </w:r>
+      </w:ins>
+      <w:del w:id="41" w:author="Tom Anderson" w:date="2021-07-22T17:53:00Z">
+        <w:r>
+          <w:rPr>
+            <w:rFonts w:asciiTheme="minorHAnsi" w:hAnsiTheme="minorHAnsi" w:cstheme="minorHAnsi"/>
+          </w:rPr>
+          <w:delText>,</w:delText>
+        </w:r>
+      </w:del>
+      <w:r>
+        <w:rPr>
+          <w:rFonts w:asciiTheme="minorHAnsi" w:hAnsiTheme="minorHAnsi" w:cstheme="minorHAnsi"/>
+        </w:rPr>
+        <w:t xml:space="preserve"> </w:t>
+      </w:r>
+    </w:p>
+    <w:p>
+      <w:pPr>
+        <w:pStyle w:val="BodyText"/>
+        <w:numPr>
+          <w:ilvl w:val="0"/>
+          <w:numId w:val="3"/>
+        </w:numPr>
+        <w:spacing w:before="163" w:line="273" w:lineRule="auto"/>
+        <w:ind w:right="36"/>
+        <w:rPr>
+          <w:ins w:id="42" w:author="Tom Anderson" w:date="2021-07-22T17:53:00Z"/>
+          <w:rFonts w:asciiTheme="minorHAnsi" w:hAnsiTheme="minorHAnsi" w:cstheme="minorHAnsi"/>
+        </w:rPr>
+      </w:pPr>
+      <w:r>
+        <w:rPr>
+          <w:rFonts w:asciiTheme="minorHAnsi" w:hAnsiTheme="minorHAnsi" w:cstheme="minorHAnsi"/>
+        </w:rPr>
+        <w:t xml:space="preserve">100 indicates that </w:t>
+      </w:r>
+      <w:del w:id="43" w:author="Tom Anderson" w:date="2021-07-22T17:53:00Z">
+        <w:r>
+          <w:rPr>
+            <w:rFonts w:asciiTheme="minorHAnsi" w:hAnsiTheme="minorHAnsi" w:cstheme="minorHAnsi"/>
+          </w:rPr>
+          <w:delText xml:space="preserve">this </w:delText>
+        </w:r>
+      </w:del>
+      <w:ins w:id="44" w:author="Tom Anderson" w:date="2021-07-22T17:53:00Z">
+        <w:r>
+          <w:rPr>
+            <w:rFonts w:asciiTheme="minorHAnsi" w:hAnsiTheme="minorHAnsi" w:cstheme="minorHAnsi"/>
+          </w:rPr>
+          <w:t>the</w:t>
+        </w:r>
+        <w:r>
+          <w:rPr>
+            <w:rFonts w:asciiTheme="minorHAnsi" w:hAnsiTheme="minorHAnsi" w:cstheme="minorHAnsi"/>
+          </w:rPr>
+          <w:t xml:space="preserve"> </w:t>
+        </w:r>
+      </w:ins>
+      <w:r>
+        <w:rPr>
+          <w:rFonts w:asciiTheme="minorHAnsi" w:hAnsiTheme="minorHAnsi" w:cstheme="minorHAnsi"/>
+        </w:rPr>
+        <w:t xml:space="preserve">phish has been visually confirmed by a staff member. </w:t>
+      </w:r>
+    </w:p>
+    <w:p>
+      <w:pPr>
+        <w:pStyle w:val="BodyText"/>
+        <w:numPr>
+          <w:ilvl w:val="0"/>
+          <w:numId w:val="3"/>
+        </w:numPr>
+        <w:spacing w:before="163" w:line="273" w:lineRule="auto"/>
+        <w:ind w:right="36"/>
+        <w:rPr>
+          <w:ins w:id="45" w:author="Tom Anderson" w:date="2021-07-22T17:54:00Z"/>
+          <w:rFonts w:asciiTheme="minorHAnsi" w:hAnsiTheme="minorHAnsi" w:cstheme="minorHAnsi"/>
+        </w:rPr>
+      </w:pPr>
+      <w:r>
+        <w:rPr>
+          <w:rFonts w:asciiTheme="minorHAnsi" w:hAnsiTheme="minorHAnsi" w:cstheme="minorHAnsi"/>
+        </w:rPr>
+        <w:t xml:space="preserve">90 indicates that the phish was found using a ML process. </w:t>
+      </w:r>
+    </w:p>
+    <w:p>
+      <w:pPr>
+        <w:pStyle w:val="BodyText"/>
+        <w:numPr>
+          <w:ilvl w:val="0"/>
+          <w:numId w:val="3"/>
+        </w:numPr>
+        <w:spacing w:before="163" w:line="273" w:lineRule="auto"/>
+        <w:ind w:right="36"/>
+        <w:rPr>
+          <w:ins w:id="46" w:author="Tom Anderson" w:date="2021-07-22T17:54:00Z"/>
+          <w:rFonts w:asciiTheme="minorHAnsi" w:hAnsiTheme="minorHAnsi" w:cstheme="minorHAnsi"/>
+          <w:rPrChange w:id="47" w:author="Tom Anderson" w:date="2021-07-22T17:54:00Z">
+            <w:rPr>
+              <w:ins w:id="48" w:author="Tom Anderson" w:date="2021-07-22T17:54:00Z"/>
+              <w:rFonts w:asciiTheme="minorHAnsi" w:hAnsiTheme="minorHAnsi" w:cstheme="minorHAnsi"/>
+              <w:w w:val="95"/>
+            </w:rPr>
+          </w:rPrChange>
+        </w:rPr>
+      </w:pPr>
+      <w:r>
+        <w:rPr>
+          <w:rFonts w:asciiTheme="minorHAnsi" w:hAnsiTheme="minorHAnsi" w:cstheme="minorHAnsi"/>
+        </w:rPr>
+        <w:t xml:space="preserve">50 indicates that you or your ML process believes this to be phish, but the phish has not been confirmed by a process that would drive it to a 90 or 100 value, yet you still think the URL should be sent to the </w:t>
+      </w:r>
+      <w:proofErr w:type="spellStart"/>
+      <w:r>
+        <w:rPr>
+          <w:rFonts w:asciiTheme="minorHAnsi" w:hAnsiTheme="minorHAnsi" w:cstheme="minorHAnsi"/>
+        </w:rPr>
+        <w:t>eCX</w:t>
+      </w:r>
+      <w:proofErr w:type="spellEnd"/>
+      <w:r>
+        <w:rPr>
+          <w:rFonts w:asciiTheme="minorHAnsi" w:hAnsiTheme="minorHAnsi" w:cstheme="minorHAnsi"/>
+        </w:rPr>
+        <w:t xml:space="preserve"> </w:t>
       </w:r>
       <w:r>
         <w:rPr>
@@ -2318,6 +2815,35 @@
     <w:p>
       <w:pPr>
         <w:pStyle w:val="BodyText"/>
+        <w:numPr>
+          <w:ilvl w:val="0"/>
+          <w:numId w:val="3"/>
+        </w:numPr>
+        <w:spacing w:before="163" w:line="273" w:lineRule="auto"/>
+        <w:ind w:right="36"/>
+        <w:rPr>
+          <w:rFonts w:asciiTheme="minorHAnsi" w:hAnsiTheme="minorHAnsi" w:cstheme="minorHAnsi"/>
+        </w:rPr>
+        <w:pPrChange w:id="49" w:author="Tom Anderson" w:date="2021-07-22T17:53:00Z">
+          <w:pPr>
+            <w:pStyle w:val="BodyText"/>
+            <w:spacing w:before="163" w:line="273" w:lineRule="auto"/>
+            <w:ind w:right="36"/>
+          </w:pPr>
+        </w:pPrChange>
+      </w:pPr>
+      <w:ins w:id="50" w:author="Tom Anderson" w:date="2021-07-22T17:54:00Z">
+        <w:r>
+          <w:rPr>
+            <w:rFonts w:asciiTheme="minorHAnsi" w:hAnsiTheme="minorHAnsi" w:cstheme="minorHAnsi"/>
+          </w:rPr>
+          <w:t>0 indicates a false positive.</w:t>
+        </w:r>
+      </w:ins>
+    </w:p>
+    <w:p>
+      <w:pPr>
+        <w:pStyle w:val="BodyText"/>
         <w:spacing w:before="164"/>
         <w:rPr>
           <w:rFonts w:asciiTheme="minorHAnsi" w:hAnsiTheme="minorHAnsi" w:cstheme="minorHAnsi"/>
@@ -2334,42 +2860,184 @@
         <w:rPr>
           <w:rFonts w:asciiTheme="minorHAnsi" w:hAnsiTheme="minorHAnsi" w:cstheme="minorHAnsi"/>
         </w:rPr>
-        <w:t>: This indicates the company or entity that the phish is targeting.</w:t>
-      </w:r>
-      <w:r>
-        <w:rPr>
-          <w:rFonts w:asciiTheme="minorHAnsi" w:hAnsiTheme="minorHAnsi" w:cstheme="minorHAnsi"/>
-        </w:rPr>
-        <w:t xml:space="preserve">  If you are unsure of the target, you can use “other”.  If there are multiple brands </w:t>
-      </w:r>
-      <w:proofErr w:type="spellStart"/>
-      <w:r>
-        <w:rPr>
-          <w:rFonts w:asciiTheme="minorHAnsi" w:hAnsiTheme="minorHAnsi" w:cstheme="minorHAnsi"/>
-        </w:rPr>
-        <w:t>targetd</w:t>
-      </w:r>
-      <w:proofErr w:type="spellEnd"/>
-      <w:r>
-        <w:rPr>
-          <w:rFonts w:asciiTheme="minorHAnsi" w:hAnsiTheme="minorHAnsi" w:cstheme="minorHAnsi"/>
-        </w:rPr>
-        <w:t xml:space="preserve"> on the phishing page, you can use “multiple”, </w:t>
-      </w:r>
-      <w:proofErr w:type="spellStart"/>
-      <w:r>
-        <w:rPr>
-          <w:rFonts w:asciiTheme="minorHAnsi" w:hAnsiTheme="minorHAnsi" w:cstheme="minorHAnsi"/>
-        </w:rPr>
-        <w:t>r</w:t>
-      </w:r>
-      <w:proofErr w:type="spellEnd"/>
-      <w:r>
-        <w:rPr>
-          <w:rFonts w:asciiTheme="minorHAnsi" w:hAnsiTheme="minorHAnsi" w:cstheme="minorHAnsi"/>
-        </w:rPr>
-        <w:t xml:space="preserve"> you can specify the most prominent or relevant brans specifically.</w:t>
-      </w:r>
+        <w:t xml:space="preserve">: </w:t>
+      </w:r>
+      <w:ins w:id="51" w:author="Tom Anderson" w:date="2021-07-22T17:54:00Z">
+        <w:r>
+          <w:rPr>
+            <w:rFonts w:asciiTheme="minorHAnsi" w:hAnsiTheme="minorHAnsi" w:cstheme="minorHAnsi"/>
+          </w:rPr>
+          <w:t xml:space="preserve">The brand is the </w:t>
+        </w:r>
+      </w:ins>
+      <w:del w:id="52" w:author="Tom Anderson" w:date="2021-07-22T17:54:00Z">
+        <w:r>
+          <w:rPr>
+            <w:rFonts w:asciiTheme="minorHAnsi" w:hAnsiTheme="minorHAnsi" w:cstheme="minorHAnsi"/>
+          </w:rPr>
+          <w:delText xml:space="preserve">This </w:delText>
+        </w:r>
+      </w:del>
+      <w:del w:id="53" w:author="Tom Anderson" w:date="2021-07-22T17:55:00Z">
+        <w:r>
+          <w:rPr>
+            <w:rFonts w:asciiTheme="minorHAnsi" w:hAnsiTheme="minorHAnsi" w:cstheme="minorHAnsi"/>
+          </w:rPr>
+          <w:delText xml:space="preserve">indicates the </w:delText>
+        </w:r>
+      </w:del>
+      <w:r>
+        <w:rPr>
+          <w:rFonts w:asciiTheme="minorHAnsi" w:hAnsiTheme="minorHAnsi" w:cstheme="minorHAnsi"/>
+        </w:rPr>
+        <w:t>company or entity that the phish is targeting.</w:t>
+      </w:r>
+      <w:r>
+        <w:rPr>
+          <w:rFonts w:asciiTheme="minorHAnsi" w:hAnsiTheme="minorHAnsi" w:cstheme="minorHAnsi"/>
+        </w:rPr>
+        <w:t xml:space="preserve">  If you are unsure of the </w:t>
+      </w:r>
+      <w:proofErr w:type="gramStart"/>
+      <w:r>
+        <w:rPr>
+          <w:rFonts w:asciiTheme="minorHAnsi" w:hAnsiTheme="minorHAnsi" w:cstheme="minorHAnsi"/>
+        </w:rPr>
+        <w:t>target</w:t>
+      </w:r>
+      <w:proofErr w:type="gramEnd"/>
+      <w:del w:id="54" w:author="Tom Anderson" w:date="2021-07-22T17:55:00Z">
+        <w:r>
+          <w:rPr>
+            <w:rFonts w:asciiTheme="minorHAnsi" w:hAnsiTheme="minorHAnsi" w:cstheme="minorHAnsi"/>
+          </w:rPr>
+          <w:delText>, you</w:delText>
+        </w:r>
+      </w:del>
+      <w:ins w:id="55" w:author="Tom Anderson" w:date="2021-07-22T17:55:00Z">
+        <w:r>
+          <w:rPr>
+            <w:rFonts w:asciiTheme="minorHAnsi" w:hAnsiTheme="minorHAnsi" w:cstheme="minorHAnsi"/>
+          </w:rPr>
+          <w:t xml:space="preserve"> then</w:t>
+        </w:r>
+      </w:ins>
+      <w:del w:id="56" w:author="Tom Anderson" w:date="2021-07-22T17:55:00Z">
+        <w:r>
+          <w:rPr>
+            <w:rFonts w:asciiTheme="minorHAnsi" w:hAnsiTheme="minorHAnsi" w:cstheme="minorHAnsi"/>
+          </w:rPr>
+          <w:delText xml:space="preserve"> can </w:delText>
+        </w:r>
+      </w:del>
+      <w:ins w:id="57" w:author="Tom Anderson" w:date="2021-07-22T17:55:00Z">
+        <w:r>
+          <w:rPr>
+            <w:rFonts w:asciiTheme="minorHAnsi" w:hAnsiTheme="minorHAnsi" w:cstheme="minorHAnsi"/>
+          </w:rPr>
+          <w:t xml:space="preserve"> </w:t>
+        </w:r>
+      </w:ins>
+      <w:r>
+        <w:rPr>
+          <w:rFonts w:asciiTheme="minorHAnsi" w:hAnsiTheme="minorHAnsi" w:cstheme="minorHAnsi"/>
+        </w:rPr>
+        <w:t>use “other”.  If there are multiple brands target</w:t>
+      </w:r>
+      <w:ins w:id="58" w:author="Tom Anderson" w:date="2021-07-22T17:55:00Z">
+        <w:r>
+          <w:rPr>
+            <w:rFonts w:asciiTheme="minorHAnsi" w:hAnsiTheme="minorHAnsi" w:cstheme="minorHAnsi"/>
+          </w:rPr>
+          <w:t>e</w:t>
+        </w:r>
+      </w:ins>
+      <w:r>
+        <w:rPr>
+          <w:rFonts w:asciiTheme="minorHAnsi" w:hAnsiTheme="minorHAnsi" w:cstheme="minorHAnsi"/>
+        </w:rPr>
+        <w:t>d on the phishing page</w:t>
+      </w:r>
+      <w:del w:id="59" w:author="Tom Anderson" w:date="2021-07-22T17:55:00Z">
+        <w:r>
+          <w:rPr>
+            <w:rFonts w:asciiTheme="minorHAnsi" w:hAnsiTheme="minorHAnsi" w:cstheme="minorHAnsi"/>
+          </w:rPr>
+          <w:delText>,</w:delText>
+        </w:r>
+      </w:del>
+      <w:r>
+        <w:rPr>
+          <w:rFonts w:asciiTheme="minorHAnsi" w:hAnsiTheme="minorHAnsi" w:cstheme="minorHAnsi"/>
+        </w:rPr>
+        <w:t xml:space="preserve"> you can use “multiple”</w:t>
+      </w:r>
+      <w:del w:id="60" w:author="Tom Anderson" w:date="2021-07-22T17:55:00Z">
+        <w:r>
+          <w:rPr>
+            <w:rFonts w:asciiTheme="minorHAnsi" w:hAnsiTheme="minorHAnsi" w:cstheme="minorHAnsi"/>
+          </w:rPr>
+          <w:delText>,</w:delText>
+        </w:r>
+      </w:del>
+      <w:r>
+        <w:rPr>
+          <w:rFonts w:asciiTheme="minorHAnsi" w:hAnsiTheme="minorHAnsi" w:cstheme="minorHAnsi"/>
+        </w:rPr>
+        <w:t xml:space="preserve"> </w:t>
+      </w:r>
+      <w:ins w:id="61" w:author="Tom Anderson" w:date="2021-07-22T17:55:00Z">
+        <w:r>
+          <w:rPr>
+            <w:rFonts w:asciiTheme="minorHAnsi" w:hAnsiTheme="minorHAnsi" w:cstheme="minorHAnsi"/>
+          </w:rPr>
+          <w:t>o</w:t>
+        </w:r>
+      </w:ins>
+      <w:r>
+        <w:rPr>
+          <w:rFonts w:asciiTheme="minorHAnsi" w:hAnsiTheme="minorHAnsi" w:cstheme="minorHAnsi"/>
+        </w:rPr>
+        <w:t>r you can specify the most prominent or relevant bran</w:t>
+      </w:r>
+      <w:ins w:id="62" w:author="Tom Anderson" w:date="2021-07-22T17:55:00Z">
+        <w:r>
+          <w:rPr>
+            <w:rFonts w:asciiTheme="minorHAnsi" w:hAnsiTheme="minorHAnsi" w:cstheme="minorHAnsi"/>
+          </w:rPr>
+          <w:t>d(</w:t>
+        </w:r>
+      </w:ins>
+      <w:r>
+        <w:rPr>
+          <w:rFonts w:asciiTheme="minorHAnsi" w:hAnsiTheme="minorHAnsi" w:cstheme="minorHAnsi"/>
+        </w:rPr>
+        <w:t>s</w:t>
+      </w:r>
+      <w:ins w:id="63" w:author="Tom Anderson" w:date="2021-07-22T17:55:00Z">
+        <w:r>
+          <w:rPr>
+            <w:rFonts w:asciiTheme="minorHAnsi" w:hAnsiTheme="minorHAnsi" w:cstheme="minorHAnsi"/>
+          </w:rPr>
+          <w:t>)</w:t>
+        </w:r>
+      </w:ins>
+      <w:del w:id="64" w:author="Tom Anderson" w:date="2021-07-22T17:55:00Z">
+        <w:r>
+          <w:rPr>
+            <w:rFonts w:asciiTheme="minorHAnsi" w:hAnsiTheme="minorHAnsi" w:cstheme="minorHAnsi"/>
+          </w:rPr>
+          <w:delText xml:space="preserve"> specifically.</w:delText>
+        </w:r>
+      </w:del>
+      <w:ins w:id="65" w:author="Tom Anderson" w:date="2021-07-22T17:55:00Z">
+        <w:r>
+          <w:rPr>
+            <w:rFonts w:asciiTheme="minorHAnsi" w:hAnsiTheme="minorHAnsi" w:cstheme="minorHAnsi"/>
+          </w:rPr>
+          <w:t>.</w:t>
+        </w:r>
+      </w:ins>
     </w:p>
     <w:p>
       <w:pPr>
@@ -2402,6 +3070,22 @@
         </w:rPr>
         <w:t>: The full phishing URL that you want to report</w:t>
       </w:r>
+      <w:ins w:id="66" w:author="Tom Anderson" w:date="2021-07-22T17:55:00Z">
+        <w:r>
+          <w:rPr>
+            <w:rFonts w:asciiTheme="minorHAnsi" w:hAnsiTheme="minorHAnsi" w:cstheme="minorHAnsi"/>
+          </w:rPr>
+          <w:t xml:space="preserve">.  This is the </w:t>
+        </w:r>
+      </w:ins>
+      <w:ins w:id="67" w:author="Tom Anderson" w:date="2021-07-22T17:57:00Z">
+        <w:r>
+          <w:rPr>
+            <w:rFonts w:asciiTheme="minorHAnsi" w:hAnsiTheme="minorHAnsi" w:cstheme="minorHAnsi"/>
+          </w:rPr>
+          <w:t>URL where the phish is located.</w:t>
+        </w:r>
+      </w:ins>
     </w:p>
     <w:p>
       <w:pPr>
@@ -2429,35 +3113,94 @@
         </w:rPr>
         <w:t xml:space="preserve">As </w:t>
       </w:r>
-      <w:proofErr w:type="gramStart"/>
+      <w:del w:id="68" w:author="Tom Anderson" w:date="2021-07-22T17:57:00Z">
+        <w:r>
+          <w:rPr>
+            <w:rFonts w:asciiTheme="minorHAnsi" w:hAnsiTheme="minorHAnsi" w:cstheme="minorHAnsi"/>
+            <w:w w:val="95"/>
+          </w:rPr>
+          <w:delText>noted</w:delText>
+        </w:r>
+      </w:del>
+      <w:ins w:id="69" w:author="Tom Anderson" w:date="2021-07-22T17:57:00Z">
+        <w:r>
+          <w:rPr>
+            <w:rFonts w:asciiTheme="minorHAnsi" w:hAnsiTheme="minorHAnsi" w:cstheme="minorHAnsi"/>
+            <w:w w:val="95"/>
+          </w:rPr>
+          <w:t>noted,</w:t>
+        </w:r>
+      </w:ins>
       <w:r>
         <w:rPr>
           <w:rFonts w:asciiTheme="minorHAnsi" w:hAnsiTheme="minorHAnsi" w:cstheme="minorHAnsi"/>
           <w:w w:val="95"/>
         </w:rPr>
-        <w:t>noted</w:t>
-      </w:r>
-      <w:proofErr w:type="gramEnd"/>
+        <w:t xml:space="preserve"> </w:t>
+      </w:r>
+      <w:del w:id="70" w:author="Tom Anderson" w:date="2021-07-22T17:57:00Z">
+        <w:r>
+          <w:rPr>
+            <w:rFonts w:asciiTheme="minorHAnsi" w:hAnsiTheme="minorHAnsi" w:cstheme="minorHAnsi"/>
+            <w:w w:val="95"/>
+          </w:rPr>
+          <w:delText xml:space="preserve">before, </w:delText>
+        </w:r>
+      </w:del>
       <w:r>
         <w:rPr>
           <w:rFonts w:asciiTheme="minorHAnsi" w:hAnsiTheme="minorHAnsi" w:cstheme="minorHAnsi"/>
           <w:w w:val="95"/>
         </w:rPr>
-        <w:t xml:space="preserve"> before, all modules and workgroups within eCX follow this same general submission flow, changed </w:t>
-      </w:r>
+        <w:t>all modules and workgroups within eCX follow this same general submission flow</w:t>
+      </w:r>
+      <w:ins w:id="71" w:author="Tom Anderson" w:date="2021-07-22T17:57:00Z">
+        <w:r>
+          <w:rPr>
+            <w:rFonts w:asciiTheme="minorHAnsi" w:hAnsiTheme="minorHAnsi" w:cstheme="minorHAnsi"/>
+            <w:w w:val="95"/>
+          </w:rPr>
+          <w:t xml:space="preserve"> differing </w:t>
+        </w:r>
+      </w:ins>
+      <w:del w:id="72" w:author="Tom Anderson" w:date="2021-07-22T17:57:00Z">
+        <w:r>
+          <w:rPr>
+            <w:rFonts w:asciiTheme="minorHAnsi" w:hAnsiTheme="minorHAnsi" w:cstheme="minorHAnsi"/>
+            <w:w w:val="95"/>
+          </w:rPr>
+          <w:delText xml:space="preserve">, changed </w:delText>
+        </w:r>
+        <w:r>
+          <w:rPr>
+            <w:rFonts w:asciiTheme="minorHAnsi" w:hAnsiTheme="minorHAnsi" w:cstheme="minorHAnsi"/>
+            <w:w w:val="95"/>
+          </w:rPr>
+          <w:delText xml:space="preserve">by </w:delText>
+        </w:r>
+        <w:r>
+          <w:rPr>
+            <w:rFonts w:asciiTheme="minorHAnsi" w:hAnsiTheme="minorHAnsi" w:cstheme="minorHAnsi"/>
+            <w:w w:val="95"/>
+          </w:rPr>
+          <w:delText>differences i</w:delText>
+        </w:r>
+      </w:del>
+      <w:ins w:id="73" w:author="Tom Anderson" w:date="2021-07-22T17:57:00Z">
+        <w:r>
+          <w:rPr>
+            <w:rFonts w:asciiTheme="minorHAnsi" w:hAnsiTheme="minorHAnsi" w:cstheme="minorHAnsi"/>
+            <w:w w:val="95"/>
+          </w:rPr>
+          <w:t>i</w:t>
+        </w:r>
+      </w:ins>
       <w:r>
         <w:rPr>
           <w:rFonts w:asciiTheme="minorHAnsi" w:hAnsiTheme="minorHAnsi" w:cstheme="minorHAnsi"/>
           <w:w w:val="95"/>
         </w:rPr>
-        <w:t xml:space="preserve">by </w:t>
-      </w:r>
-      <w:r>
-        <w:rPr>
-          <w:rFonts w:asciiTheme="minorHAnsi" w:hAnsiTheme="minorHAnsi" w:cstheme="minorHAnsi"/>
-          <w:w w:val="95"/>
-        </w:rPr>
-        <w:t>differences in the schema of the data.</w:t>
+        <w:t>n the schema of the data.</w:t>
       </w:r>
     </w:p>
     <w:p>
@@ -2553,12 +3296,62 @@
           <w:w w:val="95"/>
         </w:rPr>
       </w:pPr>
+      <w:del w:id="74" w:author="Tom Anderson" w:date="2021-07-22T17:58:00Z">
+        <w:r>
+          <w:rPr>
+            <w:rFonts w:asciiTheme="minorHAnsi" w:hAnsiTheme="minorHAnsi" w:cstheme="minorHAnsi"/>
+            <w:w w:val="95"/>
+          </w:rPr>
+          <w:delText>The following</w:delText>
+        </w:r>
+      </w:del>
+      <w:ins w:id="75" w:author="Tom Anderson" w:date="2021-07-22T17:58:00Z">
+        <w:r>
+          <w:rPr>
+            <w:rFonts w:asciiTheme="minorHAnsi" w:hAnsiTheme="minorHAnsi" w:cstheme="minorHAnsi"/>
+            <w:w w:val="95"/>
+          </w:rPr>
+          <w:t>This section</w:t>
+        </w:r>
+      </w:ins>
       <w:r>
         <w:rPr>
           <w:rFonts w:asciiTheme="minorHAnsi" w:hAnsiTheme="minorHAnsi" w:cstheme="minorHAnsi"/>
           <w:w w:val="95"/>
         </w:rPr>
-        <w:t xml:space="preserve">The following is an in-depth overview of usage of the eCX API. If you have any questions about issues within this </w:t>
+        <w:t xml:space="preserve"> is an in-depth overview of usage of the eCX API. If you have </w:t>
+      </w:r>
+      <w:del w:id="76" w:author="Tom Anderson" w:date="2021-07-22T17:58:00Z">
+        <w:r>
+          <w:rPr>
+            <w:rFonts w:asciiTheme="minorHAnsi" w:hAnsiTheme="minorHAnsi" w:cstheme="minorHAnsi"/>
+            <w:w w:val="95"/>
+          </w:rPr>
+          <w:delText xml:space="preserve">any </w:delText>
+        </w:r>
+      </w:del>
+      <w:r>
+        <w:rPr>
+          <w:rFonts w:asciiTheme="minorHAnsi" w:hAnsiTheme="minorHAnsi" w:cstheme="minorHAnsi"/>
+          <w:w w:val="95"/>
+        </w:rPr>
+        <w:t xml:space="preserve">questions about </w:t>
+      </w:r>
+      <w:del w:id="77" w:author="Tom Anderson" w:date="2021-07-22T17:58:00Z">
+        <w:r>
+          <w:rPr>
+            <w:rFonts w:asciiTheme="minorHAnsi" w:hAnsiTheme="minorHAnsi" w:cstheme="minorHAnsi"/>
+            <w:w w:val="95"/>
+          </w:rPr>
+          <w:delText xml:space="preserve">issues within </w:delText>
+        </w:r>
+      </w:del>
+      <w:r>
+        <w:rPr>
+          <w:rFonts w:asciiTheme="minorHAnsi" w:hAnsiTheme="minorHAnsi" w:cstheme="minorHAnsi"/>
+          <w:w w:val="95"/>
+        </w:rPr>
+        <w:t xml:space="preserve">this </w:t>
       </w:r>
       <w:proofErr w:type="gramStart"/>
       <w:r>
@@ -2600,6 +3393,7 @@
         <w:pStyle w:val="BodyText"/>
         <w:spacing w:line="273" w:lineRule="auto"/>
         <w:rPr>
+          <w:del w:id="78" w:author="Tom Anderson" w:date="2021-07-22T17:58:00Z"/>
           <w:rFonts w:asciiTheme="minorHAnsi" w:hAnsiTheme="minorHAnsi" w:cstheme="minorHAnsi"/>
         </w:rPr>
       </w:pPr>
@@ -2626,38 +3420,39 @@
         <w:rPr>
           <w:rFonts w:asciiTheme="minorHAnsi" w:hAnsiTheme="minorHAnsi" w:cstheme="minorHAnsi"/>
         </w:rPr>
-        <w:t xml:space="preserve">The eCX API is a REST API. If you are familiar with REST API </w:t>
-      </w:r>
-      <w:proofErr w:type="gramStart"/>
-      <w:r>
-        <w:rPr>
-          <w:rFonts w:asciiTheme="minorHAnsi" w:hAnsiTheme="minorHAnsi" w:cstheme="minorHAnsi"/>
-        </w:rPr>
-        <w:t>technology</w:t>
-      </w:r>
-      <w:proofErr w:type="gramEnd"/>
-      <w:r>
-        <w:rPr>
-          <w:rFonts w:asciiTheme="minorHAnsi" w:hAnsiTheme="minorHAnsi" w:cstheme="minorHAnsi"/>
-        </w:rPr>
-        <w:t xml:space="preserve"> then what follows is straight forward. If you have not used a REST API before f- it is well proven technology that has been in use for </w:t>
-      </w:r>
-      <w:proofErr w:type="gramStart"/>
-      <w:r>
-        <w:rPr>
-          <w:rFonts w:asciiTheme="minorHAnsi" w:hAnsiTheme="minorHAnsi" w:cstheme="minorHAnsi"/>
-          <w:w w:val="95"/>
-        </w:rPr>
-        <w:t>years, and</w:t>
-      </w:r>
-      <w:proofErr w:type="gramEnd"/>
-      <w:r>
-        <w:rPr>
-          <w:rFonts w:asciiTheme="minorHAnsi" w:hAnsiTheme="minorHAnsi" w:cstheme="minorHAnsi"/>
-          <w:w w:val="95"/>
-        </w:rPr>
-        <w:t xml:space="preserve"> is not complicated. There is lots of knowledge found via Google searches, but explaining REST is beyond the scope of this document.</w:t>
-      </w:r>
+        <w:t xml:space="preserve">The eCX API is a REST API. </w:t>
+      </w:r>
+      <w:del w:id="79" w:author="Tom Anderson" w:date="2021-07-22T17:59:00Z">
+        <w:r>
+          <w:rPr>
+            <w:rFonts w:asciiTheme="minorHAnsi" w:hAnsiTheme="minorHAnsi" w:cstheme="minorHAnsi"/>
+          </w:rPr>
+          <w:delText xml:space="preserve">If you are familiar with REST API technology then what follows is straight forward. If you have not used a REST API before f- it is well proven technology that has been in use for </w:delText>
+        </w:r>
+        <w:r>
+          <w:rPr>
+            <w:rFonts w:asciiTheme="minorHAnsi" w:hAnsiTheme="minorHAnsi" w:cstheme="minorHAnsi"/>
+            <w:w w:val="95"/>
+          </w:rPr>
+          <w:delText>years, and is not complicated. There is lots of knowledge found via Google searches, but explaining REST is beyond the scope of this document.</w:delText>
+        </w:r>
+      </w:del>
+      <w:ins w:id="80" w:author="Tom Anderson" w:date="2021-07-22T17:59:00Z">
+        <w:r>
+          <w:rPr>
+            <w:rFonts w:asciiTheme="minorHAnsi" w:hAnsiTheme="minorHAnsi" w:cstheme="minorHAnsi"/>
+          </w:rPr>
+          <w:t xml:space="preserve">For an introduction to REST APIs please see </w:t>
+        </w:r>
+      </w:ins>
+      <w:ins w:id="81" w:author="Tom Anderson" w:date="2021-07-22T18:00:00Z">
+        <w:r>
+          <w:rPr>
+            <w:rFonts w:asciiTheme="minorHAnsi" w:hAnsiTheme="minorHAnsi" w:cstheme="minorHAnsi"/>
+          </w:rPr>
+          <w:t>https://en.wikipedia.org/wiki/Representational_state_transfer</w:t>
+        </w:r>
+      </w:ins>
     </w:p>
     <w:p>
       <w:pPr>
@@ -2672,7 +3467,73 @@
           <w:rFonts w:asciiTheme="minorHAnsi" w:hAnsiTheme="minorHAnsi" w:cstheme="minorHAnsi"/>
           <w:w w:val="90"/>
         </w:rPr>
-        <w:t>The eCX API supports 3 basic REST operations – GET, POST, and PATCH.</w:t>
+        <w:t xml:space="preserve">The </w:t>
+      </w:r>
+      <w:proofErr w:type="spellStart"/>
+      <w:r>
+        <w:rPr>
+          <w:rFonts w:asciiTheme="minorHAnsi" w:hAnsiTheme="minorHAnsi" w:cstheme="minorHAnsi"/>
+          <w:w w:val="90"/>
+        </w:rPr>
+        <w:t>eCX</w:t>
+      </w:r>
+      <w:proofErr w:type="spellEnd"/>
+      <w:r>
+        <w:rPr>
+          <w:rFonts w:asciiTheme="minorHAnsi" w:hAnsiTheme="minorHAnsi" w:cstheme="minorHAnsi"/>
+          <w:w w:val="90"/>
+        </w:rPr>
+        <w:t xml:space="preserve"> API supports </w:t>
+      </w:r>
+      <w:ins w:id="82" w:author="Tom Anderson" w:date="2021-07-22T18:00:00Z">
+        <w:r>
+          <w:rPr>
+            <w:rFonts w:asciiTheme="minorHAnsi" w:hAnsiTheme="minorHAnsi" w:cstheme="minorHAnsi"/>
+            <w:w w:val="90"/>
+          </w:rPr>
+          <w:t xml:space="preserve">three </w:t>
+        </w:r>
+      </w:ins>
+      <w:del w:id="83" w:author="Tom Anderson" w:date="2021-07-22T18:00:00Z">
+        <w:r>
+          <w:rPr>
+            <w:rFonts w:asciiTheme="minorHAnsi" w:hAnsiTheme="minorHAnsi" w:cstheme="minorHAnsi"/>
+            <w:w w:val="90"/>
+          </w:rPr>
+          <w:delText xml:space="preserve">3 basic </w:delText>
+        </w:r>
+      </w:del>
+      <w:r>
+        <w:rPr>
+          <w:rFonts w:asciiTheme="minorHAnsi" w:hAnsiTheme="minorHAnsi" w:cstheme="minorHAnsi"/>
+          <w:w w:val="90"/>
+        </w:rPr>
+        <w:t xml:space="preserve">REST </w:t>
+      </w:r>
+      <w:del w:id="84" w:author="Tom Anderson" w:date="2021-07-22T18:00:00Z">
+        <w:r>
+          <w:rPr>
+            <w:rFonts w:asciiTheme="minorHAnsi" w:hAnsiTheme="minorHAnsi" w:cstheme="minorHAnsi"/>
+            <w:w w:val="90"/>
+          </w:rPr>
+          <w:delText>operations</w:delText>
+        </w:r>
+      </w:del>
+      <w:ins w:id="85" w:author="Tom Anderson" w:date="2021-07-22T18:01:00Z">
+        <w:r>
+          <w:rPr>
+            <w:rFonts w:asciiTheme="minorHAnsi" w:hAnsiTheme="minorHAnsi" w:cstheme="minorHAnsi"/>
+            <w:w w:val="90"/>
+          </w:rPr>
+          <w:t>operations</w:t>
+        </w:r>
+      </w:ins>
+      <w:r>
+        <w:rPr>
+          <w:rFonts w:asciiTheme="minorHAnsi" w:hAnsiTheme="minorHAnsi" w:cstheme="minorHAnsi"/>
+          <w:w w:val="90"/>
+        </w:rPr>
+        <w:t xml:space="preserve"> – GET, POST, and PATCH.</w:t>
       </w:r>
     </w:p>
     <w:p>
@@ -2707,8 +3568,69 @@
           <w:rFonts w:asciiTheme="minorHAnsi" w:hAnsiTheme="minorHAnsi" w:cstheme="minorHAnsi"/>
           <w:w w:val="95"/>
         </w:rPr>
-        <w:t>GET is a data fetch operation that allows for querying of data, and eCX supports multiple parameter options.</w:t>
-      </w:r>
+        <w:t>GET is a data fetch operation that allows for querying of data</w:t>
+      </w:r>
+      <w:ins w:id="86" w:author="Tom Anderson" w:date="2021-07-22T18:00:00Z">
+        <w:r>
+          <w:rPr>
+            <w:rFonts w:asciiTheme="minorHAnsi" w:hAnsiTheme="minorHAnsi" w:cstheme="minorHAnsi"/>
+            <w:w w:val="95"/>
+          </w:rPr>
+          <w:t xml:space="preserve">.  </w:t>
+        </w:r>
+        <w:proofErr w:type="spellStart"/>
+        <w:r>
+          <w:rPr>
+            <w:rFonts w:asciiTheme="minorHAnsi" w:hAnsiTheme="minorHAnsi" w:cstheme="minorHAnsi"/>
+            <w:w w:val="95"/>
+          </w:rPr>
+          <w:t>eCX</w:t>
+        </w:r>
+      </w:ins>
+      <w:proofErr w:type="spellEnd"/>
+      <w:del w:id="87" w:author="Tom Anderson" w:date="2021-07-22T18:00:00Z">
+        <w:r>
+          <w:rPr>
+            <w:rFonts w:asciiTheme="minorHAnsi" w:hAnsiTheme="minorHAnsi" w:cstheme="minorHAnsi"/>
+            <w:w w:val="95"/>
+          </w:rPr>
+          <w:delText xml:space="preserve">, and eCX </w:delText>
+        </w:r>
+      </w:del>
+      <w:ins w:id="88" w:author="Tom Anderson" w:date="2021-07-22T18:00:00Z">
+        <w:r>
+          <w:rPr>
+            <w:rFonts w:asciiTheme="minorHAnsi" w:hAnsiTheme="minorHAnsi" w:cstheme="minorHAnsi"/>
+            <w:w w:val="95"/>
+          </w:rPr>
+          <w:t xml:space="preserve"> </w:t>
+        </w:r>
+      </w:ins>
+      <w:r>
+        <w:rPr>
+          <w:rFonts w:asciiTheme="minorHAnsi" w:hAnsiTheme="minorHAnsi" w:cstheme="minorHAnsi"/>
+          <w:w w:val="95"/>
+        </w:rPr>
+        <w:t>supports multiple paramete</w:t>
+      </w:r>
+      <w:del w:id="89" w:author="Tom Anderson" w:date="2021-07-22T18:00:00Z">
+        <w:r>
+          <w:rPr>
+            <w:rFonts w:asciiTheme="minorHAnsi" w:hAnsiTheme="minorHAnsi" w:cstheme="minorHAnsi"/>
+            <w:w w:val="95"/>
+          </w:rPr>
+          <w:delText>r options.</w:delText>
+        </w:r>
+      </w:del>
+      <w:ins w:id="90" w:author="Tom Anderson" w:date="2021-07-22T18:00:00Z">
+        <w:r>
+          <w:rPr>
+            <w:rFonts w:asciiTheme="minorHAnsi" w:hAnsiTheme="minorHAnsi" w:cstheme="minorHAnsi"/>
+            <w:w w:val="95"/>
+          </w:rPr>
+          <w:t>rs.</w:t>
+        </w:r>
+      </w:ins>
     </w:p>
     <w:p>
       <w:pPr>
@@ -2733,6 +3655,15 @@
         </w:rPr>
         <w:t>POST sends new data to eCX within a JSON payload</w:t>
       </w:r>
+      <w:ins w:id="91" w:author="Tom Anderson" w:date="2021-07-22T18:01:00Z">
+        <w:r>
+          <w:rPr>
+            <w:rFonts w:asciiTheme="minorHAnsi" w:hAnsiTheme="minorHAnsi" w:cstheme="minorHAnsi"/>
+            <w:w w:val="90"/>
+          </w:rPr>
+          <w:t>.</w:t>
+        </w:r>
+      </w:ins>
     </w:p>
     <w:p>
       <w:pPr>
@@ -2755,8 +3686,33 @@
           <w:rFonts w:asciiTheme="minorHAnsi" w:hAnsiTheme="minorHAnsi" w:cstheme="minorHAnsi"/>
           <w:w w:val="90"/>
         </w:rPr>
-        <w:t>PATCH is used to update existing eCX data values</w:t>
-      </w:r>
+        <w:t xml:space="preserve">PATCH is used to update existing </w:t>
+      </w:r>
+      <w:proofErr w:type="spellStart"/>
+      <w:r>
+        <w:rPr>
+          <w:rFonts w:asciiTheme="minorHAnsi" w:hAnsiTheme="minorHAnsi" w:cstheme="minorHAnsi"/>
+          <w:w w:val="90"/>
+        </w:rPr>
+        <w:t>eCX</w:t>
+      </w:r>
+      <w:proofErr w:type="spellEnd"/>
+      <w:r>
+        <w:rPr>
+          <w:rFonts w:asciiTheme="minorHAnsi" w:hAnsiTheme="minorHAnsi" w:cstheme="minorHAnsi"/>
+          <w:w w:val="90"/>
+        </w:rPr>
+        <w:t xml:space="preserve"> data values</w:t>
+      </w:r>
+      <w:ins w:id="92" w:author="Tom Anderson" w:date="2021-07-22T18:01:00Z">
+        <w:r>
+          <w:rPr>
+            <w:rFonts w:asciiTheme="minorHAnsi" w:hAnsiTheme="minorHAnsi" w:cstheme="minorHAnsi"/>
+            <w:w w:val="90"/>
+          </w:rPr>
+          <w:t xml:space="preserve"> using a JSON payload.</w:t>
+        </w:r>
+      </w:ins>
     </w:p>
     <w:p>
       <w:pPr>
@@ -2775,39 +3731,152 @@
           <w:rFonts w:asciiTheme="minorHAnsi" w:hAnsiTheme="minorHAnsi" w:cstheme="minorHAnsi"/>
         </w:rPr>
       </w:pPr>
+      <w:ins w:id="93" w:author="Tom Anderson" w:date="2021-07-22T18:02:00Z">
+        <w:r>
+          <w:rPr>
+            <w:rFonts w:asciiTheme="minorHAnsi" w:hAnsiTheme="minorHAnsi" w:cstheme="minorHAnsi"/>
+            <w:w w:val="95"/>
+          </w:rPr>
+          <w:t>E</w:t>
+        </w:r>
+      </w:ins>
+      <w:del w:id="94" w:author="Tom Anderson" w:date="2021-07-22T18:01:00Z">
+        <w:r>
+          <w:rPr>
+            <w:rFonts w:asciiTheme="minorHAnsi" w:hAnsiTheme="minorHAnsi" w:cstheme="minorHAnsi"/>
+            <w:w w:val="95"/>
+          </w:rPr>
+          <w:delText>In e</w:delText>
+        </w:r>
+      </w:del>
       <w:r>
         <w:rPr>
           <w:rFonts w:asciiTheme="minorHAnsi" w:hAnsiTheme="minorHAnsi" w:cstheme="minorHAnsi"/>
           <w:w w:val="95"/>
         </w:rPr>
-        <w:t xml:space="preserve">In every GET, POST, or PATCH operation the eCX API returns data in JSON. There is a GET parameter </w:t>
-      </w:r>
-      <w:r>
-        <w:rPr>
-          <w:rFonts w:asciiTheme="minorHAnsi" w:hAnsiTheme="minorHAnsi" w:cstheme="minorHAnsi"/>
-        </w:rPr>
-        <w:t xml:space="preserve">that will tell the eCX API to return data to you in CSV, however </w:t>
-      </w:r>
-      <w:proofErr w:type="gramStart"/>
-      <w:r>
-        <w:rPr>
-          <w:rFonts w:asciiTheme="minorHAnsi" w:hAnsiTheme="minorHAnsi" w:cstheme="minorHAnsi"/>
-        </w:rPr>
-        <w:t>you’ll</w:t>
-      </w:r>
-      <w:proofErr w:type="gramEnd"/>
-      <w:r>
-        <w:rPr>
-          <w:rFonts w:asciiTheme="minorHAnsi" w:hAnsiTheme="minorHAnsi" w:cstheme="minorHAnsi"/>
-        </w:rPr>
-        <w:t xml:space="preserve"> receive a much smaller subset of </w:t>
+        <w:t xml:space="preserve">very GET, POST, or PATCH operation the eCX API returns data in JSON. There is a GET parameter </w:t>
+      </w:r>
+      <w:r>
+        <w:rPr>
+          <w:rFonts w:asciiTheme="minorHAnsi" w:hAnsiTheme="minorHAnsi" w:cstheme="minorHAnsi"/>
+        </w:rPr>
+        <w:t xml:space="preserve">that will tell the eCX API to return data to you in CSV, however you’ll receive a much smaller subset of </w:t>
       </w:r>
       <w:r>
         <w:rPr>
           <w:rFonts w:asciiTheme="minorHAnsi" w:hAnsiTheme="minorHAnsi" w:cstheme="minorHAnsi"/>
           <w:w w:val="95"/>
         </w:rPr>
-        <w:t>data per entity that you will with JSON. This is because using JSON allows us to nest arrays and objects into the JSON schema, and these arrays and objects cannot be represented in CSV, and the data within these JSON objects and arrays are omitted in CSV. Sending data to eCX using POST requires the data payload to be in JSON, CSV is not an option for POST.</w:t>
+        <w:t xml:space="preserve">data per entity that you will with JSON. This is because using JSON allows </w:t>
+      </w:r>
+      <w:ins w:id="95" w:author="Tom Anderson" w:date="2021-07-22T18:02:00Z">
+        <w:r>
+          <w:rPr>
+            <w:rFonts w:asciiTheme="minorHAnsi" w:hAnsiTheme="minorHAnsi" w:cstheme="minorHAnsi"/>
+            <w:w w:val="95"/>
+          </w:rPr>
+          <w:t>nested</w:t>
+        </w:r>
+      </w:ins>
+      <w:del w:id="96" w:author="Tom Anderson" w:date="2021-07-22T18:02:00Z">
+        <w:r>
+          <w:rPr>
+            <w:rFonts w:asciiTheme="minorHAnsi" w:hAnsiTheme="minorHAnsi" w:cstheme="minorHAnsi"/>
+            <w:w w:val="95"/>
+          </w:rPr>
+          <w:delText>us to nest</w:delText>
+        </w:r>
+      </w:del>
+      <w:r>
+        <w:rPr>
+          <w:rFonts w:asciiTheme="minorHAnsi" w:hAnsiTheme="minorHAnsi" w:cstheme="minorHAnsi"/>
+          <w:w w:val="95"/>
+        </w:rPr>
+        <w:t xml:space="preserve"> arrays and objects in</w:t>
+      </w:r>
+      <w:del w:id="97" w:author="Tom Anderson" w:date="2021-07-22T18:02:00Z">
+        <w:r>
+          <w:rPr>
+            <w:rFonts w:asciiTheme="minorHAnsi" w:hAnsiTheme="minorHAnsi" w:cstheme="minorHAnsi"/>
+            <w:w w:val="95"/>
+          </w:rPr>
+          <w:delText xml:space="preserve">to </w:delText>
+        </w:r>
+      </w:del>
+      <w:ins w:id="98" w:author="Tom Anderson" w:date="2021-07-22T18:02:00Z">
+        <w:r>
+          <w:rPr>
+            <w:rFonts w:asciiTheme="minorHAnsi" w:hAnsiTheme="minorHAnsi" w:cstheme="minorHAnsi"/>
+            <w:w w:val="95"/>
+          </w:rPr>
+          <w:t xml:space="preserve"> </w:t>
+        </w:r>
+      </w:ins>
+      <w:r>
+        <w:rPr>
+          <w:rFonts w:asciiTheme="minorHAnsi" w:hAnsiTheme="minorHAnsi" w:cstheme="minorHAnsi"/>
+          <w:w w:val="95"/>
+        </w:rPr>
+        <w:t>the JSON schema, and these arrays and objects cannot be represented in CSV</w:t>
+      </w:r>
+      <w:ins w:id="99" w:author="Tom Anderson" w:date="2021-07-22T18:02:00Z">
+        <w:r>
+          <w:rPr>
+            <w:rFonts w:asciiTheme="minorHAnsi" w:hAnsiTheme="minorHAnsi" w:cstheme="minorHAnsi"/>
+            <w:w w:val="95"/>
+          </w:rPr>
+          <w:t>, so</w:t>
+        </w:r>
+      </w:ins>
+      <w:del w:id="100" w:author="Tom Anderson" w:date="2021-07-22T18:02:00Z">
+        <w:r>
+          <w:rPr>
+            <w:rFonts w:asciiTheme="minorHAnsi" w:hAnsiTheme="minorHAnsi" w:cstheme="minorHAnsi"/>
+            <w:w w:val="95"/>
+          </w:rPr>
+          <w:delText xml:space="preserve">, and </w:delText>
+        </w:r>
+      </w:del>
+      <w:ins w:id="101" w:author="Tom Anderson" w:date="2021-07-22T18:02:00Z">
+        <w:r>
+          <w:rPr>
+            <w:rFonts w:asciiTheme="minorHAnsi" w:hAnsiTheme="minorHAnsi" w:cstheme="minorHAnsi"/>
+            <w:w w:val="95"/>
+          </w:rPr>
+          <w:t xml:space="preserve"> </w:t>
+        </w:r>
+      </w:ins>
+      <w:r>
+        <w:rPr>
+          <w:rFonts w:asciiTheme="minorHAnsi" w:hAnsiTheme="minorHAnsi" w:cstheme="minorHAnsi"/>
+          <w:w w:val="95"/>
+        </w:rPr>
+        <w:t>the data within these JSON objects and arrays are omitted in CSV. Sending data to eCX using POST requires the data payload to be in JSON</w:t>
+      </w:r>
+      <w:ins w:id="102" w:author="Tom Anderson" w:date="2021-07-22T18:03:00Z">
+        <w:r>
+          <w:rPr>
+            <w:rFonts w:asciiTheme="minorHAnsi" w:hAnsiTheme="minorHAnsi" w:cstheme="minorHAnsi"/>
+            <w:w w:val="95"/>
+          </w:rPr>
+          <w:t xml:space="preserve">.  </w:t>
+        </w:r>
+      </w:ins>
+      <w:del w:id="103" w:author="Tom Anderson" w:date="2021-07-22T18:03:00Z">
+        <w:r>
+          <w:rPr>
+            <w:rFonts w:asciiTheme="minorHAnsi" w:hAnsiTheme="minorHAnsi" w:cstheme="minorHAnsi"/>
+            <w:w w:val="95"/>
+          </w:rPr>
+          <w:delText xml:space="preserve">, </w:delText>
+        </w:r>
+      </w:del>
+      <w:r>
+        <w:rPr>
+          <w:rFonts w:asciiTheme="minorHAnsi" w:hAnsiTheme="minorHAnsi" w:cstheme="minorHAnsi"/>
+          <w:w w:val="95"/>
+        </w:rPr>
+        <w:t>CSV is not an option for POST.</w:t>
       </w:r>
     </w:p>
     <w:p>
@@ -2845,14 +3914,97 @@
         <w:rPr>
           <w:rFonts w:asciiTheme="minorHAnsi" w:hAnsiTheme="minorHAnsi" w:cstheme="minorHAnsi"/>
         </w:rPr>
-        <w:t xml:space="preserve">No final approval is necessary to submit phish data through the eCX UI, when your user account is </w:t>
+        <w:t>No final approval is necessary</w:t>
+      </w:r>
+      <w:ins w:id="104" w:author="Tom Anderson" w:date="2021-07-22T18:03:00Z">
+        <w:r>
+          <w:rPr>
+            <w:rFonts w:asciiTheme="minorHAnsi" w:hAnsiTheme="minorHAnsi" w:cstheme="minorHAnsi"/>
+          </w:rPr>
+          <w:t xml:space="preserve"> when submitting</w:t>
+        </w:r>
+      </w:ins>
+      <w:del w:id="105" w:author="Tom Anderson" w:date="2021-07-22T18:03:00Z">
+        <w:r>
+          <w:rPr>
+            <w:rFonts w:asciiTheme="minorHAnsi" w:hAnsiTheme="minorHAnsi" w:cstheme="minorHAnsi"/>
+          </w:rPr>
+          <w:delText xml:space="preserve"> to submit</w:delText>
+        </w:r>
+      </w:del>
+      <w:r>
+        <w:rPr>
+          <w:rFonts w:asciiTheme="minorHAnsi" w:hAnsiTheme="minorHAnsi" w:cstheme="minorHAnsi"/>
+        </w:rPr>
+        <w:t xml:space="preserve"> phish data through the </w:t>
+      </w:r>
+      <w:proofErr w:type="spellStart"/>
+      <w:r>
+        <w:rPr>
+          <w:rFonts w:asciiTheme="minorHAnsi" w:hAnsiTheme="minorHAnsi" w:cstheme="minorHAnsi"/>
+        </w:rPr>
+        <w:t>eCX</w:t>
+      </w:r>
+      <w:proofErr w:type="spellEnd"/>
+      <w:r>
+        <w:rPr>
+          <w:rFonts w:asciiTheme="minorHAnsi" w:hAnsiTheme="minorHAnsi" w:cstheme="minorHAnsi"/>
+        </w:rPr>
+        <w:t xml:space="preserve"> UI</w:t>
+      </w:r>
+      <w:ins w:id="106" w:author="Tom Anderson" w:date="2021-07-22T18:03:00Z">
+        <w:r>
+          <w:rPr>
+            <w:rFonts w:asciiTheme="minorHAnsi" w:hAnsiTheme="minorHAnsi" w:cstheme="minorHAnsi"/>
+          </w:rPr>
+          <w:t>.  W</w:t>
+        </w:r>
+      </w:ins>
+      <w:del w:id="107" w:author="Tom Anderson" w:date="2021-07-22T18:03:00Z">
+        <w:r>
+          <w:rPr>
+            <w:rFonts w:asciiTheme="minorHAnsi" w:hAnsiTheme="minorHAnsi" w:cstheme="minorHAnsi"/>
+          </w:rPr>
+          <w:delText>, w</w:delText>
+        </w:r>
+      </w:del>
+      <w:r>
+        <w:rPr>
+          <w:rFonts w:asciiTheme="minorHAnsi" w:hAnsiTheme="minorHAnsi" w:cstheme="minorHAnsi"/>
+        </w:rPr>
+        <w:t xml:space="preserve">hen your user account is </w:t>
       </w:r>
       <w:r>
         <w:rPr>
           <w:rFonts w:asciiTheme="minorHAnsi" w:hAnsiTheme="minorHAnsi" w:cstheme="minorHAnsi"/>
           <w:w w:val="95"/>
         </w:rPr>
-        <w:t>approved by the eCX administrators the system automatically gives you access into the phish module and enables you to submit phishing data via the UI.</w:t>
+        <w:t xml:space="preserve">approved by </w:t>
+      </w:r>
+      <w:del w:id="108" w:author="Tom Anderson" w:date="2021-07-22T18:03:00Z">
+        <w:r>
+          <w:rPr>
+            <w:rFonts w:asciiTheme="minorHAnsi" w:hAnsiTheme="minorHAnsi" w:cstheme="minorHAnsi"/>
+            <w:w w:val="95"/>
+          </w:rPr>
+          <w:delText xml:space="preserve">the </w:delText>
+        </w:r>
+      </w:del>
+      <w:proofErr w:type="spellStart"/>
+      <w:r>
+        <w:rPr>
+          <w:rFonts w:asciiTheme="minorHAnsi" w:hAnsiTheme="minorHAnsi" w:cstheme="minorHAnsi"/>
+          <w:w w:val="95"/>
+        </w:rPr>
+        <w:t>eCX</w:t>
+      </w:r>
+      <w:proofErr w:type="spellEnd"/>
+      <w:r>
+        <w:rPr>
+          <w:rFonts w:asciiTheme="minorHAnsi" w:hAnsiTheme="minorHAnsi" w:cstheme="minorHAnsi"/>
+          <w:w w:val="95"/>
+        </w:rPr>
+        <w:t xml:space="preserve"> administrators the system automatically gives you access into the phish module and enables you to submit phishing data via the UI.</w:t>
       </w:r>
     </w:p>
     <w:p>
@@ -2906,32 +4058,150 @@
         <w:rPr>
           <w:rFonts w:asciiTheme="minorHAnsi" w:hAnsiTheme="minorHAnsi" w:cstheme="minorHAnsi"/>
         </w:rPr>
-        <w:t xml:space="preserve">For every eCX API operation your eCX API Key will need to be sent in the request header within the </w:t>
-      </w:r>
+        <w:t>For every eCX API operation</w:t>
+      </w:r>
+      <w:ins w:id="109" w:author="Tom Anderson" w:date="2021-07-22T18:04:00Z">
+        <w:r>
+          <w:rPr>
+            <w:rFonts w:asciiTheme="minorHAnsi" w:hAnsiTheme="minorHAnsi" w:cstheme="minorHAnsi"/>
+          </w:rPr>
+          <w:t>,</w:t>
+        </w:r>
+      </w:ins>
+      <w:r>
+        <w:rPr>
+          <w:rFonts w:asciiTheme="minorHAnsi" w:hAnsiTheme="minorHAnsi" w:cstheme="minorHAnsi"/>
+        </w:rPr>
+        <w:t xml:space="preserve"> your eCX API Key will need to be sent in the request</w:t>
+      </w:r>
+      <w:ins w:id="110" w:author="Tom Anderson" w:date="2021-07-22T18:04:00Z">
+        <w:r>
+          <w:rPr>
+            <w:rFonts w:asciiTheme="minorHAnsi" w:hAnsiTheme="minorHAnsi" w:cstheme="minorHAnsi"/>
+          </w:rPr>
+          <w:t>’s Authorization</w:t>
+        </w:r>
+      </w:ins>
+      <w:r>
+        <w:rPr>
+          <w:rFonts w:asciiTheme="minorHAnsi" w:hAnsiTheme="minorHAnsi" w:cstheme="minorHAnsi"/>
+        </w:rPr>
+        <w:t xml:space="preserve"> header</w:t>
+      </w:r>
+      <w:del w:id="111" w:author="Tom Anderson" w:date="2021-07-22T18:04:00Z">
+        <w:r>
+          <w:rPr>
+            <w:rFonts w:asciiTheme="minorHAnsi" w:hAnsiTheme="minorHAnsi" w:cstheme="minorHAnsi"/>
+          </w:rPr>
+          <w:delText xml:space="preserve"> within the </w:delText>
+        </w:r>
+        <w:r>
+          <w:rPr>
+            <w:rFonts w:asciiTheme="minorHAnsi" w:hAnsiTheme="minorHAnsi" w:cstheme="minorHAnsi"/>
+            <w:w w:val="95"/>
+          </w:rPr>
+          <w:delText>Authorization key/value pair</w:delText>
+        </w:r>
+      </w:del>
       <w:r>
         <w:rPr>
           <w:rFonts w:asciiTheme="minorHAnsi" w:hAnsiTheme="minorHAnsi" w:cstheme="minorHAnsi"/>
           <w:w w:val="95"/>
         </w:rPr>
-        <w:t xml:space="preserve">Authorization key/value pair. </w:t>
-      </w:r>
-      <w:proofErr w:type="gramStart"/>
+        <w:t>.</w:t>
+      </w:r>
+      <w:ins w:id="112" w:author="Tom Anderson" w:date="2021-07-22T18:04:00Z">
+        <w:r>
+          <w:rPr>
+            <w:rFonts w:asciiTheme="minorHAnsi" w:hAnsiTheme="minorHAnsi" w:cstheme="minorHAnsi"/>
+            <w:w w:val="95"/>
+          </w:rPr>
+          <w:t xml:space="preserve"> </w:t>
+        </w:r>
+      </w:ins>
       <w:r>
         <w:rPr>
           <w:rFonts w:asciiTheme="minorHAnsi" w:hAnsiTheme="minorHAnsi" w:cstheme="minorHAnsi"/>
           <w:w w:val="95"/>
         </w:rPr>
-        <w:t>You’ll</w:t>
-      </w:r>
-      <w:proofErr w:type="gramEnd"/>
+        <w:t xml:space="preserve"> You’ll see this in the examples for every operation shown here.</w:t>
+      </w:r>
+      <w:ins w:id="113" w:author="Tom Anderson" w:date="2021-07-22T18:04:00Z">
+        <w:r>
+          <w:rPr>
+            <w:rFonts w:asciiTheme="minorHAnsi" w:hAnsiTheme="minorHAnsi" w:cstheme="minorHAnsi"/>
+            <w:w w:val="95"/>
+          </w:rPr>
+          <w:t xml:space="preserve"> </w:t>
+        </w:r>
+      </w:ins>
       <w:r>
         <w:rPr>
           <w:rFonts w:asciiTheme="minorHAnsi" w:hAnsiTheme="minorHAnsi" w:cstheme="minorHAnsi"/>
           <w:w w:val="95"/>
         </w:rPr>
-        <w:t xml:space="preserve"> see this in the examples for every operation shown here. Your eCX API Key is shown in eCX within your user profile, located at </w:t>
-      </w:r>
-      <w:hyperlink r:id="rId18">
+        <w:t xml:space="preserve"> Your eCX API Key is shown in </w:t>
+      </w:r>
+      <w:del w:id="114" w:author="Tom Anderson" w:date="2021-07-22T18:05:00Z">
+        <w:r>
+          <w:rPr>
+            <w:rFonts w:asciiTheme="minorHAnsi" w:hAnsiTheme="minorHAnsi" w:cstheme="minorHAnsi"/>
+            <w:w w:val="95"/>
+          </w:rPr>
+          <w:delText xml:space="preserve">eCX within </w:delText>
+        </w:r>
+      </w:del>
+      <w:r>
+        <w:rPr>
+          <w:rFonts w:asciiTheme="minorHAnsi" w:hAnsiTheme="minorHAnsi" w:cstheme="minorHAnsi"/>
+          <w:w w:val="95"/>
+        </w:rPr>
+        <w:t xml:space="preserve">your </w:t>
+      </w:r>
+      <w:proofErr w:type="spellStart"/>
+      <w:ins w:id="115" w:author="Tom Anderson" w:date="2021-07-22T18:05:00Z">
+        <w:r>
+          <w:rPr>
+            <w:rFonts w:asciiTheme="minorHAnsi" w:hAnsiTheme="minorHAnsi" w:cstheme="minorHAnsi"/>
+            <w:w w:val="95"/>
+          </w:rPr>
+          <w:t>eCX</w:t>
+        </w:r>
+        <w:proofErr w:type="spellEnd"/>
+        <w:r>
+          <w:rPr>
+            <w:rFonts w:asciiTheme="minorHAnsi" w:hAnsiTheme="minorHAnsi" w:cstheme="minorHAnsi"/>
+            <w:w w:val="95"/>
+          </w:rPr>
+          <w:t xml:space="preserve"> </w:t>
+        </w:r>
+      </w:ins>
+      <w:r>
+        <w:rPr>
+          <w:rFonts w:asciiTheme="minorHAnsi" w:hAnsiTheme="minorHAnsi" w:cstheme="minorHAnsi"/>
+          <w:w w:val="95"/>
+        </w:rPr>
+        <w:t xml:space="preserve">user profile, located at </w:t>
+      </w:r>
+      <w:r>
+        <w:fldChar w:fldCharType="begin"/>
+      </w:r>
+      <w:r>
+        <w:instrText xml:space="preserve"> HYPERLINK "https://ecrimex.net/users/update" \h </w:instrText>
+      </w:r>
+      <w:r>
+        <w:fldChar w:fldCharType="separate"/>
+      </w:r>
+      <w:r>
+        <w:rPr>
+          <w:rFonts w:asciiTheme="minorHAnsi" w:hAnsiTheme="minorHAnsi" w:cstheme="minorHAnsi"/>
+          <w:color w:val="0462C1"/>
+          <w:w w:val="95"/>
+          <w:u w:val="single" w:color="0462C1"/>
+        </w:rPr>
+        <w:t>https://ecrimex.net/users/update</w:t>
+      </w:r>
+      <w:del w:id="116" w:author="Tom Anderson" w:date="2021-07-22T18:06:00Z">
         <w:r>
           <w:rPr>
             <w:rFonts w:asciiTheme="minorHAnsi" w:hAnsiTheme="minorHAnsi" w:cstheme="minorHAnsi"/>
@@ -2939,15 +4209,126 @@
             <w:w w:val="95"/>
             <w:u w:val="single" w:color="0462C1"/>
           </w:rPr>
-          <w:t xml:space="preserve">https://ecrimex.net/users/update </w:t>
-        </w:r>
-      </w:hyperlink>
-      <w:r>
-        <w:rPr>
-          <w:rFonts w:asciiTheme="minorHAnsi" w:hAnsiTheme="minorHAnsi" w:cstheme="minorHAnsi"/>
+          <w:delText xml:space="preserve"> </w:delText>
+        </w:r>
+      </w:del>
+      <w:r>
+        <w:rPr>
+          <w:rFonts w:asciiTheme="minorHAnsi" w:hAnsiTheme="minorHAnsi" w:cstheme="minorHAnsi"/>
+          <w:color w:val="0462C1"/>
           <w:w w:val="95"/>
-        </w:rPr>
-        <w:t>The eCX API Key is tied to your user account, and allows eCX to determine what access rights you have available.</w:t>
+          <w:u w:val="single" w:color="0462C1"/>
+        </w:rPr>
+        <w:fldChar w:fldCharType="end"/>
+      </w:r>
+      <w:ins w:id="117" w:author="Tom Anderson" w:date="2021-07-22T18:06:00Z">
+        <w:r>
+          <w:rPr>
+            <w:rFonts w:asciiTheme="minorHAnsi" w:hAnsiTheme="minorHAnsi" w:cstheme="minorHAnsi"/>
+            <w:color w:val="0462C1"/>
+            <w:w w:val="95"/>
+            <w:u w:val="single" w:color="0462C1"/>
+          </w:rPr>
+          <w:t xml:space="preserve">  Your</w:t>
+        </w:r>
+      </w:ins>
+      <w:del w:id="118" w:author="Tom Anderson" w:date="2021-07-22T18:06:00Z">
+        <w:r>
+          <w:rPr>
+            <w:rFonts w:asciiTheme="minorHAnsi" w:hAnsiTheme="minorHAnsi" w:cstheme="minorHAnsi"/>
+            <w:w w:val="95"/>
+          </w:rPr>
+          <w:delText>The</w:delText>
+        </w:r>
+      </w:del>
+      <w:r>
+        <w:rPr>
+          <w:rFonts w:asciiTheme="minorHAnsi" w:hAnsiTheme="minorHAnsi" w:cstheme="minorHAnsi"/>
+          <w:w w:val="95"/>
+        </w:rPr>
+        <w:t xml:space="preserve"> </w:t>
+      </w:r>
+      <w:proofErr w:type="spellStart"/>
+      <w:r>
+        <w:rPr>
+          <w:rFonts w:asciiTheme="minorHAnsi" w:hAnsiTheme="minorHAnsi" w:cstheme="minorHAnsi"/>
+          <w:w w:val="95"/>
+        </w:rPr>
+        <w:t>eCX</w:t>
+      </w:r>
+      <w:proofErr w:type="spellEnd"/>
+      <w:r>
+        <w:rPr>
+          <w:rFonts w:asciiTheme="minorHAnsi" w:hAnsiTheme="minorHAnsi" w:cstheme="minorHAnsi"/>
+          <w:w w:val="95"/>
+        </w:rPr>
+        <w:t xml:space="preserve"> API Key is tied to your user account</w:t>
+      </w:r>
+      <w:del w:id="119" w:author="Tom Anderson" w:date="2021-07-22T18:05:00Z">
+        <w:r>
+          <w:rPr>
+            <w:rFonts w:asciiTheme="minorHAnsi" w:hAnsiTheme="minorHAnsi" w:cstheme="minorHAnsi"/>
+            <w:w w:val="95"/>
+          </w:rPr>
+          <w:delText>,</w:delText>
+        </w:r>
+      </w:del>
+      <w:r>
+        <w:rPr>
+          <w:rFonts w:asciiTheme="minorHAnsi" w:hAnsiTheme="minorHAnsi" w:cstheme="minorHAnsi"/>
+          <w:w w:val="95"/>
+        </w:rPr>
+        <w:t xml:space="preserve"> and allows eCX to determine wh</w:t>
+      </w:r>
+      <w:ins w:id="120" w:author="Tom Anderson" w:date="2021-07-22T18:06:00Z">
+        <w:r>
+          <w:rPr>
+            <w:rFonts w:asciiTheme="minorHAnsi" w:hAnsiTheme="minorHAnsi" w:cstheme="minorHAnsi"/>
+            <w:w w:val="95"/>
+          </w:rPr>
+          <w:t>ich</w:t>
+        </w:r>
+      </w:ins>
+      <w:del w:id="121" w:author="Tom Anderson" w:date="2021-07-22T18:06:00Z">
+        <w:r>
+          <w:rPr>
+            <w:rFonts w:asciiTheme="minorHAnsi" w:hAnsiTheme="minorHAnsi" w:cstheme="minorHAnsi"/>
+            <w:w w:val="95"/>
+          </w:rPr>
+          <w:delText>at</w:delText>
+        </w:r>
+      </w:del>
+      <w:r>
+        <w:rPr>
+          <w:rFonts w:asciiTheme="minorHAnsi" w:hAnsiTheme="minorHAnsi" w:cstheme="minorHAnsi"/>
+          <w:w w:val="95"/>
+        </w:rPr>
+        <w:t xml:space="preserve"> access rights </w:t>
+      </w:r>
+      <w:ins w:id="122" w:author="Tom Anderson" w:date="2021-07-22T18:06:00Z">
+        <w:r>
+          <w:rPr>
+            <w:rFonts w:asciiTheme="minorHAnsi" w:hAnsiTheme="minorHAnsi" w:cstheme="minorHAnsi"/>
+            <w:w w:val="95"/>
+          </w:rPr>
+          <w:t>are available to you</w:t>
+        </w:r>
+      </w:ins>
+      <w:del w:id="123" w:author="Tom Anderson" w:date="2021-07-22T18:06:00Z">
+        <w:r>
+          <w:rPr>
+            <w:rFonts w:asciiTheme="minorHAnsi" w:hAnsiTheme="minorHAnsi" w:cstheme="minorHAnsi"/>
+            <w:w w:val="95"/>
+          </w:rPr>
+          <w:delText>you have available</w:delText>
+        </w:r>
+      </w:del>
+      <w:r>
+        <w:rPr>
+          <w:rFonts w:asciiTheme="minorHAnsi" w:hAnsiTheme="minorHAnsi" w:cstheme="minorHAnsi"/>
+          <w:w w:val="95"/>
+        </w:rPr>
+        <w:t>.</w:t>
       </w:r>
     </w:p>
     <w:p>
@@ -2973,12 +4354,34 @@
       <w:pPr>
         <w:pStyle w:val="Heading1"/>
       </w:pPr>
+      <w:del w:id="124" w:author="Tom Anderson" w:date="2021-07-22T18:06:00Z">
+        <w:r>
+          <w:rPr>
+            <w:w w:val="75"/>
+          </w:rPr>
+          <w:delText xml:space="preserve">RESULT  </w:delText>
+        </w:r>
+      </w:del>
       <w:proofErr w:type="gramStart"/>
+      <w:ins w:id="125" w:author="Tom Anderson" w:date="2021-07-22T18:06:00Z">
+        <w:r>
+          <w:rPr>
+            <w:w w:val="75"/>
+          </w:rPr>
+          <w:t>RESPONSE</w:t>
+        </w:r>
+        <w:r>
+          <w:rPr>
+            <w:w w:val="75"/>
+          </w:rPr>
+          <w:t xml:space="preserve">  </w:t>
+        </w:r>
+      </w:ins>
       <w:r>
         <w:rPr>
           <w:w w:val="75"/>
         </w:rPr>
-        <w:t>RESULT  CODES</w:t>
+        <w:t>CODES</w:t>
       </w:r>
       <w:proofErr w:type="gramEnd"/>
     </w:p>
@@ -3007,7 +4410,71 @@
           <w:rFonts w:asciiTheme="minorHAnsi" w:hAnsiTheme="minorHAnsi" w:cstheme="minorHAnsi"/>
           <w:w w:val="95"/>
         </w:rPr>
-        <w:t xml:space="preserve">Following standardized API interaction protocols, the eCX API returns result codes indicating success or </w:t>
+        <w:t xml:space="preserve">Following standardized API interaction protocols, the </w:t>
+      </w:r>
+      <w:proofErr w:type="spellStart"/>
+      <w:r>
+        <w:rPr>
+          <w:rFonts w:asciiTheme="minorHAnsi" w:hAnsiTheme="minorHAnsi" w:cstheme="minorHAnsi"/>
+          <w:w w:val="95"/>
+        </w:rPr>
+        <w:t>eCX</w:t>
+      </w:r>
+      <w:proofErr w:type="spellEnd"/>
+      <w:r>
+        <w:rPr>
+          <w:rFonts w:asciiTheme="minorHAnsi" w:hAnsiTheme="minorHAnsi" w:cstheme="minorHAnsi"/>
+          <w:w w:val="95"/>
+        </w:rPr>
+        <w:t xml:space="preserve"> API returns</w:t>
+      </w:r>
+      <w:ins w:id="126" w:author="Tom Anderson" w:date="2021-07-22T18:07:00Z">
+        <w:r>
+          <w:rPr>
+            <w:rFonts w:asciiTheme="minorHAnsi" w:hAnsiTheme="minorHAnsi" w:cstheme="minorHAnsi"/>
+            <w:w w:val="95"/>
+          </w:rPr>
+          <w:t xml:space="preserve"> standard HTTP</w:t>
+        </w:r>
+      </w:ins>
+      <w:r>
+        <w:rPr>
+          <w:rFonts w:asciiTheme="minorHAnsi" w:hAnsiTheme="minorHAnsi" w:cstheme="minorHAnsi"/>
+          <w:w w:val="95"/>
+        </w:rPr>
+        <w:t xml:space="preserve"> </w:t>
+      </w:r>
+      <w:del w:id="127" w:author="Tom Anderson" w:date="2021-07-22T18:07:00Z">
+        <w:r>
+          <w:rPr>
+            <w:rFonts w:asciiTheme="minorHAnsi" w:hAnsiTheme="minorHAnsi" w:cstheme="minorHAnsi"/>
+            <w:w w:val="95"/>
+          </w:rPr>
+          <w:delText xml:space="preserve">result </w:delText>
+        </w:r>
+      </w:del>
+      <w:ins w:id="128" w:author="Tom Anderson" w:date="2021-07-22T18:07:00Z">
+        <w:r>
+          <w:rPr>
+            <w:rFonts w:asciiTheme="minorHAnsi" w:hAnsiTheme="minorHAnsi" w:cstheme="minorHAnsi"/>
+            <w:w w:val="95"/>
+          </w:rPr>
+          <w:t>response</w:t>
+        </w:r>
+        <w:r>
+          <w:rPr>
+            <w:rFonts w:asciiTheme="minorHAnsi" w:hAnsiTheme="minorHAnsi" w:cstheme="minorHAnsi"/>
+            <w:w w:val="95"/>
+          </w:rPr>
+          <w:t xml:space="preserve"> </w:t>
+        </w:r>
+      </w:ins>
+      <w:r>
+        <w:rPr>
+          <w:rFonts w:asciiTheme="minorHAnsi" w:hAnsiTheme="minorHAnsi" w:cstheme="minorHAnsi"/>
+          <w:w w:val="95"/>
+        </w:rPr>
+        <w:t xml:space="preserve">codes indicating success or </w:t>
       </w:r>
       <w:r>
         <w:rPr>
@@ -3015,47 +4482,376 @@
         </w:rPr>
         <w:t xml:space="preserve">failure of each operation. </w:t>
       </w:r>
+      <w:ins w:id="129" w:author="Tom Anderson" w:date="2021-07-22T18:08:00Z">
+        <w:r>
+          <w:rPr>
+            <w:rFonts w:asciiTheme="minorHAnsi" w:hAnsiTheme="minorHAnsi" w:cstheme="minorHAnsi"/>
+          </w:rPr>
+          <w:t xml:space="preserve"> </w:t>
+        </w:r>
+      </w:ins>
       <w:r>
         <w:rPr>
           <w:rFonts w:asciiTheme="minorHAnsi" w:hAnsiTheme="minorHAnsi" w:cstheme="minorHAnsi"/>
           <w:w w:val="95"/>
         </w:rPr>
-        <w:t xml:space="preserve">Users should always be checking </w:t>
-      </w:r>
-      <w:r>
-        <w:rPr>
-          <w:rFonts w:asciiTheme="minorHAnsi" w:hAnsiTheme="minorHAnsi" w:cstheme="minorHAnsi"/>
-        </w:rPr>
-        <w:t xml:space="preserve">for the expected result code from the operation, and handling situations where the result code returned </w:t>
-      </w:r>
+        <w:t xml:space="preserve">Users should always </w:t>
+      </w:r>
+      <w:del w:id="130" w:author="Tom Anderson" w:date="2021-07-22T18:07:00Z">
+        <w:r>
+          <w:rPr>
+            <w:rFonts w:asciiTheme="minorHAnsi" w:hAnsiTheme="minorHAnsi" w:cstheme="minorHAnsi"/>
+            <w:w w:val="95"/>
+          </w:rPr>
+          <w:delText xml:space="preserve">be </w:delText>
+        </w:r>
+      </w:del>
+      <w:proofErr w:type="spellStart"/>
       <w:r>
         <w:rPr>
           <w:rFonts w:asciiTheme="minorHAnsi" w:hAnsiTheme="minorHAnsi" w:cstheme="minorHAnsi"/>
           <w:w w:val="95"/>
         </w:rPr>
-        <w:t xml:space="preserve">indicates that the operation failed. The eCX API reports back result codes for malformed queries, missing </w:t>
-      </w:r>
-      <w:r>
-        <w:rPr>
-          <w:rFonts w:asciiTheme="minorHAnsi" w:hAnsiTheme="minorHAnsi" w:cstheme="minorHAnsi"/>
-        </w:rPr>
-        <w:t xml:space="preserve">API token keys, and problems found in other operational states. </w:t>
-      </w:r>
-      <w:proofErr w:type="gramStart"/>
-      <w:r>
-        <w:rPr>
-          <w:rFonts w:asciiTheme="minorHAnsi" w:hAnsiTheme="minorHAnsi" w:cstheme="minorHAnsi"/>
-        </w:rPr>
-        <w:t>All of</w:t>
-      </w:r>
-      <w:proofErr w:type="gramEnd"/>
-      <w:r>
-        <w:rPr>
-          <w:rFonts w:asciiTheme="minorHAnsi" w:hAnsiTheme="minorHAnsi" w:cstheme="minorHAnsi"/>
-        </w:rPr>
-        <w:t xml:space="preserve"> this information on both eCX API use and possible response codes are outlined in the eCX API documentation located at </w:t>
-      </w:r>
-      <w:hyperlink r:id="rId19">
+        <w:t>checki</w:t>
+      </w:r>
+      <w:proofErr w:type="spellEnd"/>
+      <w:del w:id="131" w:author="Tom Anderson" w:date="2021-07-22T18:07:00Z">
+        <w:r>
+          <w:rPr>
+            <w:rFonts w:asciiTheme="minorHAnsi" w:hAnsiTheme="minorHAnsi" w:cstheme="minorHAnsi"/>
+            <w:w w:val="95"/>
+          </w:rPr>
+          <w:delText>ng</w:delText>
+        </w:r>
+      </w:del>
+      <w:r>
+        <w:rPr>
+          <w:rFonts w:asciiTheme="minorHAnsi" w:hAnsiTheme="minorHAnsi" w:cstheme="minorHAnsi"/>
+          <w:w w:val="95"/>
+        </w:rPr>
+        <w:t xml:space="preserve"> </w:t>
+      </w:r>
+      <w:r>
+        <w:rPr>
+          <w:rFonts w:asciiTheme="minorHAnsi" w:hAnsiTheme="minorHAnsi" w:cstheme="minorHAnsi"/>
+        </w:rPr>
+        <w:t xml:space="preserve">for the expected </w:t>
+      </w:r>
+      <w:del w:id="132" w:author="Tom Anderson" w:date="2021-07-22T18:07:00Z">
+        <w:r>
+          <w:rPr>
+            <w:rFonts w:asciiTheme="minorHAnsi" w:hAnsiTheme="minorHAnsi" w:cstheme="minorHAnsi"/>
+          </w:rPr>
+          <w:delText>result</w:delText>
+        </w:r>
+      </w:del>
+      <w:ins w:id="133" w:author="Tom Anderson" w:date="2021-07-22T18:07:00Z">
+        <w:r>
+          <w:rPr>
+            <w:rFonts w:asciiTheme="minorHAnsi" w:hAnsiTheme="minorHAnsi" w:cstheme="minorHAnsi"/>
+          </w:rPr>
+          <w:t>response</w:t>
+        </w:r>
+      </w:ins>
+      <w:r>
+        <w:rPr>
+          <w:rFonts w:asciiTheme="minorHAnsi" w:hAnsiTheme="minorHAnsi" w:cstheme="minorHAnsi"/>
+        </w:rPr>
+        <w:t xml:space="preserve"> code from </w:t>
+      </w:r>
+      <w:del w:id="134" w:author="Tom Anderson" w:date="2021-07-22T18:07:00Z">
+        <w:r>
+          <w:rPr>
+            <w:rFonts w:asciiTheme="minorHAnsi" w:hAnsiTheme="minorHAnsi" w:cstheme="minorHAnsi"/>
+          </w:rPr>
+          <w:delText>the</w:delText>
+        </w:r>
+      </w:del>
+      <w:ins w:id="135" w:author="Tom Anderson" w:date="2021-07-22T18:07:00Z">
+        <w:r>
+          <w:rPr>
+            <w:rFonts w:asciiTheme="minorHAnsi" w:hAnsiTheme="minorHAnsi" w:cstheme="minorHAnsi"/>
+          </w:rPr>
+          <w:t>each</w:t>
+        </w:r>
+      </w:ins>
+      <w:r>
+        <w:rPr>
+          <w:rFonts w:asciiTheme="minorHAnsi" w:hAnsiTheme="minorHAnsi" w:cstheme="minorHAnsi"/>
+        </w:rPr>
+        <w:t xml:space="preserve"> operation</w:t>
+      </w:r>
+      <w:del w:id="136" w:author="Tom Anderson" w:date="2021-07-22T18:07:00Z">
+        <w:r>
+          <w:rPr>
+            <w:rFonts w:asciiTheme="minorHAnsi" w:hAnsiTheme="minorHAnsi" w:cstheme="minorHAnsi"/>
+          </w:rPr>
+          <w:delText>,</w:delText>
+        </w:r>
+      </w:del>
+      <w:r>
+        <w:rPr>
+          <w:rFonts w:asciiTheme="minorHAnsi" w:hAnsiTheme="minorHAnsi" w:cstheme="minorHAnsi"/>
+        </w:rPr>
+        <w:t xml:space="preserve"> and hand</w:t>
+      </w:r>
+      <w:ins w:id="137" w:author="Tom Anderson" w:date="2021-07-22T18:07:00Z">
+        <w:r>
+          <w:rPr>
+            <w:rFonts w:asciiTheme="minorHAnsi" w:hAnsiTheme="minorHAnsi" w:cstheme="minorHAnsi"/>
+          </w:rPr>
+          <w:t>l</w:t>
+        </w:r>
+      </w:ins>
+      <w:del w:id="138" w:author="Tom Anderson" w:date="2021-07-22T18:07:00Z">
+        <w:r>
+          <w:rPr>
+            <w:rFonts w:asciiTheme="minorHAnsi" w:hAnsiTheme="minorHAnsi" w:cstheme="minorHAnsi"/>
+          </w:rPr>
+          <w:delText>ling</w:delText>
+        </w:r>
+      </w:del>
+      <w:ins w:id="139" w:author="Tom Anderson" w:date="2021-07-22T18:07:00Z">
+        <w:r>
+          <w:rPr>
+            <w:rFonts w:asciiTheme="minorHAnsi" w:hAnsiTheme="minorHAnsi" w:cstheme="minorHAnsi"/>
+          </w:rPr>
+          <w:t>e</w:t>
+        </w:r>
+      </w:ins>
+      <w:r>
+        <w:rPr>
+          <w:rFonts w:asciiTheme="minorHAnsi" w:hAnsiTheme="minorHAnsi" w:cstheme="minorHAnsi"/>
+        </w:rPr>
+        <w:t xml:space="preserve"> situations where the </w:t>
+      </w:r>
+      <w:ins w:id="140" w:author="Tom Anderson" w:date="2021-07-22T18:07:00Z">
+        <w:r>
+          <w:rPr>
+            <w:rFonts w:asciiTheme="minorHAnsi" w:hAnsiTheme="minorHAnsi" w:cstheme="minorHAnsi"/>
+          </w:rPr>
+          <w:t>response</w:t>
+        </w:r>
+      </w:ins>
+      <w:del w:id="141" w:author="Tom Anderson" w:date="2021-07-22T18:07:00Z">
+        <w:r>
+          <w:rPr>
+            <w:rFonts w:asciiTheme="minorHAnsi" w:hAnsiTheme="minorHAnsi" w:cstheme="minorHAnsi"/>
+          </w:rPr>
+          <w:delText>result</w:delText>
+        </w:r>
+      </w:del>
+      <w:r>
+        <w:rPr>
+          <w:rFonts w:asciiTheme="minorHAnsi" w:hAnsiTheme="minorHAnsi" w:cstheme="minorHAnsi"/>
+        </w:rPr>
+        <w:t xml:space="preserve"> code returned </w:t>
+      </w:r>
+      <w:r>
+        <w:rPr>
+          <w:rFonts w:asciiTheme="minorHAnsi" w:hAnsiTheme="minorHAnsi" w:cstheme="minorHAnsi"/>
+          <w:w w:val="95"/>
+        </w:rPr>
+        <w:t xml:space="preserve">indicates that the operation failed. </w:t>
+      </w:r>
+      <w:ins w:id="142" w:author="Tom Anderson" w:date="2021-07-22T18:08:00Z">
+        <w:r>
+          <w:rPr>
+            <w:rFonts w:asciiTheme="minorHAnsi" w:hAnsiTheme="minorHAnsi" w:cstheme="minorHAnsi"/>
+            <w:w w:val="95"/>
+          </w:rPr>
+          <w:t xml:space="preserve"> </w:t>
+        </w:r>
+      </w:ins>
+      <w:r>
+        <w:rPr>
+          <w:rFonts w:asciiTheme="minorHAnsi" w:hAnsiTheme="minorHAnsi" w:cstheme="minorHAnsi"/>
+          <w:w w:val="95"/>
+        </w:rPr>
+        <w:t xml:space="preserve">The </w:t>
+      </w:r>
+      <w:proofErr w:type="spellStart"/>
+      <w:r>
+        <w:rPr>
+          <w:rFonts w:asciiTheme="minorHAnsi" w:hAnsiTheme="minorHAnsi" w:cstheme="minorHAnsi"/>
+          <w:w w:val="95"/>
+        </w:rPr>
+        <w:t>eCX</w:t>
+      </w:r>
+      <w:proofErr w:type="spellEnd"/>
+      <w:r>
+        <w:rPr>
+          <w:rFonts w:asciiTheme="minorHAnsi" w:hAnsiTheme="minorHAnsi" w:cstheme="minorHAnsi"/>
+          <w:w w:val="95"/>
+        </w:rPr>
+        <w:t xml:space="preserve"> API </w:t>
+      </w:r>
+      <w:ins w:id="143" w:author="Tom Anderson" w:date="2021-07-22T18:08:00Z">
+        <w:r>
+          <w:rPr>
+            <w:rFonts w:asciiTheme="minorHAnsi" w:hAnsiTheme="minorHAnsi" w:cstheme="minorHAnsi"/>
+            <w:w w:val="95"/>
+          </w:rPr>
+          <w:t xml:space="preserve">returns response </w:t>
+        </w:r>
+      </w:ins>
+      <w:del w:id="144" w:author="Tom Anderson" w:date="2021-07-22T18:08:00Z">
+        <w:r>
+          <w:rPr>
+            <w:rFonts w:asciiTheme="minorHAnsi" w:hAnsiTheme="minorHAnsi" w:cstheme="minorHAnsi"/>
+            <w:w w:val="95"/>
+          </w:rPr>
+          <w:delText xml:space="preserve">reports back result </w:delText>
+        </w:r>
+      </w:del>
+      <w:r>
+        <w:rPr>
+          <w:rFonts w:asciiTheme="minorHAnsi" w:hAnsiTheme="minorHAnsi" w:cstheme="minorHAnsi"/>
+          <w:w w:val="95"/>
+        </w:rPr>
+        <w:t xml:space="preserve">codes for malformed queries, missing </w:t>
+      </w:r>
+      <w:r>
+        <w:rPr>
+          <w:rFonts w:asciiTheme="minorHAnsi" w:hAnsiTheme="minorHAnsi" w:cstheme="minorHAnsi"/>
+        </w:rPr>
+        <w:t>API token keys, and</w:t>
+      </w:r>
+      <w:ins w:id="145" w:author="Tom Anderson" w:date="2021-07-22T18:08:00Z">
+        <w:r>
+          <w:rPr>
+            <w:rFonts w:asciiTheme="minorHAnsi" w:hAnsiTheme="minorHAnsi" w:cstheme="minorHAnsi"/>
+          </w:rPr>
+          <w:t xml:space="preserve"> other</w:t>
+        </w:r>
+      </w:ins>
+      <w:r>
+        <w:rPr>
+          <w:rFonts w:asciiTheme="minorHAnsi" w:hAnsiTheme="minorHAnsi" w:cstheme="minorHAnsi"/>
+        </w:rPr>
+        <w:t xml:space="preserve"> problems</w:t>
+      </w:r>
+      <w:del w:id="146" w:author="Tom Anderson" w:date="2021-07-22T18:08:00Z">
+        <w:r>
+          <w:rPr>
+            <w:rFonts w:asciiTheme="minorHAnsi" w:hAnsiTheme="minorHAnsi" w:cstheme="minorHAnsi"/>
+          </w:rPr>
+          <w:delText xml:space="preserve"> found in other operational states</w:delText>
+        </w:r>
+      </w:del>
+      <w:r>
+        <w:rPr>
+          <w:rFonts w:asciiTheme="minorHAnsi" w:hAnsiTheme="minorHAnsi" w:cstheme="minorHAnsi"/>
+        </w:rPr>
+        <w:t xml:space="preserve">. </w:t>
+      </w:r>
+      <w:ins w:id="147" w:author="Tom Anderson" w:date="2021-07-22T18:08:00Z">
+        <w:r>
+          <w:rPr>
+            <w:rFonts w:asciiTheme="minorHAnsi" w:hAnsiTheme="minorHAnsi" w:cstheme="minorHAnsi"/>
+          </w:rPr>
+          <w:t xml:space="preserve"> </w:t>
+        </w:r>
+      </w:ins>
+      <w:r>
+        <w:rPr>
+          <w:rFonts w:asciiTheme="minorHAnsi" w:hAnsiTheme="minorHAnsi" w:cstheme="minorHAnsi"/>
+        </w:rPr>
+        <w:t>All of this information</w:t>
+      </w:r>
+      <w:ins w:id="148" w:author="Tom Anderson" w:date="2021-07-22T18:09:00Z">
+        <w:r>
+          <w:rPr>
+            <w:rFonts w:asciiTheme="minorHAnsi" w:hAnsiTheme="minorHAnsi" w:cstheme="minorHAnsi"/>
+          </w:rPr>
+          <w:t>,</w:t>
+        </w:r>
+      </w:ins>
+      <w:r>
+        <w:rPr>
+          <w:rFonts w:asciiTheme="minorHAnsi" w:hAnsiTheme="minorHAnsi" w:cstheme="minorHAnsi"/>
+        </w:rPr>
+        <w:t xml:space="preserve"> on </w:t>
+      </w:r>
+      <w:del w:id="149" w:author="Tom Anderson" w:date="2021-07-22T18:09:00Z">
+        <w:r>
+          <w:rPr>
+            <w:rFonts w:asciiTheme="minorHAnsi" w:hAnsiTheme="minorHAnsi" w:cstheme="minorHAnsi"/>
+          </w:rPr>
+          <w:delText xml:space="preserve">both </w:delText>
+        </w:r>
+      </w:del>
+      <w:proofErr w:type="spellStart"/>
+      <w:r>
+        <w:rPr>
+          <w:rFonts w:asciiTheme="minorHAnsi" w:hAnsiTheme="minorHAnsi" w:cstheme="minorHAnsi"/>
+        </w:rPr>
+        <w:t>eCX</w:t>
+      </w:r>
+      <w:proofErr w:type="spellEnd"/>
+      <w:r>
+        <w:rPr>
+          <w:rFonts w:asciiTheme="minorHAnsi" w:hAnsiTheme="minorHAnsi" w:cstheme="minorHAnsi"/>
+        </w:rPr>
+        <w:t xml:space="preserve"> API use and </w:t>
+      </w:r>
+      <w:del w:id="150" w:author="Tom Anderson" w:date="2021-07-22T18:09:00Z">
+        <w:r>
+          <w:rPr>
+            <w:rFonts w:asciiTheme="minorHAnsi" w:hAnsiTheme="minorHAnsi" w:cstheme="minorHAnsi"/>
+          </w:rPr>
+          <w:delText xml:space="preserve">possible </w:delText>
+        </w:r>
+      </w:del>
+      <w:r>
+        <w:rPr>
+          <w:rFonts w:asciiTheme="minorHAnsi" w:hAnsiTheme="minorHAnsi" w:cstheme="minorHAnsi"/>
+        </w:rPr>
+        <w:t>response codes</w:t>
+      </w:r>
+      <w:ins w:id="151" w:author="Tom Anderson" w:date="2021-07-22T18:09:00Z">
+        <w:r>
+          <w:rPr>
+            <w:rFonts w:asciiTheme="minorHAnsi" w:hAnsiTheme="minorHAnsi" w:cstheme="minorHAnsi"/>
+          </w:rPr>
+          <w:t>,</w:t>
+        </w:r>
+      </w:ins>
+      <w:r>
+        <w:rPr>
+          <w:rFonts w:asciiTheme="minorHAnsi" w:hAnsiTheme="minorHAnsi" w:cstheme="minorHAnsi"/>
+        </w:rPr>
+        <w:t xml:space="preserve"> </w:t>
+      </w:r>
+      <w:del w:id="152" w:author="Tom Anderson" w:date="2021-07-22T18:09:00Z">
+        <w:r>
+          <w:rPr>
+            <w:rFonts w:asciiTheme="minorHAnsi" w:hAnsiTheme="minorHAnsi" w:cstheme="minorHAnsi"/>
+          </w:rPr>
+          <w:delText xml:space="preserve">are </w:delText>
+        </w:r>
+      </w:del>
+      <w:ins w:id="153" w:author="Tom Anderson" w:date="2021-07-22T18:09:00Z">
+        <w:r>
+          <w:rPr>
+            <w:rFonts w:asciiTheme="minorHAnsi" w:hAnsiTheme="minorHAnsi" w:cstheme="minorHAnsi"/>
+          </w:rPr>
+          <w:t>is</w:t>
+        </w:r>
+        <w:r>
+          <w:rPr>
+            <w:rFonts w:asciiTheme="minorHAnsi" w:hAnsiTheme="minorHAnsi" w:cstheme="minorHAnsi"/>
+          </w:rPr>
+          <w:t xml:space="preserve"> </w:t>
+        </w:r>
+      </w:ins>
+      <w:r>
+        <w:rPr>
+          <w:rFonts w:asciiTheme="minorHAnsi" w:hAnsiTheme="minorHAnsi" w:cstheme="minorHAnsi"/>
+        </w:rPr>
+        <w:t xml:space="preserve">outlined in the eCX API documentation located at </w:t>
+      </w:r>
+      <w:hyperlink r:id="rId18">
         <w:r>
           <w:rPr>
             <w:rFonts w:asciiTheme="minorHAnsi" w:hAnsiTheme="minorHAnsi" w:cstheme="minorHAnsi"/>
@@ -3102,10 +4898,17 @@
         <w:pStyle w:val="BodyText"/>
         <w:spacing w:before="197" w:line="273" w:lineRule="auto"/>
         <w:ind w:right="206"/>
-        <w:jc w:val="both"/>
-        <w:rPr>
-          <w:rFonts w:asciiTheme="minorHAnsi" w:hAnsiTheme="minorHAnsi" w:cstheme="minorHAnsi"/>
-        </w:rPr>
+        <w:rPr>
+          <w:rFonts w:asciiTheme="minorHAnsi" w:hAnsiTheme="minorHAnsi" w:cstheme="minorHAnsi"/>
+        </w:rPr>
+        <w:pPrChange w:id="154" w:author="Tom Anderson" w:date="2021-07-22T18:10:00Z">
+          <w:pPr>
+            <w:pStyle w:val="BodyText"/>
+            <w:spacing w:before="197" w:line="273" w:lineRule="auto"/>
+            <w:ind w:right="206"/>
+            <w:jc w:val="both"/>
+          </w:pPr>
+        </w:pPrChange>
       </w:pPr>
       <w:r>
         <w:rPr>
@@ -3123,12 +4926,112 @@
         <w:t>OpenAPI</w:t>
       </w:r>
       <w:proofErr w:type="spellEnd"/>
+      <w:del w:id="155" w:author="Tom Anderson" w:date="2021-07-22T18:09:00Z">
+        <w:r>
+          <w:rPr>
+            <w:rFonts w:asciiTheme="minorHAnsi" w:hAnsiTheme="minorHAnsi" w:cstheme="minorHAnsi"/>
+            <w:w w:val="95"/>
+          </w:rPr>
+          <w:delText xml:space="preserve"> (formerly Swagger)</w:delText>
+        </w:r>
+      </w:del>
       <w:r>
         <w:rPr>
           <w:rFonts w:asciiTheme="minorHAnsi" w:hAnsiTheme="minorHAnsi" w:cstheme="minorHAnsi"/>
           <w:w w:val="95"/>
         </w:rPr>
-        <w:t xml:space="preserve"> (formerly Swagger) format. There is even an eCX API documentation option that will dump out the API docs in </w:t>
+        <w:t xml:space="preserve"> format. There is </w:t>
+      </w:r>
+      <w:del w:id="156" w:author="Tom Anderson" w:date="2021-07-22T18:10:00Z">
+        <w:r>
+          <w:rPr>
+            <w:rFonts w:asciiTheme="minorHAnsi" w:hAnsiTheme="minorHAnsi" w:cstheme="minorHAnsi"/>
+            <w:w w:val="95"/>
+          </w:rPr>
+          <w:delText xml:space="preserve">even an </w:delText>
+        </w:r>
+      </w:del>
+      <w:ins w:id="157" w:author="Tom Anderson" w:date="2021-07-22T18:11:00Z">
+        <w:r>
+          <w:rPr>
+            <w:rFonts w:asciiTheme="minorHAnsi" w:hAnsiTheme="minorHAnsi" w:cstheme="minorHAnsi"/>
+            <w:w w:val="95"/>
+          </w:rPr>
+          <w:t xml:space="preserve">an </w:t>
+        </w:r>
+      </w:ins>
+      <w:del w:id="158" w:author="Tom Anderson" w:date="2021-07-22T18:11:00Z">
+        <w:r>
+          <w:rPr>
+            <w:rFonts w:asciiTheme="minorHAnsi" w:hAnsiTheme="minorHAnsi" w:cstheme="minorHAnsi"/>
+            <w:w w:val="95"/>
+          </w:rPr>
+          <w:delText xml:space="preserve">eCX API documentation </w:delText>
+        </w:r>
+      </w:del>
+      <w:r>
+        <w:rPr>
+          <w:rFonts w:asciiTheme="minorHAnsi" w:hAnsiTheme="minorHAnsi" w:cstheme="minorHAnsi"/>
+          <w:w w:val="95"/>
+        </w:rPr>
+        <w:t xml:space="preserve">option </w:t>
+      </w:r>
+      <w:del w:id="159" w:author="Tom Anderson" w:date="2021-07-22T18:11:00Z">
+        <w:r>
+          <w:rPr>
+            <w:rFonts w:asciiTheme="minorHAnsi" w:hAnsiTheme="minorHAnsi" w:cstheme="minorHAnsi"/>
+            <w:w w:val="95"/>
+          </w:rPr>
+          <w:delText>that</w:delText>
+        </w:r>
+      </w:del>
+      <w:ins w:id="160" w:author="Tom Anderson" w:date="2021-07-22T18:11:00Z">
+        <w:r>
+          <w:rPr>
+            <w:rFonts w:asciiTheme="minorHAnsi" w:hAnsiTheme="minorHAnsi" w:cstheme="minorHAnsi"/>
+            <w:w w:val="95"/>
+          </w:rPr>
+          <w:t>to</w:t>
+        </w:r>
+      </w:ins>
+      <w:r>
+        <w:rPr>
+          <w:rFonts w:asciiTheme="minorHAnsi" w:hAnsiTheme="minorHAnsi" w:cstheme="minorHAnsi"/>
+          <w:w w:val="95"/>
+        </w:rPr>
+        <w:t xml:space="preserve"> </w:t>
+      </w:r>
+      <w:del w:id="161" w:author="Tom Anderson" w:date="2021-07-22T18:11:00Z">
+        <w:r>
+          <w:rPr>
+            <w:rFonts w:asciiTheme="minorHAnsi" w:hAnsiTheme="minorHAnsi" w:cstheme="minorHAnsi"/>
+            <w:w w:val="95"/>
+          </w:rPr>
+          <w:delText xml:space="preserve">will </w:delText>
+        </w:r>
+      </w:del>
+      <w:r>
+        <w:rPr>
+          <w:rFonts w:asciiTheme="minorHAnsi" w:hAnsiTheme="minorHAnsi" w:cstheme="minorHAnsi"/>
+          <w:w w:val="95"/>
+        </w:rPr>
+        <w:t xml:space="preserve">dump </w:t>
+      </w:r>
+      <w:del w:id="162" w:author="Tom Anderson" w:date="2021-07-22T18:11:00Z">
+        <w:r>
+          <w:rPr>
+            <w:rFonts w:asciiTheme="minorHAnsi" w:hAnsiTheme="minorHAnsi" w:cstheme="minorHAnsi"/>
+            <w:w w:val="95"/>
+          </w:rPr>
+          <w:delText xml:space="preserve">out </w:delText>
+        </w:r>
+      </w:del>
+      <w:r>
+        <w:rPr>
+          <w:rFonts w:asciiTheme="minorHAnsi" w:hAnsiTheme="minorHAnsi" w:cstheme="minorHAnsi"/>
+          <w:w w:val="95"/>
+        </w:rPr>
+        <w:t xml:space="preserve">the API docs in </w:t>
       </w:r>
       <w:proofErr w:type="spellStart"/>
       <w:r>
@@ -3160,7 +5063,48 @@
           <w:rFonts w:asciiTheme="minorHAnsi" w:hAnsiTheme="minorHAnsi" w:cstheme="minorHAnsi"/>
           <w:w w:val="95"/>
         </w:rPr>
-        <w:t xml:space="preserve"> documents online and in GitHub that might help you fast track your API interaction.</w:t>
+        <w:t xml:space="preserve"> documents online </w:t>
+      </w:r>
+      <w:del w:id="163" w:author="Tom Anderson" w:date="2021-07-22T18:11:00Z">
+        <w:r>
+          <w:rPr>
+            <w:rFonts w:asciiTheme="minorHAnsi" w:hAnsiTheme="minorHAnsi" w:cstheme="minorHAnsi"/>
+            <w:w w:val="95"/>
+          </w:rPr>
+          <w:delText xml:space="preserve">and in GitHub </w:delText>
+        </w:r>
+      </w:del>
+      <w:r>
+        <w:rPr>
+          <w:rFonts w:asciiTheme="minorHAnsi" w:hAnsiTheme="minorHAnsi" w:cstheme="minorHAnsi"/>
+          <w:w w:val="95"/>
+        </w:rPr>
+        <w:t>that might help you fast track your API in</w:t>
+      </w:r>
+      <w:ins w:id="164" w:author="Tom Anderson" w:date="2021-07-22T18:11:00Z">
+        <w:r>
+          <w:rPr>
+            <w:rFonts w:asciiTheme="minorHAnsi" w:hAnsiTheme="minorHAnsi" w:cstheme="minorHAnsi"/>
+            <w:w w:val="95"/>
+          </w:rPr>
+          <w:t>tegration</w:t>
+        </w:r>
+      </w:ins>
+      <w:del w:id="165" w:author="Tom Anderson" w:date="2021-07-22T18:11:00Z">
+        <w:r>
+          <w:rPr>
+            <w:rFonts w:asciiTheme="minorHAnsi" w:hAnsiTheme="minorHAnsi" w:cstheme="minorHAnsi"/>
+            <w:w w:val="95"/>
+          </w:rPr>
+          <w:delText>teraction</w:delText>
+        </w:r>
+      </w:del>
+      <w:r>
+        <w:rPr>
+          <w:rFonts w:asciiTheme="minorHAnsi" w:hAnsiTheme="minorHAnsi" w:cstheme="minorHAnsi"/>
+          <w:w w:val="95"/>
+        </w:rPr>
+        <w:t>.</w:t>
       </w:r>
     </w:p>
     <w:p>
@@ -3180,7 +5124,7 @@
         </w:rPr>
         <w:t>On the eCX API documentation page in the eCX UI (</w:t>
       </w:r>
-      <w:hyperlink r:id="rId20">
+      <w:hyperlink r:id="rId19">
         <w:r>
           <w:rPr>
             <w:rFonts w:asciiTheme="minorHAnsi" w:hAnsiTheme="minorHAnsi" w:cstheme="minorHAnsi"/>
@@ -3196,13 +5140,63 @@
           <w:rFonts w:asciiTheme="minorHAnsi" w:hAnsiTheme="minorHAnsi" w:cstheme="minorHAnsi"/>
           <w:w w:val="95"/>
         </w:rPr>
-        <w:t>) you can also find ready-to- go eCX API clients in various languages such as Java, Go, PERL, etc</w:t>
-      </w:r>
+        <w:t xml:space="preserve">) you </w:t>
+      </w:r>
+      <w:del w:id="166" w:author="Tom Anderson" w:date="2021-07-22T18:11:00Z">
+        <w:r>
+          <w:rPr>
+            <w:rFonts w:asciiTheme="minorHAnsi" w:hAnsiTheme="minorHAnsi" w:cstheme="minorHAnsi"/>
+            <w:w w:val="95"/>
+          </w:rPr>
+          <w:delText xml:space="preserve">can </w:delText>
+        </w:r>
+      </w:del>
+      <w:ins w:id="167" w:author="Tom Anderson" w:date="2021-07-22T18:11:00Z">
+        <w:r>
+          <w:rPr>
+            <w:rFonts w:asciiTheme="minorHAnsi" w:hAnsiTheme="minorHAnsi" w:cstheme="minorHAnsi"/>
+            <w:w w:val="95"/>
+          </w:rPr>
+          <w:t xml:space="preserve">will </w:t>
+        </w:r>
+      </w:ins>
+      <w:del w:id="168" w:author="Tom Anderson" w:date="2021-07-22T18:11:00Z">
+        <w:r>
+          <w:rPr>
+            <w:rFonts w:asciiTheme="minorHAnsi" w:hAnsiTheme="minorHAnsi" w:cstheme="minorHAnsi"/>
+            <w:w w:val="95"/>
+          </w:rPr>
+          <w:delText xml:space="preserve">also </w:delText>
+        </w:r>
+      </w:del>
       <w:r>
         <w:rPr>
           <w:rFonts w:asciiTheme="minorHAnsi" w:hAnsiTheme="minorHAnsi" w:cstheme="minorHAnsi"/>
           <w:w w:val="95"/>
         </w:rPr>
+        <w:t xml:space="preserve">find ready-to- go </w:t>
+      </w:r>
+      <w:proofErr w:type="spellStart"/>
+      <w:r>
+        <w:rPr>
+          <w:rFonts w:asciiTheme="minorHAnsi" w:hAnsiTheme="minorHAnsi" w:cstheme="minorHAnsi"/>
+          <w:w w:val="95"/>
+        </w:rPr>
+        <w:t>eCX</w:t>
+      </w:r>
+      <w:proofErr w:type="spellEnd"/>
+      <w:r>
+        <w:rPr>
+          <w:rFonts w:asciiTheme="minorHAnsi" w:hAnsiTheme="minorHAnsi" w:cstheme="minorHAnsi"/>
+          <w:w w:val="95"/>
+        </w:rPr>
+        <w:t xml:space="preserve"> API clients in various languages such as Java, Go, PERL, etc</w:t>
+      </w:r>
+      <w:r>
+        <w:rPr>
+          <w:rFonts w:asciiTheme="minorHAnsi" w:hAnsiTheme="minorHAnsi" w:cstheme="minorHAnsi"/>
+          <w:w w:val="95"/>
+        </w:rPr>
         <w:t xml:space="preserve">., </w:t>
       </w:r>
       <w:r>
@@ -3226,7 +5220,39 @@
           <w:rFonts w:asciiTheme="minorHAnsi" w:hAnsiTheme="minorHAnsi" w:cstheme="minorHAnsi"/>
           <w:w w:val="95"/>
         </w:rPr>
-        <w:t xml:space="preserve"> tools to help you fast track your eCX API integration into your business processes.</w:t>
+        <w:t xml:space="preserve"> tools to help you fast track your </w:t>
+      </w:r>
+      <w:proofErr w:type="spellStart"/>
+      <w:r>
+        <w:rPr>
+          <w:rFonts w:asciiTheme="minorHAnsi" w:hAnsiTheme="minorHAnsi" w:cstheme="minorHAnsi"/>
+          <w:w w:val="95"/>
+        </w:rPr>
+        <w:t>eCX</w:t>
+      </w:r>
+      <w:proofErr w:type="spellEnd"/>
+      <w:r>
+        <w:rPr>
+          <w:rFonts w:asciiTheme="minorHAnsi" w:hAnsiTheme="minorHAnsi" w:cstheme="minorHAnsi"/>
+          <w:w w:val="95"/>
+        </w:rPr>
+        <w:t xml:space="preserve"> API integration</w:t>
+      </w:r>
+      <w:del w:id="169" w:author="Tom Anderson" w:date="2021-07-22T18:12:00Z">
+        <w:r>
+          <w:rPr>
+            <w:rFonts w:asciiTheme="minorHAnsi" w:hAnsiTheme="minorHAnsi" w:cstheme="minorHAnsi"/>
+            <w:w w:val="95"/>
+          </w:rPr>
+          <w:delText xml:space="preserve"> into your business processes</w:delText>
+        </w:r>
+      </w:del>
+      <w:r>
+        <w:rPr>
+          <w:rFonts w:asciiTheme="minorHAnsi" w:hAnsiTheme="minorHAnsi" w:cstheme="minorHAnsi"/>
+          <w:w w:val="95"/>
+        </w:rPr>
+        <w:t>.</w:t>
       </w:r>
     </w:p>
     <w:p>
@@ -3275,15 +5301,54 @@
           <w:rFonts w:asciiTheme="minorHAnsi" w:hAnsiTheme="minorHAnsi" w:cstheme="minorHAnsi"/>
           <w:w w:val="95"/>
         </w:rPr>
-        <w:t xml:space="preserve">Within the eCX Engineering department, the staff uses the free Postman API client to interact manually </w:t>
-      </w:r>
-      <w:r>
-        <w:rPr>
-          <w:rFonts w:asciiTheme="minorHAnsi" w:hAnsiTheme="minorHAnsi" w:cstheme="minorHAnsi"/>
-        </w:rPr>
-        <w:t xml:space="preserve">with the eCX API to perform quick testing and querying for data. The client can be downloaded at </w:t>
-      </w:r>
-      <w:hyperlink r:id="rId21">
+        <w:t xml:space="preserve">Within the eCX </w:t>
+      </w:r>
+      <w:del w:id="170" w:author="Tom Anderson" w:date="2021-07-22T18:12:00Z">
+        <w:r>
+          <w:rPr>
+            <w:rFonts w:asciiTheme="minorHAnsi" w:hAnsiTheme="minorHAnsi" w:cstheme="minorHAnsi"/>
+            <w:w w:val="95"/>
+          </w:rPr>
+          <w:delText>E</w:delText>
+        </w:r>
+      </w:del>
+      <w:ins w:id="171" w:author="Tom Anderson" w:date="2021-07-22T18:12:00Z">
+        <w:r>
+          <w:rPr>
+            <w:rFonts w:asciiTheme="minorHAnsi" w:hAnsiTheme="minorHAnsi" w:cstheme="minorHAnsi"/>
+            <w:w w:val="95"/>
+          </w:rPr>
+          <w:t>e</w:t>
+        </w:r>
+      </w:ins>
+      <w:r>
+        <w:rPr>
+          <w:rFonts w:asciiTheme="minorHAnsi" w:hAnsiTheme="minorHAnsi" w:cstheme="minorHAnsi"/>
+          <w:w w:val="95"/>
+        </w:rPr>
+        <w:t xml:space="preserve">ngineering department, the staff uses the free Postman API client to interact manually </w:t>
+      </w:r>
+      <w:r>
+        <w:rPr>
+          <w:rFonts w:asciiTheme="minorHAnsi" w:hAnsiTheme="minorHAnsi" w:cstheme="minorHAnsi"/>
+        </w:rPr>
+        <w:t xml:space="preserve">with the eCX API to perform quick testing and querying for data. </w:t>
+      </w:r>
+      <w:ins w:id="172" w:author="Tom Anderson" w:date="2021-07-22T18:12:00Z">
+        <w:r>
+          <w:rPr>
+            <w:rFonts w:asciiTheme="minorHAnsi" w:hAnsiTheme="minorHAnsi" w:cstheme="minorHAnsi"/>
+          </w:rPr>
+          <w:t xml:space="preserve"> </w:t>
+        </w:r>
+      </w:ins>
+      <w:r>
+        <w:rPr>
+          <w:rFonts w:asciiTheme="minorHAnsi" w:hAnsiTheme="minorHAnsi" w:cstheme="minorHAnsi"/>
+        </w:rPr>
+        <w:t xml:space="preserve">The client can be downloaded at </w:t>
+      </w:r>
+      <w:hyperlink r:id="rId20">
         <w:r>
           <w:rPr>
             <w:rFonts w:asciiTheme="minorHAnsi" w:hAnsiTheme="minorHAnsi" w:cstheme="minorHAnsi"/>
@@ -3299,13 +5364,51 @@
           <w:rFonts w:asciiTheme="minorHAnsi" w:hAnsiTheme="minorHAnsi" w:cstheme="minorHAnsi"/>
           <w:w w:val="95"/>
         </w:rPr>
-        <w:t xml:space="preserve">. The various examples that follow were generated from Postman’s </w:t>
-      </w:r>
-      <w:r>
-        <w:rPr>
-          <w:rFonts w:asciiTheme="minorHAnsi" w:hAnsiTheme="minorHAnsi" w:cstheme="minorHAnsi"/>
-        </w:rPr>
-        <w:t xml:space="preserve">option to create the API interaction you are performing in their interface into various programming </w:t>
+        <w:t xml:space="preserve">. </w:t>
+      </w:r>
+      <w:ins w:id="173" w:author="Tom Anderson" w:date="2021-07-22T18:12:00Z">
+        <w:r>
+          <w:rPr>
+            <w:rFonts w:asciiTheme="minorHAnsi" w:hAnsiTheme="minorHAnsi" w:cstheme="minorHAnsi"/>
+            <w:w w:val="95"/>
+          </w:rPr>
+          <w:t xml:space="preserve"> </w:t>
+        </w:r>
+      </w:ins>
+      <w:r>
+        <w:rPr>
+          <w:rFonts w:asciiTheme="minorHAnsi" w:hAnsiTheme="minorHAnsi" w:cstheme="minorHAnsi"/>
+          <w:w w:val="95"/>
+        </w:rPr>
+        <w:t xml:space="preserve">The various examples that follow were generated from Postman’s </w:t>
+      </w:r>
+      <w:r>
+        <w:rPr>
+          <w:rFonts w:asciiTheme="minorHAnsi" w:hAnsiTheme="minorHAnsi" w:cstheme="minorHAnsi"/>
+        </w:rPr>
+        <w:t>option to create the API interaction you are performing in the</w:t>
+      </w:r>
+      <w:del w:id="174" w:author="Tom Anderson" w:date="2021-07-22T18:13:00Z">
+        <w:r>
+          <w:rPr>
+            <w:rFonts w:asciiTheme="minorHAnsi" w:hAnsiTheme="minorHAnsi" w:cstheme="minorHAnsi"/>
+          </w:rPr>
+          <w:delText>ir interface</w:delText>
+        </w:r>
+      </w:del>
+      <w:ins w:id="175" w:author="Tom Anderson" w:date="2021-07-22T18:13:00Z">
+        <w:r>
+          <w:rPr>
+            <w:rFonts w:asciiTheme="minorHAnsi" w:hAnsiTheme="minorHAnsi" w:cstheme="minorHAnsi"/>
+          </w:rPr>
+          <w:t>ir application</w:t>
+        </w:r>
+      </w:ins>
+      <w:r>
+        <w:rPr>
+          <w:rFonts w:asciiTheme="minorHAnsi" w:hAnsiTheme="minorHAnsi" w:cstheme="minorHAnsi"/>
+        </w:rPr>
+        <w:t xml:space="preserve"> into various programming </w:t>
       </w:r>
       <w:r>
         <w:rPr>
@@ -3359,29 +5462,130 @@
           <w:rFonts w:asciiTheme="minorHAnsi" w:hAnsiTheme="minorHAnsi" w:cstheme="minorHAnsi"/>
           <w:w w:val="95"/>
         </w:rPr>
-        <w:t xml:space="preserve">The process for beginning to POST data to the eCX API on production first begins with developing your </w:t>
-      </w:r>
-      <w:r>
-        <w:rPr>
-          <w:rFonts w:asciiTheme="minorHAnsi" w:hAnsiTheme="minorHAnsi" w:cstheme="minorHAnsi"/>
-        </w:rPr>
-        <w:t xml:space="preserve">scripts to work </w:t>
-      </w:r>
-      <w:proofErr w:type="gramStart"/>
-      <w:r>
-        <w:rPr>
-          <w:rFonts w:asciiTheme="minorHAnsi" w:hAnsiTheme="minorHAnsi" w:cstheme="minorHAnsi"/>
-        </w:rPr>
-        <w:t>off of</w:t>
-      </w:r>
-      <w:proofErr w:type="gramEnd"/>
-      <w:r>
-        <w:rPr>
-          <w:rFonts w:asciiTheme="minorHAnsi" w:hAnsiTheme="minorHAnsi" w:cstheme="minorHAnsi"/>
-        </w:rPr>
-        <w:t xml:space="preserve"> our sandbox server, located at </w:t>
-      </w:r>
-      <w:hyperlink r:id="rId22">
+        <w:t xml:space="preserve">The process </w:t>
+      </w:r>
+      <w:del w:id="176" w:author="Tom Anderson" w:date="2021-07-22T18:13:00Z">
+        <w:r>
+          <w:rPr>
+            <w:rFonts w:asciiTheme="minorHAnsi" w:hAnsiTheme="minorHAnsi" w:cstheme="minorHAnsi"/>
+            <w:w w:val="95"/>
+          </w:rPr>
+          <w:delText xml:space="preserve">for beginning </w:delText>
+        </w:r>
+      </w:del>
+      <w:r>
+        <w:rPr>
+          <w:rFonts w:asciiTheme="minorHAnsi" w:hAnsiTheme="minorHAnsi" w:cstheme="minorHAnsi"/>
+          <w:w w:val="95"/>
+        </w:rPr>
+        <w:t xml:space="preserve">to POST data to the </w:t>
+      </w:r>
+      <w:ins w:id="177" w:author="Tom Anderson" w:date="2021-07-22T18:13:00Z">
+        <w:r>
+          <w:rPr>
+            <w:rFonts w:asciiTheme="minorHAnsi" w:hAnsiTheme="minorHAnsi" w:cstheme="minorHAnsi"/>
+            <w:w w:val="95"/>
+          </w:rPr>
+          <w:t xml:space="preserve">production </w:t>
+        </w:r>
+      </w:ins>
+      <w:proofErr w:type="spellStart"/>
+      <w:r>
+        <w:rPr>
+          <w:rFonts w:asciiTheme="minorHAnsi" w:hAnsiTheme="minorHAnsi" w:cstheme="minorHAnsi"/>
+          <w:w w:val="95"/>
+        </w:rPr>
+        <w:t>eCX</w:t>
+      </w:r>
+      <w:proofErr w:type="spellEnd"/>
+      <w:r>
+        <w:rPr>
+          <w:rFonts w:asciiTheme="minorHAnsi" w:hAnsiTheme="minorHAnsi" w:cstheme="minorHAnsi"/>
+          <w:w w:val="95"/>
+        </w:rPr>
+        <w:t xml:space="preserve"> API </w:t>
+      </w:r>
+      <w:proofErr w:type="spellStart"/>
+      <w:r>
+        <w:rPr>
+          <w:rFonts w:asciiTheme="minorHAnsi" w:hAnsiTheme="minorHAnsi" w:cstheme="minorHAnsi"/>
+          <w:w w:val="95"/>
+        </w:rPr>
+        <w:t>o</w:t>
+      </w:r>
+      <w:del w:id="178" w:author="Tom Anderson" w:date="2021-07-22T18:13:00Z">
+        <w:r>
+          <w:rPr>
+            <w:rFonts w:asciiTheme="minorHAnsi" w:hAnsiTheme="minorHAnsi" w:cstheme="minorHAnsi"/>
+            <w:w w:val="95"/>
+          </w:rPr>
+          <w:delText xml:space="preserve">n production first </w:delText>
+        </w:r>
+      </w:del>
+      <w:r>
+        <w:rPr>
+          <w:rFonts w:asciiTheme="minorHAnsi" w:hAnsiTheme="minorHAnsi" w:cstheme="minorHAnsi"/>
+          <w:w w:val="95"/>
+        </w:rPr>
+        <w:t>begins</w:t>
+      </w:r>
+      <w:proofErr w:type="spellEnd"/>
+      <w:r>
+        <w:rPr>
+          <w:rFonts w:asciiTheme="minorHAnsi" w:hAnsiTheme="minorHAnsi" w:cstheme="minorHAnsi"/>
+          <w:w w:val="95"/>
+        </w:rPr>
+        <w:t xml:space="preserve"> with developing your </w:t>
+      </w:r>
+      <w:r>
+        <w:rPr>
+          <w:rFonts w:asciiTheme="minorHAnsi" w:hAnsiTheme="minorHAnsi" w:cstheme="minorHAnsi"/>
+        </w:rPr>
+        <w:t xml:space="preserve">scripts to work off of </w:t>
+      </w:r>
+      <w:del w:id="179" w:author="Tom Anderson" w:date="2021-07-22T18:14:00Z">
+        <w:r>
+          <w:rPr>
+            <w:rFonts w:asciiTheme="minorHAnsi" w:hAnsiTheme="minorHAnsi" w:cstheme="minorHAnsi"/>
+          </w:rPr>
+          <w:delText xml:space="preserve">our </w:delText>
+        </w:r>
+      </w:del>
+      <w:ins w:id="180" w:author="Tom Anderson" w:date="2021-07-22T18:14:00Z">
+        <w:r>
+          <w:rPr>
+            <w:rFonts w:asciiTheme="minorHAnsi" w:hAnsiTheme="minorHAnsi" w:cstheme="minorHAnsi"/>
+          </w:rPr>
+          <w:t>the</w:t>
+        </w:r>
+        <w:r>
+          <w:rPr>
+            <w:rFonts w:asciiTheme="minorHAnsi" w:hAnsiTheme="minorHAnsi" w:cstheme="minorHAnsi"/>
+          </w:rPr>
+          <w:t xml:space="preserve"> </w:t>
+        </w:r>
+      </w:ins>
+      <w:r>
+        <w:rPr>
+          <w:rFonts w:asciiTheme="minorHAnsi" w:hAnsiTheme="minorHAnsi" w:cstheme="minorHAnsi"/>
+        </w:rPr>
+        <w:t>sandbox server</w:t>
+      </w:r>
+      <w:del w:id="181" w:author="Tom Anderson" w:date="2021-07-22T18:14:00Z">
+        <w:r>
+          <w:rPr>
+            <w:rFonts w:asciiTheme="minorHAnsi" w:hAnsiTheme="minorHAnsi" w:cstheme="minorHAnsi"/>
+          </w:rPr>
+          <w:delText>,</w:delText>
+        </w:r>
+      </w:del>
+      <w:r>
+        <w:rPr>
+          <w:rFonts w:asciiTheme="minorHAnsi" w:hAnsiTheme="minorHAnsi" w:cstheme="minorHAnsi"/>
+        </w:rPr>
+        <w:t xml:space="preserve"> located at </w:t>
+      </w:r>
+      <w:hyperlink r:id="rId21">
         <w:r>
           <w:rPr>
             <w:rFonts w:asciiTheme="minorHAnsi" w:hAnsiTheme="minorHAnsi" w:cstheme="minorHAnsi"/>
@@ -3395,7 +5599,153 @@
         <w:rPr>
           <w:rFonts w:asciiTheme="minorHAnsi" w:hAnsiTheme="minorHAnsi" w:cstheme="minorHAnsi"/>
         </w:rPr>
-        <w:t xml:space="preserve">. The data you </w:t>
+        <w:t>.</w:t>
+      </w:r>
+      <w:ins w:id="182" w:author="Tom Anderson" w:date="2021-07-22T18:14:00Z">
+        <w:r>
+          <w:rPr>
+            <w:rFonts w:asciiTheme="minorHAnsi" w:hAnsiTheme="minorHAnsi" w:cstheme="minorHAnsi"/>
+          </w:rPr>
+          <w:t xml:space="preserve"> </w:t>
+        </w:r>
+      </w:ins>
+      <w:r>
+        <w:rPr>
+          <w:rFonts w:asciiTheme="minorHAnsi" w:hAnsiTheme="minorHAnsi" w:cstheme="minorHAnsi"/>
+        </w:rPr>
+        <w:t xml:space="preserve"> The data you </w:t>
+      </w:r>
+      <w:r>
+        <w:rPr>
+          <w:rFonts w:asciiTheme="minorHAnsi" w:hAnsiTheme="minorHAnsi" w:cstheme="minorHAnsi"/>
+          <w:w w:val="95"/>
+        </w:rPr>
+        <w:t xml:space="preserve">POST or PATCH </w:t>
+      </w:r>
+      <w:ins w:id="183" w:author="Tom Anderson" w:date="2021-07-22T18:14:00Z">
+        <w:r>
+          <w:rPr>
+            <w:rFonts w:asciiTheme="minorHAnsi" w:hAnsiTheme="minorHAnsi" w:cstheme="minorHAnsi"/>
+            <w:w w:val="95"/>
+          </w:rPr>
+          <w:t xml:space="preserve">there </w:t>
+        </w:r>
+      </w:ins>
+      <w:r>
+        <w:rPr>
+          <w:rFonts w:asciiTheme="minorHAnsi" w:hAnsiTheme="minorHAnsi" w:cstheme="minorHAnsi"/>
+          <w:w w:val="95"/>
+        </w:rPr>
+        <w:t>will never be distributed</w:t>
+      </w:r>
+      <w:ins w:id="184" w:author="Tom Anderson" w:date="2021-07-22T18:15:00Z">
+        <w:r>
+          <w:rPr>
+            <w:rFonts w:asciiTheme="minorHAnsi" w:hAnsiTheme="minorHAnsi" w:cstheme="minorHAnsi"/>
+            <w:w w:val="95"/>
+          </w:rPr>
+          <w:t xml:space="preserve"> and</w:t>
+        </w:r>
+      </w:ins>
+      <w:del w:id="185" w:author="Tom Anderson" w:date="2021-07-22T18:14:00Z">
+        <w:r>
+          <w:rPr>
+            <w:rFonts w:asciiTheme="minorHAnsi" w:hAnsiTheme="minorHAnsi" w:cstheme="minorHAnsi"/>
+            <w:w w:val="95"/>
+          </w:rPr>
+          <w:delText>, so</w:delText>
+        </w:r>
+      </w:del>
+      <w:r>
+        <w:rPr>
+          <w:rFonts w:asciiTheme="minorHAnsi" w:hAnsiTheme="minorHAnsi" w:cstheme="minorHAnsi"/>
+          <w:w w:val="95"/>
+        </w:rPr>
+        <w:t xml:space="preserve"> you are welcome to </w:t>
+      </w:r>
+      <w:ins w:id="186" w:author="Tom Anderson" w:date="2021-07-22T18:15:00Z">
+        <w:r>
+          <w:rPr>
+            <w:rFonts w:asciiTheme="minorHAnsi" w:hAnsiTheme="minorHAnsi" w:cstheme="minorHAnsi"/>
+            <w:w w:val="95"/>
+          </w:rPr>
+          <w:t xml:space="preserve">use the sandbox resource </w:t>
+        </w:r>
+      </w:ins>
+      <w:del w:id="187" w:author="Tom Anderson" w:date="2021-07-22T18:15:00Z">
+        <w:r>
+          <w:rPr>
+            <w:rFonts w:asciiTheme="minorHAnsi" w:hAnsiTheme="minorHAnsi" w:cstheme="minorHAnsi"/>
+            <w:w w:val="95"/>
+          </w:rPr>
+          <w:delText>go crazy and work any sort of</w:delText>
+        </w:r>
+      </w:del>
+      <w:ins w:id="188" w:author="Tom Anderson" w:date="2021-07-22T18:15:00Z">
+        <w:r>
+          <w:rPr>
+            <w:rFonts w:asciiTheme="minorHAnsi" w:hAnsiTheme="minorHAnsi" w:cstheme="minorHAnsi"/>
+            <w:w w:val="95"/>
+          </w:rPr>
+          <w:t>for any</w:t>
+        </w:r>
+      </w:ins>
+      <w:r>
+        <w:rPr>
+          <w:rFonts w:asciiTheme="minorHAnsi" w:hAnsiTheme="minorHAnsi" w:cstheme="minorHAnsi"/>
+          <w:w w:val="95"/>
+        </w:rPr>
+        <w:t xml:space="preserve"> edge use cases you can envision with any sort of test data.</w:t>
+      </w:r>
+    </w:p>
+    <w:p>
+      <w:pPr>
+        <w:pStyle w:val="BodyText"/>
+        <w:spacing w:before="163" w:line="273" w:lineRule="auto"/>
+        <w:rPr>
+          <w:rFonts w:asciiTheme="minorHAnsi" w:hAnsiTheme="minorHAnsi" w:cstheme="minorHAnsi"/>
+        </w:rPr>
+      </w:pPr>
+      <w:del w:id="189" w:author="Tom Anderson" w:date="2021-07-22T18:15:00Z">
+        <w:r>
+          <w:rPr>
+            <w:rFonts w:asciiTheme="minorHAnsi" w:hAnsiTheme="minorHAnsi" w:cstheme="minorHAnsi"/>
+            <w:w w:val="95"/>
+          </w:rPr>
+          <w:delText xml:space="preserve">We recommend setting </w:delText>
+        </w:r>
+      </w:del>
+      <w:ins w:id="190" w:author="Tom Anderson" w:date="2021-07-22T18:15:00Z">
+        <w:r>
+          <w:rPr>
+            <w:rFonts w:asciiTheme="minorHAnsi" w:hAnsiTheme="minorHAnsi" w:cstheme="minorHAnsi"/>
+            <w:w w:val="95"/>
+          </w:rPr>
+          <w:t xml:space="preserve">You could set </w:t>
+        </w:r>
+      </w:ins>
+      <w:r>
+        <w:rPr>
+          <w:rFonts w:asciiTheme="minorHAnsi" w:hAnsiTheme="minorHAnsi" w:cstheme="minorHAnsi"/>
+          <w:w w:val="95"/>
+        </w:rPr>
+        <w:t>the e</w:t>
+      </w:r>
+      <w:proofErr w:type="spellStart"/>
+      <w:r>
+        <w:rPr>
+          <w:rFonts w:asciiTheme="minorHAnsi" w:hAnsiTheme="minorHAnsi" w:cstheme="minorHAnsi"/>
+          <w:w w:val="95"/>
+        </w:rPr>
+        <w:t>CX</w:t>
+      </w:r>
+      <w:proofErr w:type="spellEnd"/>
+      <w:r>
+        <w:rPr>
+          <w:rFonts w:asciiTheme="minorHAnsi" w:hAnsiTheme="minorHAnsi" w:cstheme="minorHAnsi"/>
+          <w:w w:val="95"/>
+        </w:rPr>
+        <w:t xml:space="preserve"> API server URL value as a script </w:t>
       </w:r>
       <w:proofErr w:type="gramStart"/>
       <w:r>
@@ -3403,7 +5753,7 @@
           <w:rFonts w:asciiTheme="minorHAnsi" w:hAnsiTheme="minorHAnsi" w:cstheme="minorHAnsi"/>
           <w:w w:val="95"/>
         </w:rPr>
-        <w:t>POST</w:t>
+        <w:t>parameter</w:t>
       </w:r>
       <w:proofErr w:type="gramEnd"/>
       <w:r>
@@ -3411,7 +5761,13 @@
           <w:rFonts w:asciiTheme="minorHAnsi" w:hAnsiTheme="minorHAnsi" w:cstheme="minorHAnsi"/>
           <w:w w:val="95"/>
         </w:rPr>
-        <w:t xml:space="preserve"> or PATCH will never be distributed, so you are welcome to go crazy and work any sort of edge use cases you can envision with any sort of test data.</w:t>
+        <w:t xml:space="preserve"> so you’ll be able to make a </w:t>
+      </w:r>
+      <w:r>
+        <w:rPr>
+          <w:rFonts w:asciiTheme="minorHAnsi" w:hAnsiTheme="minorHAnsi" w:cstheme="minorHAnsi"/>
+        </w:rPr>
+        <w:t>quick change later to point to the production server.</w:t>
       </w:r>
     </w:p>
     <w:p>
@@ -3425,53 +5781,95 @@
       <w:r>
         <w:rPr>
           <w:rFonts w:asciiTheme="minorHAnsi" w:hAnsiTheme="minorHAnsi" w:cstheme="minorHAnsi"/>
+        </w:rPr>
+        <w:t>The data on the sandbox is reset nightly at 00:00 GMT</w:t>
+      </w:r>
+      <w:del w:id="191" w:author="Tom Anderson" w:date="2021-07-22T18:16:00Z">
+        <w:r>
+          <w:rPr>
+            <w:rFonts w:asciiTheme="minorHAnsi" w:hAnsiTheme="minorHAnsi" w:cstheme="minorHAnsi"/>
+          </w:rPr>
+          <w:delText>,</w:delText>
+        </w:r>
+      </w:del>
+      <w:r>
+        <w:rPr>
+          <w:rFonts w:asciiTheme="minorHAnsi" w:hAnsiTheme="minorHAnsi" w:cstheme="minorHAnsi"/>
+        </w:rPr>
+        <w:t xml:space="preserve"> and</w:t>
+      </w:r>
+      <w:ins w:id="192" w:author="Tom Anderson" w:date="2021-07-22T18:16:00Z">
+        <w:r>
+          <w:rPr>
+            <w:rFonts w:asciiTheme="minorHAnsi" w:hAnsiTheme="minorHAnsi" w:cstheme="minorHAnsi"/>
+          </w:rPr>
+          <w:t xml:space="preserve"> is</w:t>
+        </w:r>
+      </w:ins>
+      <w:del w:id="193" w:author="Tom Anderson" w:date="2021-07-22T18:16:00Z">
+        <w:r>
+          <w:rPr>
+            <w:rFonts w:asciiTheme="minorHAnsi" w:hAnsiTheme="minorHAnsi" w:cstheme="minorHAnsi"/>
+          </w:rPr>
+          <w:delText xml:space="preserve"> we</w:delText>
+        </w:r>
+      </w:del>
+      <w:r>
+        <w:rPr>
+          <w:rFonts w:asciiTheme="minorHAnsi" w:hAnsiTheme="minorHAnsi" w:cstheme="minorHAnsi"/>
+        </w:rPr>
+        <w:t xml:space="preserve"> reseed</w:t>
+      </w:r>
+      <w:ins w:id="194" w:author="Tom Anderson" w:date="2021-07-22T18:16:00Z">
+        <w:r>
+          <w:rPr>
+            <w:rFonts w:asciiTheme="minorHAnsi" w:hAnsiTheme="minorHAnsi" w:cstheme="minorHAnsi"/>
+          </w:rPr>
+          <w:t>ed</w:t>
+        </w:r>
+      </w:ins>
+      <w:r>
+        <w:rPr>
+          <w:rFonts w:asciiTheme="minorHAnsi" w:hAnsiTheme="minorHAnsi" w:cstheme="minorHAnsi"/>
+        </w:rPr>
+        <w:t xml:space="preserve"> </w:t>
+      </w:r>
+      <w:del w:id="195" w:author="Tom Anderson" w:date="2021-07-22T18:16:00Z">
+        <w:r>
+          <w:rPr>
+            <w:rFonts w:asciiTheme="minorHAnsi" w:hAnsiTheme="minorHAnsi" w:cstheme="minorHAnsi"/>
+          </w:rPr>
+          <w:delText xml:space="preserve">it </w:delText>
+        </w:r>
+      </w:del>
+      <w:r>
+        <w:rPr>
+          <w:rFonts w:asciiTheme="minorHAnsi" w:hAnsiTheme="minorHAnsi" w:cstheme="minorHAnsi"/>
+        </w:rPr>
+        <w:t xml:space="preserve">with live data pulled from the </w:t>
+      </w:r>
+      <w:r>
+        <w:rPr>
+          <w:rFonts w:asciiTheme="minorHAnsi" w:hAnsiTheme="minorHAnsi" w:cstheme="minorHAnsi"/>
           <w:w w:val="95"/>
         </w:rPr>
-        <w:t xml:space="preserve">We recommend setting the eCX API server URL value as a script </w:t>
-      </w:r>
-      <w:proofErr w:type="gramStart"/>
+        <w:t xml:space="preserve">production server to give </w:t>
+      </w:r>
+      <w:del w:id="196" w:author="Tom Anderson" w:date="2021-07-22T18:16:00Z">
+        <w:r>
+          <w:rPr>
+            <w:rFonts w:asciiTheme="minorHAnsi" w:hAnsiTheme="minorHAnsi" w:cstheme="minorHAnsi"/>
+            <w:w w:val="95"/>
+          </w:rPr>
+          <w:delText xml:space="preserve">you some </w:delText>
+        </w:r>
+      </w:del>
       <w:r>
         <w:rPr>
           <w:rFonts w:asciiTheme="minorHAnsi" w:hAnsiTheme="minorHAnsi" w:cstheme="minorHAnsi"/>
           <w:w w:val="95"/>
         </w:rPr>
-        <w:t>parameter</w:t>
-      </w:r>
-      <w:proofErr w:type="gramEnd"/>
-      <w:r>
-        <w:rPr>
-          <w:rFonts w:asciiTheme="minorHAnsi" w:hAnsiTheme="minorHAnsi" w:cstheme="minorHAnsi"/>
-          <w:w w:val="95"/>
-        </w:rPr>
-        <w:t xml:space="preserve"> so you’ll be able to make a </w:t>
-      </w:r>
-      <w:r>
-        <w:rPr>
-          <w:rFonts w:asciiTheme="minorHAnsi" w:hAnsiTheme="minorHAnsi" w:cstheme="minorHAnsi"/>
-        </w:rPr>
-        <w:t>quick change later to point to the production server.</w:t>
-      </w:r>
-    </w:p>
-    <w:p>
-      <w:pPr>
-        <w:pStyle w:val="BodyText"/>
-        <w:spacing w:before="163" w:line="273" w:lineRule="auto"/>
-        <w:rPr>
-          <w:rFonts w:asciiTheme="minorHAnsi" w:hAnsiTheme="minorHAnsi" w:cstheme="minorHAnsi"/>
-        </w:rPr>
-      </w:pPr>
-      <w:r>
-        <w:rPr>
-          <w:rFonts w:asciiTheme="minorHAnsi" w:hAnsiTheme="minorHAnsi" w:cstheme="minorHAnsi"/>
-        </w:rPr>
-        <w:t xml:space="preserve">The data on the sandbox is reset nightly at 00:00 GMT, and we reseed it with live data pulled from the </w:t>
-      </w:r>
-      <w:r>
-        <w:rPr>
-          <w:rFonts w:asciiTheme="minorHAnsi" w:hAnsiTheme="minorHAnsi" w:cstheme="minorHAnsi"/>
-          <w:w w:val="95"/>
-        </w:rPr>
-        <w:t>production server to give you some real and current data to run your scripts against.</w:t>
+        <w:t>real and current data to run your scripts against.</w:t>
       </w:r>
     </w:p>
     <w:p>
@@ -3487,23 +5885,9 @@
         <w:rPr>
           <w:rFonts w:asciiTheme="minorHAnsi" w:hAnsiTheme="minorHAnsi" w:cstheme="minorHAnsi"/>
         </w:rPr>
-        <w:t xml:space="preserve">We capture usage and performance metrics from </w:t>
-      </w:r>
-      <w:proofErr w:type="gramStart"/>
-      <w:r>
-        <w:rPr>
-          <w:rFonts w:asciiTheme="minorHAnsi" w:hAnsiTheme="minorHAnsi" w:cstheme="minorHAnsi"/>
-        </w:rPr>
-        <w:t>all of</w:t>
-      </w:r>
-      <w:proofErr w:type="gramEnd"/>
-      <w:r>
-        <w:rPr>
-          <w:rFonts w:asciiTheme="minorHAnsi" w:hAnsiTheme="minorHAnsi" w:cstheme="minorHAnsi"/>
-        </w:rPr>
-        <w:t xml:space="preserve"> the servers on the eCX platform. Email </w:t>
-      </w:r>
-      <w:hyperlink r:id="rId23">
+        <w:t xml:space="preserve">We capture usage and performance metrics from all of the servers on the eCX platform. Email </w:t>
+      </w:r>
+      <w:hyperlink r:id="rId22">
         <w:r>
           <w:rPr>
             <w:rFonts w:asciiTheme="minorHAnsi" w:hAnsiTheme="minorHAnsi" w:cstheme="minorHAnsi"/>
@@ -3517,7 +5901,35 @@
         <w:rPr>
           <w:rFonts w:asciiTheme="minorHAnsi" w:hAnsiTheme="minorHAnsi" w:cstheme="minorHAnsi"/>
         </w:rPr>
-        <w:t xml:space="preserve">when you feel that your submission scripts are well developed. We’ll begin to check the sandbox metrics, and if we see a </w:t>
+        <w:t xml:space="preserve">when you feel that your submission scripts are well developed. </w:t>
+      </w:r>
+      <w:ins w:id="197" w:author="Tom Anderson" w:date="2021-07-22T18:18:00Z">
+        <w:r>
+          <w:rPr>
+            <w:rFonts w:asciiTheme="minorHAnsi" w:hAnsiTheme="minorHAnsi" w:cstheme="minorHAnsi"/>
+          </w:rPr>
+          <w:t xml:space="preserve"> </w:t>
+        </w:r>
+      </w:ins>
+      <w:r>
+        <w:rPr>
+          <w:rFonts w:asciiTheme="minorHAnsi" w:hAnsiTheme="minorHAnsi" w:cstheme="minorHAnsi"/>
+        </w:rPr>
+        <w:t>We’ll begin to check the sandbox metrics</w:t>
+      </w:r>
+      <w:del w:id="198" w:author="Tom Anderson" w:date="2021-07-22T18:17:00Z">
+        <w:r>
+          <w:rPr>
+            <w:rFonts w:asciiTheme="minorHAnsi" w:hAnsiTheme="minorHAnsi" w:cstheme="minorHAnsi"/>
+          </w:rPr>
+          <w:delText>,</w:delText>
+        </w:r>
+      </w:del>
+      <w:r>
+        <w:rPr>
+          <w:rFonts w:asciiTheme="minorHAnsi" w:hAnsiTheme="minorHAnsi" w:cstheme="minorHAnsi"/>
+        </w:rPr>
+        <w:t xml:space="preserve"> and if we see a </w:t>
       </w:r>
       <w:proofErr w:type="gramStart"/>
       <w:r>
@@ -3531,42 +5943,153 @@
         <w:rPr>
           <w:rFonts w:asciiTheme="minorHAnsi" w:hAnsiTheme="minorHAnsi" w:cstheme="minorHAnsi"/>
         </w:rPr>
-        <w:t xml:space="preserve"> we’ll ask you to make some enhancements, and then reapply once you’ve had 48 hours or so of processing with the new logic and things are looking better. If everything looks </w:t>
+        <w:t xml:space="preserve"> we’ll ask you to make </w:t>
+      </w:r>
+      <w:del w:id="199" w:author="Tom Anderson" w:date="2021-07-22T18:17:00Z">
+        <w:r>
+          <w:rPr>
+            <w:rFonts w:asciiTheme="minorHAnsi" w:hAnsiTheme="minorHAnsi" w:cstheme="minorHAnsi"/>
+          </w:rPr>
+          <w:delText>some enhancements,</w:delText>
+        </w:r>
+      </w:del>
+      <w:ins w:id="200" w:author="Tom Anderson" w:date="2021-07-22T18:17:00Z">
+        <w:r>
+          <w:rPr>
+            <w:rFonts w:asciiTheme="minorHAnsi" w:hAnsiTheme="minorHAnsi" w:cstheme="minorHAnsi"/>
+          </w:rPr>
+          <w:t xml:space="preserve">changes.  </w:t>
+        </w:r>
+      </w:ins>
+      <w:del w:id="201" w:author="Tom Anderson" w:date="2021-07-22T18:17:00Z">
+        <w:r>
+          <w:rPr>
+            <w:rFonts w:asciiTheme="minorHAnsi" w:hAnsiTheme="minorHAnsi" w:cstheme="minorHAnsi"/>
+          </w:rPr>
+          <w:delText xml:space="preserve"> and then r</w:delText>
+        </w:r>
+      </w:del>
+      <w:ins w:id="202" w:author="Tom Anderson" w:date="2021-07-22T18:17:00Z">
+        <w:r>
+          <w:rPr>
+            <w:rFonts w:asciiTheme="minorHAnsi" w:hAnsiTheme="minorHAnsi" w:cstheme="minorHAnsi"/>
+          </w:rPr>
+          <w:t>R</w:t>
+        </w:r>
+      </w:ins>
+      <w:r>
+        <w:rPr>
+          <w:rFonts w:asciiTheme="minorHAnsi" w:hAnsiTheme="minorHAnsi" w:cstheme="minorHAnsi"/>
+        </w:rPr>
+        <w:t xml:space="preserve">eapply once you’ve had 48 hours or so of processing with the new logic and things are looking better. If everything looks </w:t>
       </w:r>
       <w:proofErr w:type="gramStart"/>
-      <w:r>
-        <w:rPr>
-          <w:rFonts w:asciiTheme="minorHAnsi" w:hAnsiTheme="minorHAnsi" w:cstheme="minorHAnsi"/>
-        </w:rPr>
-        <w:t>fine</w:t>
-      </w:r>
+      <w:ins w:id="203" w:author="Tom Anderson" w:date="2021-07-22T18:17:00Z">
+        <w:r>
+          <w:rPr>
+            <w:rFonts w:asciiTheme="minorHAnsi" w:hAnsiTheme="minorHAnsi" w:cstheme="minorHAnsi"/>
+          </w:rPr>
+          <w:t>good</w:t>
+        </w:r>
+      </w:ins>
       <w:proofErr w:type="gramEnd"/>
-      <w:r>
-        <w:rPr>
-          <w:rFonts w:asciiTheme="minorHAnsi" w:hAnsiTheme="minorHAnsi" w:cstheme="minorHAnsi"/>
-        </w:rPr>
-        <w:t xml:space="preserve"> then we’ll approve you to submit to production. </w:t>
-      </w:r>
-      <w:proofErr w:type="gramStart"/>
-      <w:r>
-        <w:rPr>
-          <w:rFonts w:asciiTheme="minorHAnsi" w:hAnsiTheme="minorHAnsi" w:cstheme="minorHAnsi"/>
-        </w:rPr>
-        <w:t>We’ll</w:t>
-      </w:r>
-      <w:proofErr w:type="gramEnd"/>
-      <w:r>
-        <w:rPr>
-          <w:rFonts w:asciiTheme="minorHAnsi" w:hAnsiTheme="minorHAnsi" w:cstheme="minorHAnsi"/>
-        </w:rPr>
-        <w:t xml:space="preserve"> have you repeat the submit/review process as necessary until your script is well behaved. But this approval step is </w:t>
+      <w:del w:id="204" w:author="Tom Anderson" w:date="2021-07-22T18:17:00Z">
+        <w:r>
+          <w:rPr>
+            <w:rFonts w:asciiTheme="minorHAnsi" w:hAnsiTheme="minorHAnsi" w:cstheme="minorHAnsi"/>
+          </w:rPr>
+          <w:delText>fine</w:delText>
+        </w:r>
+      </w:del>
+      <w:r>
+        <w:rPr>
+          <w:rFonts w:asciiTheme="minorHAnsi" w:hAnsiTheme="minorHAnsi" w:cstheme="minorHAnsi"/>
+        </w:rPr>
+        <w:t xml:space="preserve"> then we’ll approve you to submit to production.</w:t>
+      </w:r>
+      <w:ins w:id="205" w:author="Tom Anderson" w:date="2021-07-22T18:17:00Z">
+        <w:r>
+          <w:rPr>
+            <w:rFonts w:asciiTheme="minorHAnsi" w:hAnsiTheme="minorHAnsi" w:cstheme="minorHAnsi"/>
+          </w:rPr>
+          <w:t xml:space="preserve"> </w:t>
+        </w:r>
+      </w:ins>
+      <w:r>
+        <w:rPr>
+          <w:rFonts w:asciiTheme="minorHAnsi" w:hAnsiTheme="minorHAnsi" w:cstheme="minorHAnsi"/>
+        </w:rPr>
+        <w:t xml:space="preserve"> We’ll have you repeat the submit/review process as necessary until your script is well behaved. </w:t>
+      </w:r>
+      <w:del w:id="206" w:author="Tom Anderson" w:date="2021-07-22T18:17:00Z">
+        <w:r>
+          <w:rPr>
+            <w:rFonts w:asciiTheme="minorHAnsi" w:hAnsiTheme="minorHAnsi" w:cstheme="minorHAnsi"/>
+          </w:rPr>
+          <w:delText>But t</w:delText>
+        </w:r>
+      </w:del>
+      <w:ins w:id="207" w:author="Tom Anderson" w:date="2021-07-22T18:17:00Z">
+        <w:r>
+          <w:rPr>
+            <w:rFonts w:asciiTheme="minorHAnsi" w:hAnsiTheme="minorHAnsi" w:cstheme="minorHAnsi"/>
+          </w:rPr>
+          <w:t xml:space="preserve"> T</w:t>
+        </w:r>
+      </w:ins>
+      <w:r>
+        <w:rPr>
+          <w:rFonts w:asciiTheme="minorHAnsi" w:hAnsiTheme="minorHAnsi" w:cstheme="minorHAnsi"/>
+        </w:rPr>
+        <w:t xml:space="preserve">his approval step is </w:t>
       </w:r>
       <w:r>
         <w:rPr>
           <w:rFonts w:asciiTheme="minorHAnsi" w:hAnsiTheme="minorHAnsi" w:cstheme="minorHAnsi"/>
           <w:w w:val="95"/>
         </w:rPr>
-        <w:t>necessary prior to allowing you to begin submitting data to eCX production.</w:t>
+        <w:t xml:space="preserve">necessary </w:t>
+      </w:r>
+      <w:del w:id="208" w:author="Tom Anderson" w:date="2021-07-22T18:18:00Z">
+        <w:r>
+          <w:rPr>
+            <w:rFonts w:asciiTheme="minorHAnsi" w:hAnsiTheme="minorHAnsi" w:cstheme="minorHAnsi"/>
+            <w:w w:val="95"/>
+          </w:rPr>
+          <w:delText xml:space="preserve">prior to allowing you to </w:delText>
+        </w:r>
+      </w:del>
+      <w:ins w:id="209" w:author="Tom Anderson" w:date="2021-07-22T18:18:00Z">
+        <w:r>
+          <w:rPr>
+            <w:rFonts w:asciiTheme="minorHAnsi" w:hAnsiTheme="minorHAnsi" w:cstheme="minorHAnsi"/>
+            <w:w w:val="95"/>
+          </w:rPr>
+          <w:t xml:space="preserve">before you </w:t>
+        </w:r>
+      </w:ins>
+      <w:r>
+        <w:rPr>
+          <w:rFonts w:asciiTheme="minorHAnsi" w:hAnsiTheme="minorHAnsi" w:cstheme="minorHAnsi"/>
+          <w:w w:val="95"/>
+        </w:rPr>
+        <w:t xml:space="preserve">begin submitting data to </w:t>
+      </w:r>
+      <w:proofErr w:type="spellStart"/>
+      <w:r>
+        <w:rPr>
+          <w:rFonts w:asciiTheme="minorHAnsi" w:hAnsiTheme="minorHAnsi" w:cstheme="minorHAnsi"/>
+          <w:w w:val="95"/>
+        </w:rPr>
+        <w:t>eCX</w:t>
+      </w:r>
+      <w:proofErr w:type="spellEnd"/>
+      <w:r>
+        <w:rPr>
+          <w:rFonts w:asciiTheme="minorHAnsi" w:hAnsiTheme="minorHAnsi" w:cstheme="minorHAnsi"/>
+          <w:w w:val="95"/>
+        </w:rPr>
+        <w:t xml:space="preserve"> production.</w:t>
       </w:r>
     </w:p>
     <w:p>
@@ -3647,23 +6170,7 @@
           <w:rFonts w:asciiTheme="minorHAnsi" w:hAnsiTheme="minorHAnsi" w:cstheme="minorHAnsi"/>
           <w:w w:val="90"/>
         </w:rPr>
-        <w:t xml:space="preserve"> code (see below).  The eCX rejects duplicate URLs </w:t>
-      </w:r>
-      <w:proofErr w:type="gramStart"/>
-      <w:r>
-        <w:rPr>
-          <w:rFonts w:asciiTheme="minorHAnsi" w:hAnsiTheme="minorHAnsi" w:cstheme="minorHAnsi"/>
-          <w:w w:val="90"/>
-        </w:rPr>
-        <w:t>in order to</w:t>
-      </w:r>
-      <w:proofErr w:type="gramEnd"/>
-      <w:r>
-        <w:rPr>
-          <w:rFonts w:asciiTheme="minorHAnsi" w:hAnsiTheme="minorHAnsi" w:cstheme="minorHAnsi"/>
-          <w:w w:val="90"/>
-        </w:rPr>
-        <w:t xml:space="preserve"> keep the data in the repository more usable, and the earliest report of a given URL is also the most useful.</w:t>
+        <w:t xml:space="preserve"> code (see below).  The eCX rejects duplicate URLs in order to keep the data in the repository more usable, and the earliest report of a given URL is also the most useful.</w:t>
       </w:r>
     </w:p>
     <w:p>
@@ -3778,17 +6285,24 @@
           <w:rFonts w:asciiTheme="minorHAnsi" w:hAnsiTheme="minorHAnsi" w:cstheme="minorHAnsi"/>
           <w:w w:val="85"/>
         </w:rPr>
-        <w:t xml:space="preserve">IF the result code is 404 THEN your API token key was missing </w:t>
-      </w:r>
-      <w:proofErr w:type="gramStart"/>
+        <w:t xml:space="preserve">IF the result code is 404 THEN your API token key was missing or </w:t>
+      </w:r>
+      <w:del w:id="210" w:author="Tom Anderson" w:date="2021-07-22T18:19:00Z">
+        <w:r>
+          <w:rPr>
+            <w:rFonts w:asciiTheme="minorHAnsi" w:hAnsiTheme="minorHAnsi" w:cstheme="minorHAnsi"/>
+            <w:w w:val="85"/>
+          </w:rPr>
+          <w:delText xml:space="preserve"> </w:delText>
+        </w:r>
+      </w:del>
       <w:r>
         <w:rPr>
           <w:rFonts w:asciiTheme="minorHAnsi" w:hAnsiTheme="minorHAnsi" w:cstheme="minorHAnsi"/>
           <w:w w:val="85"/>
         </w:rPr>
-        <w:t>or  invalid</w:t>
-      </w:r>
-      <w:proofErr w:type="gramEnd"/>
+        <w:t>invalid</w:t>
+      </w:r>
     </w:p>
     <w:p>
       <w:pPr>
@@ -3830,6 +6344,27 @@
         <w:pStyle w:val="BodyText"/>
         <w:spacing w:line="217" w:lineRule="exact"/>
         <w:rPr>
+          <w:moveFrom w:id="211" w:author="Tom Anderson" w:date="2021-07-22T18:19:00Z"/>
+          <w:rFonts w:asciiTheme="minorHAnsi" w:hAnsiTheme="minorHAnsi" w:cstheme="minorHAnsi"/>
+        </w:rPr>
+      </w:pPr>
+      <w:moveFromRangeStart w:id="212" w:author="Tom Anderson" w:date="2021-07-22T18:19:00Z" w:name="move77870358"/>
+      <w:moveFrom w:id="213" w:author="Tom Anderson" w:date="2021-07-22T18:19:00Z">
+        <w:r>
+          <w:rPr>
+            <w:rFonts w:asciiTheme="minorHAnsi" w:hAnsiTheme="minorHAnsi" w:cstheme="minorHAnsi"/>
+            <w:w w:val="85"/>
+          </w:rPr>
+          <w:t>IF the result code is 428 THEN you attempted to POST a phish as a false  positive</w:t>
+        </w:r>
+      </w:moveFrom>
+    </w:p>
+    <w:moveFromRangeEnd w:id="212"/>
+    <w:p>
+      <w:pPr>
+        <w:pStyle w:val="BodyText"/>
+        <w:spacing w:line="226" w:lineRule="exact"/>
+        <w:rPr>
           <w:rFonts w:asciiTheme="minorHAnsi" w:hAnsiTheme="minorHAnsi" w:cstheme="minorHAnsi"/>
         </w:rPr>
       </w:pPr>
@@ -3838,78 +6373,90 @@
           <w:rFonts w:asciiTheme="minorHAnsi" w:hAnsiTheme="minorHAnsi" w:cstheme="minorHAnsi"/>
           <w:w w:val="85"/>
         </w:rPr>
-        <w:t xml:space="preserve">IF the result code is 428 THEN you attempted to POST a phish as a </w:t>
-      </w:r>
-      <w:proofErr w:type="gramStart"/>
+        <w:t>IF the result code is 409 THEN this phish has already been entered</w:t>
+      </w:r>
       <w:r>
         <w:rPr>
           <w:rFonts w:asciiTheme="minorHAnsi" w:hAnsiTheme="minorHAnsi" w:cstheme="minorHAnsi"/>
           <w:w w:val="85"/>
         </w:rPr>
-        <w:t>false  positive</w:t>
-      </w:r>
-      <w:proofErr w:type="gramEnd"/>
-    </w:p>
-    <w:p>
-      <w:pPr>
-        <w:pStyle w:val="BodyText"/>
-        <w:spacing w:line="226" w:lineRule="exact"/>
-        <w:rPr>
-          <w:rFonts w:asciiTheme="minorHAnsi" w:hAnsiTheme="minorHAnsi" w:cstheme="minorHAnsi"/>
-        </w:rPr>
-      </w:pPr>
+        <w:t>; u</w:t>
+      </w:r>
       <w:r>
         <w:rPr>
           <w:rFonts w:asciiTheme="minorHAnsi" w:hAnsiTheme="minorHAnsi" w:cstheme="minorHAnsi"/>
           <w:w w:val="85"/>
         </w:rPr>
-        <w:t>IF the result code is 409 THEN this phish has already been entered</w:t>
-      </w:r>
+        <w:t>se PATCH if you have changes</w:t>
+      </w:r>
+    </w:p>
+    <w:p>
+      <w:pPr>
+        <w:pStyle w:val="BodyText"/>
+        <w:spacing w:line="238" w:lineRule="exact"/>
+        <w:rPr>
+          <w:rFonts w:asciiTheme="minorHAnsi" w:hAnsiTheme="minorHAnsi" w:cstheme="minorHAnsi"/>
+        </w:rPr>
+      </w:pPr>
       <w:r>
         <w:rPr>
           <w:rFonts w:asciiTheme="minorHAnsi" w:hAnsiTheme="minorHAnsi" w:cstheme="minorHAnsi"/>
           <w:w w:val="85"/>
         </w:rPr>
-        <w:t>; u</w:t>
+        <w:t xml:space="preserve">IF the result code is 412 THEN you attempted to POST a phish with a known good domain on our domains </w:t>
       </w:r>
       <w:r>
         <w:rPr>
           <w:rFonts w:asciiTheme="minorHAnsi" w:hAnsiTheme="minorHAnsi" w:cstheme="minorHAnsi"/>
           <w:w w:val="85"/>
         </w:rPr>
-        <w:t>se PATCH if you have changes</w:t>
-      </w:r>
-    </w:p>
-    <w:p>
-      <w:pPr>
-        <w:pStyle w:val="BodyText"/>
-        <w:spacing w:line="238" w:lineRule="exact"/>
-        <w:rPr>
-          <w:rFonts w:asciiTheme="minorHAnsi" w:hAnsiTheme="minorHAnsi" w:cstheme="minorHAnsi"/>
-        </w:rPr>
-      </w:pPr>
+        <w:t>white</w:t>
+      </w:r>
       <w:r>
         <w:rPr>
           <w:rFonts w:asciiTheme="minorHAnsi" w:hAnsiTheme="minorHAnsi" w:cstheme="minorHAnsi"/>
           <w:w w:val="85"/>
         </w:rPr>
-        <w:t xml:space="preserve">IF the result code is 412 THEN you attempted to POST a phish with a known good domain on our domains </w:t>
-      </w:r>
-      <w:r>
-        <w:rPr>
-          <w:rFonts w:asciiTheme="minorHAnsi" w:hAnsiTheme="minorHAnsi" w:cstheme="minorHAnsi"/>
-          <w:w w:val="85"/>
-        </w:rPr>
-        <w:t>white</w:t>
-      </w:r>
-      <w:r>
-        <w:rPr>
-          <w:rFonts w:asciiTheme="minorHAnsi" w:hAnsiTheme="minorHAnsi" w:cstheme="minorHAnsi"/>
-          <w:w w:val="85"/>
-        </w:rPr>
         <w:t>list</w:t>
       </w:r>
     </w:p>
+    <w:p>
+      <w:pPr>
+        <w:pStyle w:val="BodyText"/>
+        <w:spacing w:line="217" w:lineRule="exact"/>
+        <w:rPr>
+          <w:moveTo w:id="214" w:author="Tom Anderson" w:date="2021-07-22T18:19:00Z"/>
+          <w:rFonts w:asciiTheme="minorHAnsi" w:hAnsiTheme="minorHAnsi" w:cstheme="minorHAnsi"/>
+        </w:rPr>
+      </w:pPr>
+      <w:moveToRangeStart w:id="215" w:author="Tom Anderson" w:date="2021-07-22T18:19:00Z" w:name="move77870358"/>
+      <w:moveTo w:id="216" w:author="Tom Anderson" w:date="2021-07-22T18:19:00Z">
+        <w:r>
+          <w:rPr>
+            <w:rFonts w:asciiTheme="minorHAnsi" w:hAnsiTheme="minorHAnsi" w:cstheme="minorHAnsi"/>
+            <w:w w:val="85"/>
+          </w:rPr>
+          <w:t xml:space="preserve">IF the result code is 428 THEN you attempted to POST a phish as a false </w:t>
+        </w:r>
+        <w:del w:id="217" w:author="Tom Anderson" w:date="2021-07-22T18:19:00Z">
+          <w:r>
+            <w:rPr>
+              <w:rFonts w:asciiTheme="minorHAnsi" w:hAnsiTheme="minorHAnsi" w:cstheme="minorHAnsi"/>
+              <w:w w:val="85"/>
+            </w:rPr>
+            <w:delText xml:space="preserve"> </w:delText>
+          </w:r>
+        </w:del>
+        <w:r>
+          <w:rPr>
+            <w:rFonts w:asciiTheme="minorHAnsi" w:hAnsiTheme="minorHAnsi" w:cstheme="minorHAnsi"/>
+            <w:w w:val="85"/>
+          </w:rPr>
+          <w:t>positive</w:t>
+        </w:r>
+      </w:moveTo>
+    </w:p>
+    <w:moveToRangeEnd w:id="215"/>
     <w:p>
       <w:pPr>
         <w:pStyle w:val="BodyText"/>
@@ -4013,7 +6560,7 @@
         </w:rPr>
         <w:t>"</w:t>
       </w:r>
-      <w:hyperlink r:id="rId24">
+      <w:hyperlink r:id="rId23">
         <w:r>
           <w:rPr>
             <w:rFonts w:asciiTheme="minorHAnsi" w:hAnsiTheme="minorHAnsi" w:cstheme="minorHAnsi"/>
@@ -4315,23 +6862,7 @@
           <w:rFonts w:asciiTheme="minorHAnsi" w:hAnsiTheme="minorHAnsi" w:cstheme="minorHAnsi"/>
           <w:w w:val="95"/>
         </w:rPr>
-        <w:t xml:space="preserve">Upon a successful submission the eCX API will </w:t>
-      </w:r>
-      <w:proofErr w:type="gramStart"/>
-      <w:r>
-        <w:rPr>
-          <w:rFonts w:asciiTheme="minorHAnsi" w:hAnsiTheme="minorHAnsi" w:cstheme="minorHAnsi"/>
-          <w:w w:val="95"/>
-        </w:rPr>
-        <w:t>return back</w:t>
-      </w:r>
-      <w:proofErr w:type="gramEnd"/>
-      <w:r>
-        <w:rPr>
-          <w:rFonts w:asciiTheme="minorHAnsi" w:hAnsiTheme="minorHAnsi" w:cstheme="minorHAnsi"/>
-          <w:w w:val="95"/>
-        </w:rPr>
-        <w:t xml:space="preserve"> a response body that contains the data we </w:t>
+        <w:t xml:space="preserve">Upon a successful submission the eCX API will return back a response body that contains the data we </w:t>
       </w:r>
       <w:r>
         <w:rPr>
@@ -4380,21 +6911,12 @@
           <w:rFonts w:asciiTheme="minorHAnsi" w:hAnsiTheme="minorHAnsi" w:cstheme="minorHAnsi"/>
         </w:rPr>
       </w:pPr>
-      <w:proofErr w:type="gramStart"/>
       <w:r>
         <w:rPr>
           <w:rFonts w:asciiTheme="minorHAnsi" w:hAnsiTheme="minorHAnsi" w:cstheme="minorHAnsi"/>
           <w:w w:val="95"/>
         </w:rPr>
-        <w:t>We’re</w:t>
-      </w:r>
-      <w:proofErr w:type="gramEnd"/>
-      <w:r>
-        <w:rPr>
-          <w:rFonts w:asciiTheme="minorHAnsi" w:hAnsiTheme="minorHAnsi" w:cstheme="minorHAnsi"/>
-          <w:w w:val="95"/>
-        </w:rPr>
-        <w:t xml:space="preserve"> a PHP shop, so the coding examples that follow will be in PHP, but the logic should be easy enough to translate into another programming language.</w:t>
+        <w:t>We’re a PHP shop, so the coding examples that follow will be in PHP, but the logic should be easy enough to translate into another programming language.</w:t>
       </w:r>
     </w:p>
     <w:p>
@@ -4448,7 +6970,7 @@
         <w:rPr>
           <w:rFonts w:asciiTheme="minorHAnsi" w:hAnsiTheme="minorHAnsi" w:cstheme="minorHAnsi"/>
         </w:rPr>
-        <w:pict w14:anchorId="56EF7D1A">
+        <w:pict w14:anchorId="0591930E">
           <v:group id="_x0000_s1164" alt="" style="width:108.2pt;height:112.85pt;mso-position-horizontal-relative:char;mso-position-vertical-relative:line" coordsize="2164,2257">
             <v:line id="_x0000_s1165" alt="" style="position:absolute" from="1168,547" to="1168,862" strokeweight=".26436mm"/>
             <v:shape id="_x0000_s1166" alt="" style="position:absolute;left:1103;top:845;width:131;height:196" coordorigin="1103,845" coordsize="131,196" path="m1234,845r-131,l1168,1041r66,-196xe" fillcolor="black" stroked="f">
@@ -4632,7 +7154,7 @@
           <w:rFonts w:asciiTheme="minorHAnsi" w:hAnsiTheme="minorHAnsi" w:cstheme="minorHAnsi"/>
           <w:position w:val="107"/>
         </w:rPr>
-        <w:pict w14:anchorId="41BC6B70">
+        <w:pict w14:anchorId="1B1A1DDC">
           <v:group id="_x0000_s1161" alt="" style="width:72.65pt;height:54.7pt;mso-position-horizontal-relative:char;mso-position-vertical-relative:line" coordsize="1453,1094">
             <v:shape id="_x0000_s1162" alt="" style="position:absolute;left:8;top:8;width:1438;height:1079" coordorigin="8,8" coordsize="1438,1079" path="m8,966l8,8r1437,l1445,966r-66,-43l1309,890r-73,-24l1161,851r-76,-5l1010,851r-75,15l862,890r-70,33l726,966r-66,43l590,1043r-73,24l442,1081r-75,5l291,1081r-75,-14l144,1043,74,1009,8,966xe" filled="f" strokeweight=".26447mm">
               <v:path arrowok="t"/>
@@ -4699,7 +7221,7 @@
         <w:rPr>
           <w:rFonts w:asciiTheme="minorHAnsi" w:hAnsiTheme="minorHAnsi" w:cstheme="minorHAnsi"/>
         </w:rPr>
-        <w:pict w14:anchorId="74728CC3">
+        <w:pict w14:anchorId="1A4D9AF3">
           <v:group id="_x0000_s1157" alt="" style="position:absolute;left:0;text-align:left;margin-left:72.95pt;margin-top:-49.1pt;width:85.9pt;height:27.75pt;z-index:-16912;mso-position-horizontal-relative:page" coordorigin="1459,-982" coordsize="1718,555">
             <v:shape id="_x0000_s1158" alt="" style="position:absolute;left:25;top:602;width:1707;height:540" coordorigin="25,602" coordsize="1707,540" o:spt="100" adj="0,,0" path="m1736,-435r898,l2706,-444r64,-28l2824,-514r43,-54l2894,-633r9,-71l2894,-776r-27,-65l2824,-895r-54,-42l2706,-964r-72,-10l1736,-974r-72,10l1600,-937r-55,42l1503,-841r-27,65l1466,-704r10,71l1503,-568r42,54l1600,-472r64,28l1736,-435xm3018,-704r151,e" filled="f" strokeweight=".26444mm">
               <v:stroke joinstyle="round"/>
@@ -4738,7 +7260,7 @@
         <w:rPr>
           <w:rFonts w:asciiTheme="minorHAnsi" w:hAnsiTheme="minorHAnsi" w:cstheme="minorHAnsi"/>
         </w:rPr>
-        <w:pict w14:anchorId="698F1650">
+        <w:pict w14:anchorId="148307B1">
           <v:group id="_x0000_s1154" alt="" style="position:absolute;left:0;text-align:left;margin-left:167.45pt;margin-top:7.4pt;width:85.95pt;height:67.6pt;z-index:-16816;mso-position-horizontal-relative:page" coordorigin="3349,148" coordsize="1719,1352">
             <v:shape id="_x0000_s1155" alt="" style="position:absolute;left:1919;top:1733;width:1707;height:1338" coordorigin="1919,1733" coordsize="1707,1338" o:spt="100" adj="0,,0" path="m3622,824l4341,284r718,540l4341,1363,3622,824xm3356,824r266,m4341,1363r,129m4341,155r,129e" filled="f" strokeweight=".26444mm">
               <v:stroke joinstyle="round"/>
@@ -4840,7 +7362,7 @@
         <w:rPr>
           <w:rFonts w:asciiTheme="minorHAnsi" w:hAnsiTheme="minorHAnsi" w:cstheme="minorHAnsi"/>
         </w:rPr>
-        <w:pict w14:anchorId="3157F678">
+        <w:pict w14:anchorId="0FAF1892">
           <v:group id="_x0000_s1150" alt="" style="position:absolute;left:0;text-align:left;margin-left:72.95pt;margin-top:-5.25pt;width:85.9pt;height:27.75pt;z-index:-16960;mso-position-horizontal-relative:page" coordorigin="1459,-105" coordsize="1718,555">
             <v:shape id="_x0000_s1151" alt="" style="position:absolute;left:25;top:1480;width:1707;height:540" coordorigin="25,1480" coordsize="1707,540" o:spt="100" adj="0,,0" path="m1736,442r898,l2706,432r64,-27l2824,363r43,-55l2894,244r9,-72l2894,100,2867,36r-43,-55l2770,-61r-64,-27l2634,-98r-898,l1664,-88r-64,27l1545,-19r-42,55l1476,100r-10,72l1476,244r27,64l1545,363r55,42l1664,432r72,10xm3018,172r151,e" filled="f" strokeweight=".26444mm">
               <v:stroke joinstyle="round"/>
@@ -4928,7 +7450,7 @@
         <w:rPr>
           <w:rFonts w:asciiTheme="minorHAnsi" w:hAnsiTheme="minorHAnsi" w:cstheme="minorHAnsi"/>
         </w:rPr>
-        <w:pict w14:anchorId="169739A8">
+        <w:pict w14:anchorId="144041D0">
           <v:group id="_x0000_s1146" alt="" style="position:absolute;left:0;text-align:left;margin-left:72.95pt;margin-top:96.35pt;width:86.25pt;height:27.75pt;z-index:-17008;mso-position-horizontal-relative:page" coordorigin="1459,1927" coordsize="1725,555">
             <v:shape id="_x0000_s1147" alt="" style="position:absolute;left:25;top:3516;width:1713;height:540" coordorigin="25,3516" coordsize="1713,540" o:spt="100" adj="0,,0" path="m1736,2473r898,l2706,2464r64,-27l2824,2394r43,-54l2894,2275r9,-71l2894,2132r-27,-64l2824,2013r-54,-42l2706,1944r-72,-10l1736,1934r-72,10l1600,1971r-55,42l1503,2068r-27,64l1466,2204r10,71l1503,2340r42,54l1600,2437r64,27l1736,2473xm3018,2204r157,e" filled="f" strokeweight=".26444mm">
               <v:stroke joinstyle="round"/>
@@ -4967,7 +7489,7 @@
         <w:rPr>
           <w:rFonts w:asciiTheme="minorHAnsi" w:hAnsiTheme="minorHAnsi" w:cstheme="minorHAnsi"/>
         </w:rPr>
-        <w:pict w14:anchorId="428B9043">
+        <w:pict w14:anchorId="7770322C">
           <v:group id="_x0000_s1142" alt="" style="position:absolute;left:0;text-align:left;margin-left:72.95pt;margin-top:19.95pt;width:85.9pt;height:27.75pt;z-index:-16864;mso-position-horizontal-relative:page" coordorigin="1459,399" coordsize="1718,555">
             <v:shape id="_x0000_s1143" alt="" style="position:absolute;left:25;top:1986;width:1707;height:540" coordorigin="25,1986" coordsize="1707,540" o:spt="100" adj="0,,0" path="m1736,945r898,l2706,936r64,-27l2824,866r43,-54l2894,747r9,-71l2894,604r-27,-64l2824,485r-54,-42l2706,416r-72,-10l1736,406r-72,10l1600,443r-55,42l1503,540r-27,64l1466,676r10,71l1503,812r42,54l1600,909r64,27l1736,945xm3018,676r151,e" filled="f" strokeweight=".26444mm">
               <v:stroke joinstyle="round"/>
@@ -5011,7 +7533,7 @@
         <w:rPr>
           <w:rFonts w:asciiTheme="minorHAnsi" w:hAnsiTheme="minorHAnsi" w:cstheme="minorHAnsi"/>
         </w:rPr>
-        <w:pict w14:anchorId="118AF59A">
+        <w:pict w14:anchorId="20447189">
           <v:group id="_x0000_s1123" alt="" style="width:129.65pt;height:220.4pt;mso-position-horizontal-relative:char;mso-position-vertical-relative:line" coordsize="2593,4408">
             <v:line id="_x0000_s1124" alt="" style="position:absolute" from="1932,3687" to="2585,3687" strokeweight=".26453mm"/>
             <v:line id="_x0000_s1125" alt="" style="position:absolute" from="1213,4226" to="1213,4400" strokeweight=".26436mm"/>
@@ -5051,7 +7573,7 @@
               <o:lock v:ext="edit" aspectratio="t"/>
             </v:shapetype>
             <v:shape id="_x0000_s1134" type="#_x0000_t75" alt="" style="position:absolute;left:1119;top:2736;width:187;height:412">
-              <v:imagedata r:id="rId25" o:title=""/>
+              <v:imagedata r:id="rId24" o:title=""/>
             </v:shape>
             <v:shape id="_x0000_s1135" type="#_x0000_t202" alt="" style="position:absolute;top:605;width:212;height:166;mso-wrap-style:square;v-text-anchor:top" filled="f" stroked="f">
               <v:textbox inset="0,0,0,0">
@@ -5243,7 +7765,7 @@
         <w:rPr>
           <w:rFonts w:asciiTheme="minorHAnsi" w:hAnsiTheme="minorHAnsi" w:cstheme="minorHAnsi"/>
         </w:rPr>
-        <w:pict w14:anchorId="1AFCC906">
+        <w:pict w14:anchorId="164C05BB">
           <v:group id="_x0000_s1118" alt="" style="position:absolute;left:0;text-align:left;margin-left:171.15pt;margin-top:7.7pt;width:84.45pt;height:72.1pt;z-index:-17248;mso-position-horizontal-relative:page" coordorigin="3423,154" coordsize="1689,1442">
             <v:shape id="_x0000_s1119" alt="" style="position:absolute;left:2202;top:1747;width:749;height:714" coordorigin="2202,1747" coordsize="749,714" o:spt="100" adj="0,,0" path="m3639,875r28,m4386,162r,59e" filled="f" strokeweight=".26444mm">
               <v:stroke joinstyle="round"/>
@@ -5331,7 +7853,7 @@
         <w:rPr>
           <w:rFonts w:asciiTheme="minorHAnsi" w:hAnsiTheme="minorHAnsi" w:cstheme="minorHAnsi"/>
         </w:rPr>
-        <w:pict w14:anchorId="6EB8A7DE">
+        <w:pict w14:anchorId="41040785">
           <v:group id="_x0000_s1100" alt="" style="position:absolute;left:0;text-align:left;margin-left:288.35pt;margin-top:-51pt;width:144.15pt;height:203pt;z-index:1696;mso-position-horizontal-relative:page" coordorigin="5767,-1020" coordsize="2883,4060">
             <v:shape id="_x0000_s1101" alt="" style="position:absolute;left:5020;top:1741;width:2070;height:2881" coordorigin="5020,1741" coordsize="2070,2881" o:spt="100" adj="0,,0" path="m6901,2268r898,l7871,2259r64,-28l7990,2189r42,-54l8059,2070r10,-71l8059,1927r-27,-65l7990,1808r-55,-42l7871,1738r-72,-9l6901,1729r-72,9l6765,1766r-55,42l6668,1862r-27,65l6631,1999r10,71l6668,2135r42,54l6765,2231r64,28l6901,2268xm6452,830l7350,156r898,674l7350,1504,6452,830xm8248,830r270,l8518,2763r-335,m6901,3032r898,l7871,3023r64,-28l7990,2953r42,-54l8059,2834r10,-71l8059,2691r-27,-65l7990,2572r-55,-42l7871,2503r-72,-10l6901,2493r-72,10l6765,2530r-55,42l6668,2626r-27,65l6631,2763r10,71l6668,2899r42,54l6765,2995r64,28l6901,3032xe" filled="f" strokeweight=".26444mm">
               <v:stroke joinstyle="round"/>
@@ -5648,7 +8170,7 @@
         <w:rPr>
           <w:rFonts w:asciiTheme="minorHAnsi" w:hAnsiTheme="minorHAnsi" w:cstheme="minorHAnsi"/>
         </w:rPr>
-        <w:pict w14:anchorId="3D0CF4CC">
+        <w:pict w14:anchorId="7F2CD9AB">
           <v:group id="_x0000_s1096" alt="" style="position:absolute;left:0;text-align:left;margin-left:72.95pt;margin-top:-.8pt;width:82.05pt;height:27.75pt;z-index:-17296;mso-position-horizontal-relative:page" coordorigin="1459,-16" coordsize="1641,555">
             <v:shape id="_x0000_s1097" alt="" style="position:absolute;left:1466;top:-9;width:1438;height:540" coordorigin="1466,-9" coordsize="1438,540" path="m1736,530r898,l2706,521r64,-27l2824,452r43,-55l2894,333r9,-72l2894,189r-27,-64l2824,70,2770,28,2706,1,2634,-9r-898,l1664,1r-64,27l1545,70r-42,55l1476,189r-10,72l1476,333r27,64l1545,452r55,42l1664,521r72,9xe" filled="f" strokeweight=".2645mm">
               <v:path arrowok="t"/>
@@ -5757,7 +8279,7 @@
         <w:rPr>
           <w:rFonts w:asciiTheme="minorHAnsi" w:hAnsiTheme="minorHAnsi" w:cstheme="minorHAnsi"/>
         </w:rPr>
-        <w:pict w14:anchorId="75E0FDB0">
+        <w:pict w14:anchorId="21118118">
           <v:group id="_x0000_s1087" alt="" style="width:164.7pt;height:108.35pt;mso-position-horizontal-relative:char;mso-position-vertical-relative:line" coordsize="3294,2167">
             <v:rect id="_x0000_s1088" alt="" style="position:absolute;left:1849;top:181;width:1437;height:1079" filled="f" strokeweight=".26447mm"/>
             <v:shape id="_x0000_s1089" alt="" style="position:absolute;left:1559;top:1260;width:1009;height:630" coordorigin="1559,1260" coordsize="1009,630" path="m2568,1260r,629l1559,1889e" filled="f" strokeweight=".26447mm">
@@ -6409,7 +8931,7 @@
         </w:rPr>
         <w:t>"</w:t>
       </w:r>
-      <w:hyperlink r:id="rId26">
+      <w:hyperlink r:id="rId25">
         <w:r>
           <w:rPr>
             <w:rFonts w:asciiTheme="minorHAnsi" w:hAnsiTheme="minorHAnsi" w:cstheme="minorHAnsi"/>
@@ -7551,7 +10073,7 @@
         </w:rPr>
         <w:t>"</w:t>
       </w:r>
-      <w:hyperlink r:id="rId27">
+      <w:hyperlink r:id="rId26">
         <w:r>
           <w:rPr>
             <w:rFonts w:asciiTheme="minorHAnsi" w:hAnsiTheme="minorHAnsi" w:cstheme="minorHAnsi"/>
@@ -7829,7 +10351,7 @@
                     <pic:cNvPicPr/>
                   </pic:nvPicPr>
                   <pic:blipFill>
-                    <a:blip r:embed="rId28" cstate="print"/>
+                    <a:blip r:embed="rId27" cstate="print"/>
                     <a:stretch>
                       <a:fillRect/>
                     </a:stretch>
@@ -7968,7 +10490,7 @@
                     <pic:cNvPicPr/>
                   </pic:nvPicPr>
                   <pic:blipFill>
-                    <a:blip r:embed="rId29" cstate="print"/>
+                    <a:blip r:embed="rId28" cstate="print"/>
                     <a:stretch>
                       <a:fillRect/>
                     </a:stretch>
@@ -8033,7 +10555,7 @@
         <w:rPr>
           <w:rFonts w:asciiTheme="minorHAnsi" w:hAnsiTheme="minorHAnsi" w:cstheme="minorHAnsi"/>
         </w:rPr>
-        <w:pict w14:anchorId="096FC5A6">
+        <w:pict w14:anchorId="674221C3">
           <v:group id="_x0000_s1084" alt="" style="position:absolute;margin-left:323.45pt;margin-top:10.65pt;width:69.9pt;height:52.7pt;z-index:2032;mso-wrap-distance-left:0;mso-wrap-distance-right:0;mso-position-horizontal-relative:page" coordorigin="6469,213" coordsize="1398,1054">
             <v:shape id="_x0000_s1085" alt="" style="position:absolute;left:6477;top:220;width:1383;height:1039" coordorigin="6477,220" coordsize="1383,1039" path="m6477,1144r,-924l7859,220r,924l7795,1102r-67,-32l7658,1047r-72,-14l7513,1028r-72,5l7369,1047r-70,23l7231,1102r-63,42l7104,1185r-67,33l6967,1241r-72,14l6822,1259r-73,-4l6677,1241r-70,-23l6540,1185r-63,-41xe" filled="f" strokeweight=".25458mm">
               <v:path arrowok="t"/>
@@ -8122,7 +10644,7 @@
         <w:rPr>
           <w:rFonts w:asciiTheme="minorHAnsi" w:hAnsiTheme="minorHAnsi" w:cstheme="minorHAnsi"/>
         </w:rPr>
-        <w:pict w14:anchorId="1FFE2F6C">
+        <w:pict w14:anchorId="0353045F">
           <v:group id="_x0000_s1079" alt="" style="position:absolute;left:0;text-align:left;margin-left:176.75pt;margin-top:-65.35pt;width:108.6pt;height:106.55pt;z-index:-16504;mso-position-horizontal-relative:page" coordorigin="3535,-1307" coordsize="2172,2131">
             <v:shape id="_x0000_s1080" alt="" style="position:absolute;left:2189;top:-160;width:2247;height:2199" coordorigin="2189,-160" coordsize="2247,2199" o:spt="100" adj="0,,0" path="m4057,-780r1383,l5509,-790r62,-26l5623,-856r41,-53l5690,-971r9,-69l5690,-1109r-26,-62l5623,-1224r-52,-40l5509,-1290r-69,-10l4057,-1300r-69,10l3926,-1264r-52,40l3833,-1171r-26,62l3798,-1040r9,69l3833,-909r41,53l3926,-816r62,26l4057,-780xm4749,-780r,323m4057,172r692,-519l5440,172,4749,691,4057,172xm3542,172r515,m4749,691r,124e" filled="f" strokeweight=".2545mm">
               <v:stroke joinstyle="round"/>
@@ -8253,7 +10775,7 @@
         <w:rPr>
           <w:rFonts w:asciiTheme="minorHAnsi" w:hAnsiTheme="minorHAnsi" w:cstheme="minorHAnsi"/>
         </w:rPr>
-        <w:pict w14:anchorId="756E0BF6">
+        <w:pict w14:anchorId="65E55F90">
           <v:group id="_x0000_s1075" alt="" style="position:absolute;left:0;text-align:left;margin-left:72.9pt;margin-top:-4.75pt;width:95.65pt;height:26.75pt;z-index:-16216;mso-position-horizontal-relative:page" coordorigin="1458,-95" coordsize="1913,535">
             <v:shape id="_x0000_s1076" alt="" style="position:absolute;left:25;top:1100;width:1977;height:540" coordorigin="25,1100" coordsize="1977,540" o:spt="100" adj="0,,0" path="m1724,432r864,l2657,422r62,-26l2772,356r40,-53l2838,241r10,-69l2838,103,2812,41r-40,-53l2719,-52r-62,-26l2588,-88r-864,l1655,-78r-62,26l1541,-12r-41,53l1474,103r-9,69l1474,241r26,62l1541,356r52,40l1655,422r69,10xm2957,172r405,e" filled="f" strokeweight=".2545mm">
               <v:stroke joinstyle="round"/>
@@ -8326,7 +10848,7 @@
         <w:rPr>
           <w:rFonts w:asciiTheme="minorHAnsi" w:hAnsiTheme="minorHAnsi" w:cstheme="minorHAnsi"/>
         </w:rPr>
-        <w:pict w14:anchorId="19CDD262">
+        <w:pict w14:anchorId="232C3639">
           <v:group id="_x0000_s1072" alt="" style="position:absolute;left:0;text-align:left;margin-left:176.75pt;margin-top:12.75pt;width:95.65pt;height:65.1pt;z-index:-16072;mso-position-horizontal-relative:page" coordorigin="3535,255" coordsize="1913,1302">
             <v:shape id="_x0000_s1073" alt="" style="position:absolute;left:2189;top:1493;width:1977;height:1338" coordorigin="2189,1493" coordsize="1977,1338" o:spt="100" adj="0,,0" path="m4057,906l4749,386r691,520l4749,1425,4057,906xm3542,906r515,m4749,1425r,124m4749,262r,124e" filled="f" strokeweight=".2545mm">
               <v:stroke joinstyle="round"/>
@@ -8429,7 +10951,7 @@
         <w:rPr>
           <w:rFonts w:asciiTheme="minorHAnsi" w:hAnsiTheme="minorHAnsi" w:cstheme="minorHAnsi"/>
         </w:rPr>
-        <w:pict w14:anchorId="080CB061">
+        <w:pict w14:anchorId="1D310C03">
           <v:group id="_x0000_s1068" alt="" style="position:absolute;left:0;text-align:left;margin-left:72.9pt;margin-top:-4.9pt;width:95.65pt;height:26.75pt;z-index:-16264;mso-position-horizontal-relative:page" coordorigin="1458,-98" coordsize="1913,535">
             <v:shape id="_x0000_s1069" alt="" style="position:absolute;left:25;top:1155;width:1977;height:540" coordorigin="25,1155" coordsize="1977,540" o:spt="100" adj="0,,0" path="m1724,429r864,l2657,419r62,-26l2772,353r40,-53l2838,238r10,-69l2838,100,2812,38r-40,-53l2719,-55r-62,-26l2588,-91r-864,l1655,-81r-62,26l1541,-15r-41,53l1474,100r-9,69l1474,238r26,62l1541,353r52,40l1655,419r69,10xm2957,169r405,e" filled="f" strokeweight=".2545mm">
               <v:stroke joinstyle="round"/>
@@ -8502,7 +11024,7 @@
         <w:rPr>
           <w:rFonts w:asciiTheme="minorHAnsi" w:hAnsiTheme="minorHAnsi" w:cstheme="minorHAnsi"/>
         </w:rPr>
-        <w:pict w14:anchorId="69D7243F">
+        <w:pict w14:anchorId="255636A6">
           <v:group id="_x0000_s1065" alt="" style="position:absolute;left:0;text-align:left;margin-left:176.75pt;margin-top:12.65pt;width:95.65pt;height:66.75pt;z-index:-16120;mso-position-horizontal-relative:page" coordorigin="3535,253" coordsize="1913,1335">
             <v:shape id="_x0000_s1066" alt="" style="position:absolute;left:2189;top:1549;width:1977;height:1372" coordorigin="2189,1549" coordsize="1977,1372" o:spt="100" adj="0,,0" path="m4057,904l4749,385r691,519l4749,1423,4057,904xm3542,904r515,m4749,260r,125m4749,1423r,157e" filled="f" strokeweight=".2545mm">
               <v:stroke joinstyle="round"/>
@@ -8602,7 +11124,7 @@
         <w:rPr>
           <w:rFonts w:asciiTheme="minorHAnsi" w:hAnsiTheme="minorHAnsi" w:cstheme="minorHAnsi"/>
         </w:rPr>
-        <w:pict w14:anchorId="7D9668C3">
+        <w:pict w14:anchorId="738433A0">
           <v:group id="_x0000_s1061" alt="" style="position:absolute;left:0;text-align:left;margin-left:72.9pt;margin-top:-5pt;width:95.65pt;height:26.75pt;z-index:-16168;mso-position-horizontal-relative:page" coordorigin="1458,-100" coordsize="1913,535">
             <v:shape id="_x0000_s1062" alt="" style="position:absolute;left:25;top:1212;width:1977;height:540" coordorigin="25,1212" coordsize="1977,540" o:spt="100" adj="0,,0" path="m1724,427r864,l2657,418r62,-27l2772,351r40,-53l2838,236r10,-69l2838,98,2812,36r-40,-53l2719,-57r-62,-26l2588,-93r-864,l1655,-83r-62,26l1541,-17r-41,53l1474,98r-9,69l1474,236r26,62l1541,351r52,40l1655,418r69,9xm2957,167r405,e" filled="f" strokeweight=".2545mm">
               <v:stroke joinstyle="round"/>
@@ -8676,7 +11198,7 @@
         <w:rPr>
           <w:rFonts w:asciiTheme="minorHAnsi" w:hAnsiTheme="minorHAnsi" w:cstheme="minorHAnsi"/>
         </w:rPr>
-        <w:pict w14:anchorId="0E3E05EA">
+        <w:pict w14:anchorId="4AA669A7">
           <v:group id="_x0000_s1057" alt="" style="position:absolute;left:0;text-align:left;margin-left:176.75pt;margin-top:12.55pt;width:95.65pt;height:66.75pt;z-index:-16456;mso-position-horizontal-relative:page" coordorigin="3535,251" coordsize="1913,1335">
             <v:shape id="_x0000_s1058" alt="" style="position:absolute;left:2189;top:1607;width:1977;height:1372" coordorigin="2189,1607" coordsize="1977,1372" o:spt="100" adj="0,,0" path="m4057,935l4749,415r691,520l4749,1454,4057,935xm4749,1454r,124m3542,935r515,m4749,259r,46e" filled="f" strokeweight=".2545mm">
               <v:stroke joinstyle="round"/>
@@ -8782,7 +11304,7 @@
         <w:rPr>
           <w:rFonts w:asciiTheme="minorHAnsi" w:hAnsiTheme="minorHAnsi" w:cstheme="minorHAnsi"/>
         </w:rPr>
-        <w:pict w14:anchorId="7C75AC42">
+        <w:pict w14:anchorId="28C6BD7D">
           <v:group id="_x0000_s1053" alt="" style="position:absolute;left:0;text-align:left;margin-left:72.9pt;margin-top:-5.05pt;width:95.65pt;height:26.75pt;z-index:-16360;mso-position-horizontal-relative:page" coordorigin="1458,-101" coordsize="1913,535">
             <v:shape id="_x0000_s1054" alt="" style="position:absolute;left:25;top:1272;width:1977;height:540" coordorigin="25,1272" coordsize="1977,540" o:spt="100" adj="0,,0" path="m1724,426r864,l2657,417r62,-26l2772,350r40,-52l2838,236r10,-69l2838,98,2812,36r-40,-53l2719,-58r-62,-26l2588,-93r-864,l1655,-84r-62,26l1541,-17r-41,53l1474,98r-9,69l1474,236r26,62l1541,350r52,41l1655,417r69,9xm2957,167r405,e" filled="f" strokeweight=".2545mm">
               <v:stroke joinstyle="round"/>
@@ -8855,7 +11377,7 @@
         <w:rPr>
           <w:rFonts w:asciiTheme="minorHAnsi" w:hAnsiTheme="minorHAnsi" w:cstheme="minorHAnsi"/>
         </w:rPr>
-        <w:pict w14:anchorId="495E6067">
+        <w:pict w14:anchorId="5753F00F">
           <v:group id="_x0000_s1048" alt="" style="position:absolute;left:0;text-align:left;margin-left:176.75pt;margin-top:12.5pt;width:95.65pt;height:64.05pt;z-index:-16408;mso-position-horizontal-relative:page" coordorigin="3535,250" coordsize="1913,1281">
             <v:line id="_x0000_s1049" alt="" style="position:absolute" from="4749,258" to="4749,272" strokeweight=".25428mm"/>
             <v:shape id="_x0000_s1050" alt="" style="position:absolute;left:4686;top:256;width:126;height:126" coordorigin="4686,256" coordsize="126,126" path="m4811,256r-125,l4749,382r62,-126xe" fillcolor="black" stroked="f">
@@ -8952,7 +11474,7 @@
         <w:rPr>
           <w:rFonts w:asciiTheme="minorHAnsi" w:hAnsiTheme="minorHAnsi" w:cstheme="minorHAnsi"/>
         </w:rPr>
-        <w:pict w14:anchorId="44A53625">
+        <w:pict w14:anchorId="1AD00F04">
           <v:group id="_x0000_s1044" alt="" style="position:absolute;left:0;text-align:left;margin-left:72.9pt;margin-top:-5.2pt;width:95.65pt;height:26.75pt;z-index:-16024;mso-position-horizontal-relative:page" coordorigin="1458,-104" coordsize="1913,535">
             <v:shape id="_x0000_s1045" alt="" style="position:absolute;left:25;top:1327;width:1977;height:540" coordorigin="25,1327" coordsize="1977,540" o:spt="100" adj="0,,0" path="m1724,423r864,l2657,414r62,-26l2772,347r40,-52l2838,233r10,-69l2838,95,2812,33r-40,-53l2719,-61r-62,-26l2588,-96r-864,l1655,-87r-62,26l1541,-20r-41,53l1474,95r-9,69l1474,233r26,62l1541,347r52,41l1655,414r69,9xm2957,164r405,e" filled="f" strokeweight=".2545mm">
               <v:stroke joinstyle="round"/>
@@ -9043,7 +11565,7 @@
           <w:rFonts w:asciiTheme="minorHAnsi" w:hAnsiTheme="minorHAnsi" w:cstheme="minorHAnsi"/>
         </w:rPr>
         <w:lastRenderedPageBreak/>
-        <w:pict w14:anchorId="111B0468">
+        <w:pict w14:anchorId="14AFBBEF">
           <v:group id="_x0000_s1040" alt="" style="position:absolute;left:0;text-align:left;margin-left:72.9pt;margin-top:18.1pt;width:95.65pt;height:26.75pt;z-index:-16312;mso-position-horizontal-relative:page" coordorigin="1458,362" coordsize="1913,535">
             <v:shape id="_x0000_s1041" alt="" style="position:absolute;left:25;top:1850;width:1977;height:540" coordorigin="25,1850" coordsize="1977,540" o:spt="100" adj="0,,0" path="m1724,889r864,l2657,880r62,-26l2772,813r40,-53l2838,698r10,-69l2838,560r-26,-62l2772,446r-53,-41l2657,379r-69,-9l1724,370r-69,9l1593,405r-52,41l1500,498r-26,62l1465,629r9,69l1500,760r41,53l1593,854r62,26l1724,889xm2957,629r405,e" filled="f" strokeweight=".2545mm">
               <v:stroke joinstyle="round"/>
@@ -9087,7 +11609,7 @@
         <w:rPr>
           <w:rFonts w:asciiTheme="minorHAnsi" w:hAnsiTheme="minorHAnsi" w:cstheme="minorHAnsi"/>
         </w:rPr>
-        <w:pict w14:anchorId="064E7CC5">
+        <w:pict w14:anchorId="64A173B3">
           <v:group id="_x0000_s1026" alt="" style="width:199.5pt;height:186.6pt;mso-position-horizontal-relative:char;mso-position-vertical-relative:line" coordsize="3990,3732">
             <v:shape id="_x0000_s1027" alt="" style="position:absolute;left:8;top:3205;width:1383;height:520" coordorigin="8,3205" coordsize="1383,520" path="m267,3724r864,l1200,3715r62,-26l1314,3648r41,-52l1381,3533r9,-69l1381,3395r-26,-62l1314,3281r-52,-41l1200,3214r-69,-9l267,3205r-69,9l136,3240r-53,41l43,3333r-26,62l7,3464r10,69l43,3596r40,52l136,3689r62,26l267,3724xe" filled="f" strokeweight=".25469mm">
               <v:path arrowok="t"/>
@@ -9104,7 +11626,7 @@
             </v:shape>
             <v:line id="_x0000_s1032" alt="" style="position:absolute" from="2085,629" to="2600,629" strokeweight=".25475mm"/>
             <v:shape id="_x0000_s1033" type="#_x0000_t75" alt="" style="position:absolute;left:3185;top:1141;width:211;height:375">
-              <v:imagedata r:id="rId30" o:title=""/>
+              <v:imagedata r:id="rId29" o:title=""/>
             </v:shape>
             <v:line id="_x0000_s1034" alt="" style="position:absolute" from="3291,8" to="3291,110" strokeweight=".25428mm"/>
             <v:shape id="_x0000_s1035" type="#_x0000_t202" alt="" style="position:absolute;left:2600;top:1517;width:1383;height:1039;mso-wrap-style:square;v-text-anchor:top" filled="f" stroked="f">
@@ -9324,21 +11846,7 @@
         <w:rPr>
           <w:rFonts w:asciiTheme="minorHAnsi" w:hAnsiTheme="minorHAnsi" w:cstheme="minorHAnsi"/>
         </w:rPr>
-        <w:t xml:space="preserve">You </w:t>
-      </w:r>
-      <w:proofErr w:type="gramStart"/>
-      <w:r>
-        <w:rPr>
-          <w:rFonts w:asciiTheme="minorHAnsi" w:hAnsiTheme="minorHAnsi" w:cstheme="minorHAnsi"/>
-        </w:rPr>
-        <w:t>are able to</w:t>
-      </w:r>
-      <w:proofErr w:type="gramEnd"/>
-      <w:r>
-        <w:rPr>
-          <w:rFonts w:asciiTheme="minorHAnsi" w:hAnsiTheme="minorHAnsi" w:cstheme="minorHAnsi"/>
-        </w:rPr>
-        <w:t xml:space="preserve"> update data via PATCH for brands, </w:t>
+        <w:t xml:space="preserve">You are able to update data via PATCH for brands, </w:t>
       </w:r>
       <w:proofErr w:type="spellStart"/>
       <w:r>
@@ -9352,21 +11860,7 @@
         <w:rPr>
           <w:rFonts w:asciiTheme="minorHAnsi" w:hAnsiTheme="minorHAnsi" w:cstheme="minorHAnsi"/>
         </w:rPr>
-        <w:t xml:space="preserve">, and status. </w:t>
-      </w:r>
-      <w:proofErr w:type="gramStart"/>
-      <w:r>
-        <w:rPr>
-          <w:rFonts w:asciiTheme="minorHAnsi" w:hAnsiTheme="minorHAnsi" w:cstheme="minorHAnsi"/>
-        </w:rPr>
-        <w:t>In order to</w:t>
-      </w:r>
-      <w:proofErr w:type="gramEnd"/>
-      <w:r>
-        <w:rPr>
-          <w:rFonts w:asciiTheme="minorHAnsi" w:hAnsiTheme="minorHAnsi" w:cstheme="minorHAnsi"/>
-        </w:rPr>
-        <w:t xml:space="preserve"> PATCH a phish entity the status must be active, and in order to change a status to active you must include a </w:t>
+        <w:t xml:space="preserve">, and status. In order to PATCH a phish entity the status must be active, and in order to change a status to active you must include a </w:t>
       </w:r>
       <w:proofErr w:type="spellStart"/>
       <w:r>
@@ -9398,7 +11892,23 @@
           <w:rFonts w:asciiTheme="minorHAnsi" w:hAnsiTheme="minorHAnsi" w:cstheme="minorHAnsi"/>
           <w:w w:val="90"/>
         </w:rPr>
-        <w:t xml:space="preserve"> to eCX the URL value </w:t>
+        <w:t xml:space="preserve"> to </w:t>
+      </w:r>
+      <w:proofErr w:type="spellStart"/>
+      <w:r>
+        <w:rPr>
+          <w:rFonts w:asciiTheme="minorHAnsi" w:hAnsiTheme="minorHAnsi" w:cstheme="minorHAnsi"/>
+          <w:w w:val="90"/>
+        </w:rPr>
+        <w:t>eCX</w:t>
+      </w:r>
+      <w:proofErr w:type="spellEnd"/>
+      <w:r>
+        <w:rPr>
+          <w:rFonts w:asciiTheme="minorHAnsi" w:hAnsiTheme="minorHAnsi" w:cstheme="minorHAnsi"/>
+          <w:w w:val="90"/>
+        </w:rPr>
+        <w:t xml:space="preserve"> the URL value </w:t>
       </w:r>
       <w:r>
         <w:rPr>
@@ -9452,21 +11962,7 @@
         <w:rPr>
           <w:rFonts w:asciiTheme="minorHAnsi" w:hAnsiTheme="minorHAnsi" w:cstheme="minorHAnsi"/>
         </w:rPr>
-        <w:t xml:space="preserve"> the example above eCX returned an ID of 87104669 for the new entity that was created. </w:t>
-      </w:r>
-      <w:proofErr w:type="gramStart"/>
-      <w:r>
-        <w:rPr>
-          <w:rFonts w:asciiTheme="minorHAnsi" w:hAnsiTheme="minorHAnsi" w:cstheme="minorHAnsi"/>
-        </w:rPr>
-        <w:t>We’ll</w:t>
-      </w:r>
-      <w:proofErr w:type="gramEnd"/>
-      <w:r>
-        <w:rPr>
-          <w:rFonts w:asciiTheme="minorHAnsi" w:hAnsiTheme="minorHAnsi" w:cstheme="minorHAnsi"/>
-        </w:rPr>
-        <w:t xml:space="preserve"> need this ID for the PATCH operation. You may update any or all of the modifiable fields </w:t>
+        <w:t xml:space="preserve"> the example above eCX returned an ID of 87104669 for the new entity that was created. We’ll need this ID for the PATCH operation. You may update any or all of the modifiable fields </w:t>
       </w:r>
       <w:r>
         <w:rPr>
@@ -10364,7 +12860,7 @@
           <w:rFonts w:asciiTheme="minorHAnsi" w:hAnsiTheme="minorHAnsi" w:cstheme="minorHAnsi"/>
         </w:rPr>
         <w:sectPr>
-          <w:footerReference w:type="default" r:id="rId31"/>
+          <w:footerReference w:type="default" r:id="rId30"/>
           <w:pgSz w:w="12240" w:h="15840"/>
           <w:pgMar w:top="1500" w:right="1340" w:bottom="1480" w:left="1340" w:header="0" w:footer="1281" w:gutter="0"/>
           <w:cols w:space="720"/>
@@ -10638,7 +13134,7 @@
                     <pic:cNvPicPr/>
                   </pic:nvPicPr>
                   <pic:blipFill>
-                    <a:blip r:embed="rId32" cstate="print"/>
+                    <a:blip r:embed="rId31" cstate="print"/>
                     <a:stretch>
                       <a:fillRect/>
                     </a:stretch>
@@ -10665,7 +13161,7 @@
           <w:rFonts w:asciiTheme="minorHAnsi" w:hAnsiTheme="minorHAnsi" w:cstheme="minorHAnsi"/>
         </w:rPr>
         <w:sectPr>
-          <w:footerReference w:type="default" r:id="rId33"/>
+          <w:footerReference w:type="default" r:id="rId32"/>
           <w:pgSz w:w="12240" w:h="15840"/>
           <w:pgMar w:top="1400" w:right="1340" w:bottom="1480" w:left="1340" w:header="0" w:footer="1281" w:gutter="0"/>
           <w:pgNumType w:start="11"/>
@@ -10733,25 +13229,7 @@
           <w:w w:val="95"/>
           <w:highlight w:val="yellow"/>
         </w:rPr>
-        <w:t xml:space="preserve"> is one of many GET query parameters, but the only one </w:t>
-      </w:r>
-      <w:proofErr w:type="gramStart"/>
-      <w:r>
-        <w:rPr>
-          <w:rFonts w:asciiTheme="minorHAnsi" w:hAnsiTheme="minorHAnsi" w:cstheme="minorHAnsi"/>
-          <w:w w:val="95"/>
-          <w:highlight w:val="yellow"/>
-        </w:rPr>
-        <w:t>we’ll</w:t>
-      </w:r>
-      <w:proofErr w:type="gramEnd"/>
-      <w:r>
-        <w:rPr>
-          <w:rFonts w:asciiTheme="minorHAnsi" w:hAnsiTheme="minorHAnsi" w:cstheme="minorHAnsi"/>
-          <w:w w:val="95"/>
-          <w:highlight w:val="yellow"/>
-        </w:rPr>
-        <w:t xml:space="preserve"> use in this GET example, the </w:t>
+        <w:t xml:space="preserve"> is one of many GET query parameters, but the only one we’ll use in this GET example, the </w:t>
       </w:r>
       <w:r>
         <w:rPr>
@@ -12126,7 +14604,7 @@
                     <pic:cNvPicPr/>
                   </pic:nvPicPr>
                   <pic:blipFill>
-                    <a:blip r:embed="rId34" cstate="print"/>
+                    <a:blip r:embed="rId33" cstate="print"/>
                     <a:stretch>
                       <a:fillRect/>
                     </a:stretch>
@@ -12768,25 +15246,9 @@
           <w:rFonts w:asciiTheme="minorHAnsi" w:hAnsiTheme="minorHAnsi" w:cstheme="minorHAnsi"/>
           <w:w w:val="95"/>
         </w:rPr>
-        <w:t xml:space="preserve">eCX API result codes in the 4xx range indicate an error. </w:t>
-      </w:r>
-      <w:proofErr w:type="gramStart"/>
-      <w:r>
-        <w:rPr>
-          <w:rFonts w:asciiTheme="minorHAnsi" w:hAnsiTheme="minorHAnsi" w:cstheme="minorHAnsi"/>
-          <w:w w:val="95"/>
-        </w:rPr>
-        <w:t>All of</w:t>
-      </w:r>
-      <w:proofErr w:type="gramEnd"/>
-      <w:r>
-        <w:rPr>
-          <w:rFonts w:asciiTheme="minorHAnsi" w:hAnsiTheme="minorHAnsi" w:cstheme="minorHAnsi"/>
-          <w:w w:val="95"/>
-        </w:rPr>
-        <w:t xml:space="preserve"> the possible result codes specific to each eCX API operation are documented in the eCX API documentation located at </w:t>
-      </w:r>
-      <w:hyperlink r:id="rId35">
+        <w:t xml:space="preserve">eCX API result codes in the 4xx range indicate an error. All of the possible result codes specific to each eCX API operation are documented in the eCX API documentation located at </w:t>
+      </w:r>
+      <w:hyperlink r:id="rId34">
         <w:r>
           <w:rPr>
             <w:rFonts w:asciiTheme="minorHAnsi" w:hAnsiTheme="minorHAnsi" w:cstheme="minorHAnsi"/>
@@ -13570,7 +16032,7 @@
       </w:rPr>
     </w:pPr>
     <w:r>
-      <w:pict w14:anchorId="5EFC6A3D">
+      <w:pict w14:anchorId="6B511FCC">
         <v:shapetype id="_x0000_t202" coordsize="21600,21600" o:spt="202" path="m,l,21600r21600,l21600,xe">
           <v:stroke joinstyle="miter"/>
           <v:path gradientshapeok="t" o:connecttype="rect"/>
@@ -13595,7 +16057,6 @@
                   </w:rPr>
                   <w:t xml:space="preserve"> </w:t>
                 </w:r>
-                <w:proofErr w:type="gramStart"/>
                 <w:r>
                   <w:t>10</w:t>
                 </w:r>
@@ -13608,7 +16069,6 @@
                 <w:r>
                   <w:t>:</w:t>
                 </w:r>
-                <w:proofErr w:type="gramEnd"/>
                 <w:r>
                   <w:rPr>
                     <w:spacing w:val="-24"/>
@@ -13746,7 +16206,7 @@
       </w:rPr>
     </w:pPr>
     <w:r>
-      <w:pict w14:anchorId="14848BFE">
+      <w:pict w14:anchorId="7F4780AC">
         <v:shapetype id="_x0000_t202" coordsize="21600,21600" o:spt="202" path="m,l,21600r21600,l21600,xe">
           <v:stroke joinstyle="miter"/>
           <v:path gradientshapeok="t" o:connecttype="rect"/>
@@ -13831,7 +16291,6 @@
                   </w:rPr>
                   <w:t xml:space="preserve">v </w:t>
                 </w:r>
-                <w:proofErr w:type="gramStart"/>
                 <w:r>
                   <w:rPr>
                     <w:i/>
@@ -13850,15 +16309,7 @@
                     <w:i/>
                     <w:highlight w:val="yellow"/>
                   </w:rPr>
-                  <w:t>DATE</w:t>
-                </w:r>
-                <w:proofErr w:type="gramEnd"/>
-                <w:r>
-                  <w:rPr>
-                    <w:i/>
-                    <w:highlight w:val="yellow"/>
-                  </w:rPr>
-                  <w:t xml:space="preserve"> TBD</w:t>
+                  <w:t>DATE TBD</w:t>
                 </w:r>
                 <w:r>
                   <w:rPr>
@@ -14216,13 +16667,137 @@
       </w:rPr>
     </w:lvl>
   </w:abstractNum>
+  <w:abstractNum w:abstractNumId="2" w15:restartNumberingAfterBreak="0">
+    <w:nsid w:val="7EB36221"/>
+    <w:multiLevelType w:val="hybridMultilevel"/>
+    <w:tmpl w:val="962E0A88"/>
+    <w:lvl w:ilvl="0" w:tplc="04090001">
+      <w:start w:val="1"/>
+      <w:numFmt w:val="bullet"/>
+      <w:lvlText w:val=""/>
+      <w:lvlJc w:val="left"/>
+      <w:pPr>
+        <w:ind w:left="820" w:hanging="360"/>
+      </w:pPr>
+      <w:rPr>
+        <w:rFonts w:ascii="Symbol" w:hAnsi="Symbol" w:hint="default"/>
+      </w:rPr>
+    </w:lvl>
+    <w:lvl w:ilvl="1" w:tplc="04090003" w:tentative="1">
+      <w:start w:val="1"/>
+      <w:numFmt w:val="bullet"/>
+      <w:lvlText w:val="o"/>
+      <w:lvlJc w:val="left"/>
+      <w:pPr>
+        <w:ind w:left="1540" w:hanging="360"/>
+      </w:pPr>
+      <w:rPr>
+        <w:rFonts w:ascii="Courier New" w:hAnsi="Courier New" w:cs="Courier New" w:hint="default"/>
+      </w:rPr>
+    </w:lvl>
+    <w:lvl w:ilvl="2" w:tplc="04090005" w:tentative="1">
+      <w:start w:val="1"/>
+      <w:numFmt w:val="bullet"/>
+      <w:lvlText w:val=""/>
+      <w:lvlJc w:val="left"/>
+      <w:pPr>
+        <w:ind w:left="2260" w:hanging="360"/>
+      </w:pPr>
+      <w:rPr>
+        <w:rFonts w:ascii="Wingdings" w:hAnsi="Wingdings" w:hint="default"/>
+      </w:rPr>
+    </w:lvl>
+    <w:lvl w:ilvl="3" w:tplc="04090001" w:tentative="1">
+      <w:start w:val="1"/>
+      <w:numFmt w:val="bullet"/>
+      <w:lvlText w:val=""/>
+      <w:lvlJc w:val="left"/>
+      <w:pPr>
+        <w:ind w:left="2980" w:hanging="360"/>
+      </w:pPr>
+      <w:rPr>
+        <w:rFonts w:ascii="Symbol" w:hAnsi="Symbol" w:hint="default"/>
+      </w:rPr>
+    </w:lvl>
+    <w:lvl w:ilvl="4" w:tplc="04090003" w:tentative="1">
+      <w:start w:val="1"/>
+      <w:numFmt w:val="bullet"/>
+      <w:lvlText w:val="o"/>
+      <w:lvlJc w:val="left"/>
+      <w:pPr>
+        <w:ind w:left="3700" w:hanging="360"/>
+      </w:pPr>
+      <w:rPr>
+        <w:rFonts w:ascii="Courier New" w:hAnsi="Courier New" w:cs="Courier New" w:hint="default"/>
+      </w:rPr>
+    </w:lvl>
+    <w:lvl w:ilvl="5" w:tplc="04090005" w:tentative="1">
+      <w:start w:val="1"/>
+      <w:numFmt w:val="bullet"/>
+      <w:lvlText w:val=""/>
+      <w:lvlJc w:val="left"/>
+      <w:pPr>
+        <w:ind w:left="4420" w:hanging="360"/>
+      </w:pPr>
+      <w:rPr>
+        <w:rFonts w:ascii="Wingdings" w:hAnsi="Wingdings" w:hint="default"/>
+      </w:rPr>
+    </w:lvl>
+    <w:lvl w:ilvl="6" w:tplc="04090001" w:tentative="1">
+      <w:start w:val="1"/>
+      <w:numFmt w:val="bullet"/>
+      <w:lvlText w:val=""/>
+      <w:lvlJc w:val="left"/>
+      <w:pPr>
+        <w:ind w:left="5140" w:hanging="360"/>
+      </w:pPr>
+      <w:rPr>
+        <w:rFonts w:ascii="Symbol" w:hAnsi="Symbol" w:hint="default"/>
+      </w:rPr>
+    </w:lvl>
+    <w:lvl w:ilvl="7" w:tplc="04090003" w:tentative="1">
+      <w:start w:val="1"/>
+      <w:numFmt w:val="bullet"/>
+      <w:lvlText w:val="o"/>
+      <w:lvlJc w:val="left"/>
+      <w:pPr>
+        <w:ind w:left="5860" w:hanging="360"/>
+      </w:pPr>
+      <w:rPr>
+        <w:rFonts w:ascii="Courier New" w:hAnsi="Courier New" w:cs="Courier New" w:hint="default"/>
+      </w:rPr>
+    </w:lvl>
+    <w:lvl w:ilvl="8" w:tplc="04090005" w:tentative="1">
+      <w:start w:val="1"/>
+      <w:numFmt w:val="bullet"/>
+      <w:lvlText w:val=""/>
+      <w:lvlJc w:val="left"/>
+      <w:pPr>
+        <w:ind w:left="6580" w:hanging="360"/>
+      </w:pPr>
+      <w:rPr>
+        <w:rFonts w:ascii="Wingdings" w:hAnsi="Wingdings" w:hint="default"/>
+      </w:rPr>
+    </w:lvl>
+  </w:abstractNum>
   <w:num w:numId="1">
     <w:abstractNumId w:val="0"/>
   </w:num>
   <w:num w:numId="2">
     <w:abstractNumId w:val="1"/>
   </w:num>
+  <w:num w:numId="3">
+    <w:abstractNumId w:val="2"/>
+  </w:num>
 </w:numbering>
+</file>
+
+<file path=word/people.xml><?xml version="1.0" encoding="utf-8"?>
+<w15:people xmlns:wpc="http://schemas.microsoft.com/office/word/2010/wordprocessingCanvas" xmlns:cx="http://schemas.microsoft.com/office/drawing/2014/chartex" xmlns:cx1="http://schemas.microsoft.com/office/drawing/2015/9/8/chartex" xmlns:cx2="http://schemas.microsoft.com/office/drawing/2015/10/21/chartex" xmlns:cx3="http://schemas.microsoft.com/office/drawing/2016/5/9/chartex" xmlns:cx4="http://schemas.microsoft.com/office/drawing/2016/5/10/chartex" xmlns:cx5="http://schemas.microsoft.com/office/drawing/2016/5/11/chartex" xmlns:cx6="http://schemas.microsoft.com/office/drawing/2016/5/12/chartex" xmlns:cx7="http://schemas.microsoft.com/office/drawing/2016/5/13/chartex" xmlns:cx8="http://schemas.microsoft.com/office/drawing/2016/5/14/chartex" xmlns:mc="http://schemas.openxmlformats.org/markup-compatibility/2006" xmlns:aink="http://schemas.microsoft.com/office/drawing/2016/ink" xmlns:am3d="http://schemas.microsoft.com/office/drawing/2017/model3d" xmlns:o="urn:schemas-microsoft-com:office:office" xmlns:r="http://schemas.openxmlformats.org/officeDocument/2006/relationships" xmlns:m="http://schemas.openxmlformats.org/officeDocument/2006/math" xmlns:v="urn:schemas-microsoft-com:vml" xmlns:wp14="http://schemas.microsoft.com/office/word/2010/wordprocessingDrawing" xmlns:wp="http://schemas.openxmlformats.org/drawingml/2006/wordprocessingDrawing" xmlns:w10="urn:schemas-microsoft-com:office:word" xmlns:w="http://schemas.openxmlformats.org/wordprocessingml/2006/main" xmlns:w14="http://schemas.microsoft.com/office/word/2010/wordml" xmlns:w15="http://schemas.microsoft.com/office/word/2012/wordml" xmlns:w16cex="http://schemas.microsoft.com/office/word/2018/wordml/cex" xmlns:w16cid="http://schemas.microsoft.com/office/word/2016/wordml/cid" xmlns:w16="http://schemas.microsoft.com/office/word/2018/wordml" xmlns:w16sdtdh="http://schemas.microsoft.com/office/word/2020/wordml/sdtdatahash" xmlns:w16se="http://schemas.microsoft.com/office/word/2015/wordml/symex" xmlns:wpg="http://schemas.microsoft.com/office/word/2010/wordprocessingGroup" xmlns:wpi="http://schemas.microsoft.com/office/word/2010/wordprocessingInk" xmlns:wne="http://schemas.microsoft.com/office/word/2006/wordml" xmlns:wps="http://schemas.microsoft.com/office/word/2010/wordprocessingShape" mc:Ignorable="w14 w15 w16se w16cid w16 w16cex w16sdtdh wp14">
+  <w15:person w15:author="Tom Anderson">
+    <w15:presenceInfo w15:providerId="Windows Live" w15:userId="0bcd562bfad4d309"/>
+  </w15:person>
+</w15:people>
 </file>
 
 <file path=word/styles.xml><?xml version="1.0" encoding="utf-8"?>

</xml_diff>